<commit_message>
Validity checks, 14 held-out patients, GPU support, updated report and slides
</commit_message>
<xml_diff>
--- a/submission/Final_Report_Neural_Fields_Cardiac_Cine_MRI.docx
+++ b/submission/Final_Report_Neural_Fields_Cardiac_Cine_MRI.docx
@@ -864,7 +864,7 @@
           <w:sz w:val="22"/>
           <w:szCs w:val="22"/>
         </w:rPr>
-        <w:t xml:space="preserve">A cardiac cine-MRI scan stores one heartbeat as a grid: in our main patient 224 × 256 pixels of 1.64 mm, 10 slices 10 mm apart and 30 frames, 17.2 million values with nothing stored between slices or between frames. We represent the scan instead as one continuous function, a small sine-activated network (SIREN, 198,913 weights) that maps a position in millimetres and a moment of the heartbeat to image intensity, and we fit it per patient on the public ACDC dataset using a laptop CPU. We tested it honestly: slices or frames were hidden during training and then predicted, against linear interpolation and against a ReLU network of the same size. Three findings stand out. First, SIREN is 6.6 dB better than the ReLU network on hidden frames (28.9 vs 22.3 dB PSNR in the heart). Second, how the coordinates enter the network matters as much as the network itself: scaling the time coordinate (t × 0.1) and the slice coordinate (z × 0.25) inside the model removes the oscillation between known samples and adds 6.6 dB in time. Third, the field is level with linear interpolation (28.9 vs 29.2 dB with every fourth frame kept), better during the fastest contraction, and a fixed 50/50 blend of both beats interpolation (29.7 dB, 18 of 21 frames). The same weights hold the heart region with 16× fewer numbers, or the whole scan with 86× fewer at 27.5 dB. From the final field we extract a beating 3D heart on a 1.64 mm isotropic grid; its ejection fraction (LV 49 %, RV 51 %) is within five points of the expert labels (44 %, 53 %).</w:t>
+        <w:t xml:space="preserve">A cardiac cine-MRI scan stores one heartbeat as a grid: in our main patient 224 × 256 pixels of 1.64 mm, 10 slices 10 mm apart and 30 frames, 17.2 million values with nothing stored between slices or between frames. We represent the scan instead as one continuous function, a small sine-activated network (SIREN, 198,913 weights) that maps a position in millimetres and a moment of the heartbeat to image intensity, fitted per patient on the public ACDC dataset. Frames or slices are hidden during training and predicted; settings are chosen on separate validation frames, and the final comparison is repeated on 14 patients that were never used for any choice. SIREN beats a ReLU network of the same size on every patient (+7.4 dB on average) and a ReLU network with Fourier features by 2.3 dB. Scaling the time and slice coordinates inside the model is our own contribution and adds 6.6 dB in time. Alone, the field stays about 0.6 dB behind linear interpolation (13 of 14 patients), but a fixed 50/50 blend of field and interpolation beats interpolation on all 14 held-out patients (+0.37 dB, 95 % CI 0.26–0.48, Wilcoxon p = 0.0001). The same weights hold the heart region with 16× fewer numbers, or the whole scan with 86×. From the final field we extract a beating 3D heart; its left ventricle matches the expert outline as well as the same segmentation on the scanner data (Dice 0.87 over 14 patients) and its ejection fraction is within one point of the expert value for patient 051 (42.7 vs 43.6 %). Exploratory tests show that only motion-aware methods beat linear interpolation, which sets the direction for future work.</w:t>
       </w:r>
     </w:p>
     <w:p>
@@ -928,7 +928,7 @@
           <w:sz w:val="22"/>
           <w:szCs w:val="22"/>
         </w:rPr>
-        <w:t xml:space="preserve">We use the ACDC dataset (MICCAI 2017) [3]: cine-MRI of 150 patients with expert labels of the right ventricle, the myocardium and the left ventricle at end-diastole (ED) and end-systole (ES). The main patient is 051 (previous myocardial infarction): 224 × 256 pixels of 1.64 × 1.64 mm, 10 short-axis slices 10 mm apart, 30 frames, ED = frame 1, ES = frame 11. Patient 015 (dilated cardiomyopathy; 256 × 216 pixels of 1.37 mm, 9 slices 10 mm apart, 21 frames) is used to repeat the hidden-slice test on a different heart. Both patient folders are submitted with this report together with the citation required by the dataset.</w:t>
+        <w:t xml:space="preserve">We use the ACDC dataset (MICCAI 2017) [3]: cine-MRI of 150 patients with expert labels of the right ventricle, the myocardium and the left ventricle at end-diastole (ED) and end-systole (ES). The main patient is 051 (previous myocardial infarction): 224 × 256 pixels of 1.64 × 1.64 mm, 10 short-axis slices 10 mm apart, 30 frames, ED = frame 1, ES = frame 11. Patient 015 (dilated cardiomyopathy; 256 × 216 pixels of 1.37 mm, 9 slices 10 mm apart, 21 frames) is used to repeat the hidden-slice test on a different heart. Fourteen further patients form a held-out test set that was never used to choose any setting: five with dilated cardiomyopathy (016–020), five with hypertrophic cardiomyopathy (022, 025, 030, 035, 040) and four after myocardial infarction (041, 045, 048, 050). The data are shared with the course only privately, with the citation required by the dataset.</w:t>
       </w:r>
     </w:p>
     <w:p>
@@ -1079,6 +1079,20 @@
     </w:p>
     <w:p>
       <w:pPr>
+        <w:spacing w:after="120" w:before="0" w:line="276"/>
+        <w:jc w:val="both"/>
+      </w:pPr>
+      <w:r>
+        <w:rPr>
+          <w:rFonts w:ascii="Cambria" w:cs="Cambria" w:eastAsia="Cambria" w:hAnsi="Cambria"/>
+          <w:sz w:val="22"/>
+          <w:szCs w:val="22"/>
+        </w:rPr>
+        <w:t xml:space="preserve">Settings were first explored on the hidden frames of patient 051 (Table 1). To exclude that this tuned the test, the choice was repeated on separate validation frames: frames 12 and 20 were removed from the training frames and used only for selection, the test frames unchanged. A stronger baseline, a ReLU network with 64 random Fourier features [2] (its σ chosen on the same validation frames), was added, SIREN was repeated with three seeds, and every run stores an exact train PSNR over all training voxels, a temporal error (mean squared error of the frame-to-frame change inside the heart, which catches flicker) and its metadata. The intensity scaling uses the min and max of the scan; we checked that they are identical (0 and 255) when computed on the training frames only, so no test information enters through normalisation. Finally the fixed protocol was run on the 14 held-out patients, with the patient as the unit of analysis (mean, 95 % t-interval, paired Wilcoxon test).</w:t>
+      </w:r>
+    </w:p>
+    <w:p>
+      <w:pPr>
         <w:pStyle w:val="Heading2"/>
         <w:keepNext/>
         <w:spacing w:after="80" w:before="180"/>
@@ -1106,7 +1120,7 @@
           <w:sz w:val="22"/>
           <w:szCs w:val="22"/>
         </w:rPr>
-        <w:t xml:space="preserve">The final field is queried on an isotropic grid (61 slices of 1.64 mm instead of 10 of 10 mm) at any number of time points. Blood is bright and muscle dark in cine-MRI, so the blood threshold is the midpoint of the median LV-blood and median-myocardium intensities at ED. The expert labels only select the region of each ventricle (interpolated between slices by signed distance); inside it the largest bright 3D component is the blood pool. The LV wall is the surrounding voxels in the muscle intensity band. Surfaces are extracted with marching cubes [8] and smoothed with Taubin smoothing [9]; volumes give the ejection fraction EF = (EDV − ESV)/EDV.</w:t>
+        <w:t xml:space="preserve">The final field is queried on an isotropic grid (61 slices of 1.64 mm instead of 10 of 10 mm) at any number of time points. Blood is bright and muscle dark in cine-MRI, so the blood threshold is the midpoint of the median LV-blood and median-myocardium intensities at ED. The expert labels only select the region of each ventricle (interpolated between slices by signed distance); inside it the largest bright 3D component is the blood pool. The LV wall is the surrounding voxels in the muscle intensity band. Surfaces are extracted with marching cubes [8] and smoothed with Taubin smoothing [9]; volumes are always counted on the binary masks, never on the smoothed surfaces, and give the ejection fraction EF = (EDV − ESV)/EDV at the ED and ES frames listed with each scan. The network itself never sees labels, but this 3D step is label-assisted: the threshold, the chamber regions and the wall region come from the expert labels, which are also the reference for evaluation.</w:t>
       </w:r>
     </w:p>
     <w:p>
@@ -2306,7 +2320,7 @@
           <w:sz w:val="22"/>
           <w:szCs w:val="22"/>
         </w:rPr>
-        <w:t xml:space="preserve">How time enters is decisive: scaling t adds 6.6 dB over raw t, and the periodic encoding is close but slightly worse. With fewer frames the best scale is 0.1. A four times larger network reaches the same quality as the 256-unit network with the better scale, so capacity is not the limiting factor (rows 4–7 used 20,000 steps, rows 1–3 4,000).</w:t>
+        <w:t xml:space="preserve">How time enters is decisive: scaling t adds 6.6 dB over raw t, and the periodic encoding is close but slightly worse. With fewer frames the best scale is 0.1. A four times larger network reaches the same quality as the 256-unit network with the better scale, so capacity is not the limiting factor (rows 4–7 used 20,000 steps, rows 1–3 4,000). Chosen again on the separate validation frames, the scale is the same: 0.05 → 23.7 dB, 0.1 → 24.0 dB, 0.25 → 20.7 dB (validation PSNR in the heart).</w:t>
       </w:r>
     </w:p>
     <w:p>
@@ -2901,6 +2915,171 @@
                 <w:sz w:val="19"/>
                 <w:szCs w:val="19"/>
               </w:rPr>
+              <w:t xml:space="preserve">SIREN, mean of 3 seeds (± std)</w:t>
+            </w:r>
+          </w:p>
+        </w:tc>
+        <w:tc>
+          <w:tcPr>
+            <w:tcW w:type="dxa" w:w="1351"/>
+            <w:tcBorders>
+              <w:top w:val="single" w:color="BFC9D3" w:sz="4"/>
+              <w:left w:val="single" w:color="BFC9D3" w:sz="4"/>
+              <w:bottom w:val="single" w:color="BFC9D3" w:sz="4"/>
+              <w:right w:val="single" w:color="BFC9D3" w:sz="4"/>
+            </w:tcBorders>
+            <w:tcMar>
+              <w:top w:type="dxa" w:w="50"/>
+              <w:left w:type="dxa" w:w="90"/>
+              <w:bottom w:type="dxa" w:w="50"/>
+              <w:right w:type="dxa" w:w="90"/>
+            </w:tcMar>
+          </w:tcPr>
+          <w:p>
+            <w:pPr>
+              <w:jc w:val="center"/>
+            </w:pPr>
+            <w:r>
+              <w:rPr>
+                <w:rFonts w:ascii="Cambria" w:cs="Cambria" w:eastAsia="Cambria" w:hAnsi="Cambria"/>
+                <w:b w:val="false"/>
+                <w:bCs w:val="false"/>
+                <w:sz w:val="19"/>
+                <w:szCs w:val="19"/>
+              </w:rPr>
+              <w:t xml:space="preserve">28.91 ± 0.04</w:t>
+            </w:r>
+          </w:p>
+        </w:tc>
+        <w:tc>
+          <w:tcPr>
+            <w:tcW w:type="dxa" w:w="1351"/>
+            <w:tcBorders>
+              <w:top w:val="single" w:color="BFC9D3" w:sz="4"/>
+              <w:left w:val="single" w:color="BFC9D3" w:sz="4"/>
+              <w:bottom w:val="single" w:color="BFC9D3" w:sz="4"/>
+              <w:right w:val="single" w:color="BFC9D3" w:sz="4"/>
+            </w:tcBorders>
+            <w:tcMar>
+              <w:top w:type="dxa" w:w="50"/>
+              <w:left w:type="dxa" w:w="90"/>
+              <w:bottom w:type="dxa" w:w="50"/>
+              <w:right w:type="dxa" w:w="90"/>
+            </w:tcMar>
+          </w:tcPr>
+          <w:p>
+            <w:pPr>
+              <w:jc w:val="center"/>
+            </w:pPr>
+            <w:r>
+              <w:rPr>
+                <w:rFonts w:ascii="Cambria" w:cs="Cambria" w:eastAsia="Cambria" w:hAnsi="Cambria"/>
+                <w:b w:val="false"/>
+                <w:bCs w:val="false"/>
+                <w:sz w:val="19"/>
+                <w:szCs w:val="19"/>
+              </w:rPr>
+              <w:t xml:space="preserve">32.87</w:t>
+            </w:r>
+          </w:p>
+        </w:tc>
+        <w:tc>
+          <w:tcPr>
+            <w:tcW w:type="dxa" w:w="1158"/>
+            <w:tcBorders>
+              <w:top w:val="single" w:color="BFC9D3" w:sz="4"/>
+              <w:left w:val="single" w:color="BFC9D3" w:sz="4"/>
+              <w:bottom w:val="single" w:color="BFC9D3" w:sz="4"/>
+              <w:right w:val="single" w:color="BFC9D3" w:sz="4"/>
+            </w:tcBorders>
+            <w:tcMar>
+              <w:top w:type="dxa" w:w="50"/>
+              <w:left w:type="dxa" w:w="90"/>
+              <w:bottom w:type="dxa" w:w="50"/>
+              <w:right w:type="dxa" w:w="90"/>
+            </w:tcMar>
+          </w:tcPr>
+          <w:p>
+            <w:pPr>
+              <w:jc w:val="center"/>
+            </w:pPr>
+            <w:r>
+              <w:rPr>
+                <w:rFonts w:ascii="Cambria" w:cs="Cambria" w:eastAsia="Cambria" w:hAnsi="Cambria"/>
+                <w:b w:val="false"/>
+                <w:bCs w:val="false"/>
+                <w:sz w:val="19"/>
+                <w:szCs w:val="19"/>
+              </w:rPr>
+              <w:t xml:space="preserve">0.921</w:t>
+            </w:r>
+          </w:p>
+        </w:tc>
+        <w:tc>
+          <w:tcPr>
+            <w:tcW w:type="dxa" w:w="2508"/>
+            <w:tcBorders>
+              <w:top w:val="single" w:color="BFC9D3" w:sz="4"/>
+              <w:left w:val="single" w:color="BFC9D3" w:sz="4"/>
+              <w:bottom w:val="single" w:color="BFC9D3" w:sz="4"/>
+              <w:right w:val="single" w:color="BFC9D3" w:sz="4"/>
+            </w:tcBorders>
+            <w:tcMar>
+              <w:top w:type="dxa" w:w="50"/>
+              <w:left w:type="dxa" w:w="90"/>
+              <w:bottom w:type="dxa" w:w="50"/>
+              <w:right w:type="dxa" w:w="90"/>
+            </w:tcMar>
+          </w:tcPr>
+          <w:p>
+            <w:pPr>
+              <w:jc w:val="center"/>
+            </w:pPr>
+            <w:r>
+              <w:rPr>
+                <w:rFonts w:ascii="Cambria" w:cs="Cambria" w:eastAsia="Cambria" w:hAnsi="Cambria"/>
+                <w:b w:val="false"/>
+                <w:bCs w:val="false"/>
+                <w:sz w:val="19"/>
+                <w:szCs w:val="19"/>
+              </w:rPr>
+              <w:t xml:space="preserve">16×</w:t>
+            </w:r>
+          </w:p>
+        </w:tc>
+      </w:tr>
+      <w:tr>
+        <w:trPr>
+          <w:cantSplit/>
+        </w:trPr>
+        <w:tc>
+          <w:tcPr>
+            <w:tcW w:type="dxa" w:w="3280"/>
+            <w:tcBorders>
+              <w:top w:val="single" w:color="BFC9D3" w:sz="4"/>
+              <w:left w:val="single" w:color="BFC9D3" w:sz="4"/>
+              <w:bottom w:val="single" w:color="BFC9D3" w:sz="4"/>
+              <w:right w:val="single" w:color="BFC9D3" w:sz="4"/>
+            </w:tcBorders>
+            <w:tcMar>
+              <w:top w:type="dxa" w:w="50"/>
+              <w:left w:type="dxa" w:w="90"/>
+              <w:bottom w:type="dxa" w:w="50"/>
+              <w:right w:type="dxa" w:w="90"/>
+            </w:tcMar>
+          </w:tcPr>
+          <w:p>
+            <w:pPr>
+              <w:jc w:val="left"/>
+            </w:pPr>
+            <w:r>
+              <w:rPr>
+                <w:rFonts w:ascii="Cambria" w:cs="Cambria" w:eastAsia="Cambria" w:hAnsi="Cambria"/>
+                <w:b w:val="false"/>
+                <w:bCs w:val="false"/>
+                <w:sz w:val="19"/>
+                <w:szCs w:val="19"/>
+              </w:rPr>
               <w:t xml:space="preserve">ReLU, same size</w:t>
             </w:r>
           </w:p>
@@ -3030,6 +3209,171 @@
                 <w:szCs w:val="19"/>
               </w:rPr>
               <w:t xml:space="preserve">16×</w:t>
+            </w:r>
+          </w:p>
+        </w:tc>
+      </w:tr>
+      <w:tr>
+        <w:trPr>
+          <w:cantSplit/>
+        </w:trPr>
+        <w:tc>
+          <w:tcPr>
+            <w:tcW w:type="dxa" w:w="3280"/>
+            <w:tcBorders>
+              <w:top w:val="single" w:color="BFC9D3" w:sz="4"/>
+              <w:left w:val="single" w:color="BFC9D3" w:sz="4"/>
+              <w:bottom w:val="single" w:color="BFC9D3" w:sz="4"/>
+              <w:right w:val="single" w:color="BFC9D3" w:sz="4"/>
+            </w:tcBorders>
+            <w:tcMar>
+              <w:top w:type="dxa" w:w="50"/>
+              <w:left w:type="dxa" w:w="90"/>
+              <w:bottom w:type="dxa" w:w="50"/>
+              <w:right w:type="dxa" w:w="90"/>
+            </w:tcMar>
+          </w:tcPr>
+          <w:p>
+            <w:pPr>
+              <w:jc w:val="left"/>
+            </w:pPr>
+            <w:r>
+              <w:rPr>
+                <w:rFonts w:ascii="Cambria" w:cs="Cambria" w:eastAsia="Cambria" w:hAnsi="Cambria"/>
+                <w:b w:val="false"/>
+                <w:bCs w:val="false"/>
+                <w:sz w:val="19"/>
+                <w:szCs w:val="19"/>
+              </w:rPr>
+              <w:t xml:space="preserve">ReLU + Fourier features (σ = 3, 230,657 weights)</w:t>
+            </w:r>
+          </w:p>
+        </w:tc>
+        <w:tc>
+          <w:tcPr>
+            <w:tcW w:type="dxa" w:w="1351"/>
+            <w:tcBorders>
+              <w:top w:val="single" w:color="BFC9D3" w:sz="4"/>
+              <w:left w:val="single" w:color="BFC9D3" w:sz="4"/>
+              <w:bottom w:val="single" w:color="BFC9D3" w:sz="4"/>
+              <w:right w:val="single" w:color="BFC9D3" w:sz="4"/>
+            </w:tcBorders>
+            <w:tcMar>
+              <w:top w:type="dxa" w:w="50"/>
+              <w:left w:type="dxa" w:w="90"/>
+              <w:bottom w:type="dxa" w:w="50"/>
+              <w:right w:type="dxa" w:w="90"/>
+            </w:tcMar>
+          </w:tcPr>
+          <w:p>
+            <w:pPr>
+              <w:jc w:val="center"/>
+            </w:pPr>
+            <w:r>
+              <w:rPr>
+                <w:rFonts w:ascii="Cambria" w:cs="Cambria" w:eastAsia="Cambria" w:hAnsi="Cambria"/>
+                <w:b w:val="false"/>
+                <w:bCs w:val="false"/>
+                <w:sz w:val="19"/>
+                <w:szCs w:val="19"/>
+              </w:rPr>
+              <w:t xml:space="preserve">26.63</w:t>
+            </w:r>
+          </w:p>
+        </w:tc>
+        <w:tc>
+          <w:tcPr>
+            <w:tcW w:type="dxa" w:w="1351"/>
+            <w:tcBorders>
+              <w:top w:val="single" w:color="BFC9D3" w:sz="4"/>
+              <w:left w:val="single" w:color="BFC9D3" w:sz="4"/>
+              <w:bottom w:val="single" w:color="BFC9D3" w:sz="4"/>
+              <w:right w:val="single" w:color="BFC9D3" w:sz="4"/>
+            </w:tcBorders>
+            <w:tcMar>
+              <w:top w:type="dxa" w:w="50"/>
+              <w:left w:type="dxa" w:w="90"/>
+              <w:bottom w:type="dxa" w:w="50"/>
+              <w:right w:type="dxa" w:w="90"/>
+            </w:tcMar>
+          </w:tcPr>
+          <w:p>
+            <w:pPr>
+              <w:jc w:val="center"/>
+            </w:pPr>
+            <w:r>
+              <w:rPr>
+                <w:rFonts w:ascii="Cambria" w:cs="Cambria" w:eastAsia="Cambria" w:hAnsi="Cambria"/>
+                <w:b w:val="false"/>
+                <w:bCs w:val="false"/>
+                <w:sz w:val="19"/>
+                <w:szCs w:val="19"/>
+              </w:rPr>
+              <w:t xml:space="preserve">28.63</w:t>
+            </w:r>
+          </w:p>
+        </w:tc>
+        <w:tc>
+          <w:tcPr>
+            <w:tcW w:type="dxa" w:w="1158"/>
+            <w:tcBorders>
+              <w:top w:val="single" w:color="BFC9D3" w:sz="4"/>
+              <w:left w:val="single" w:color="BFC9D3" w:sz="4"/>
+              <w:bottom w:val="single" w:color="BFC9D3" w:sz="4"/>
+              <w:right w:val="single" w:color="BFC9D3" w:sz="4"/>
+            </w:tcBorders>
+            <w:tcMar>
+              <w:top w:type="dxa" w:w="50"/>
+              <w:left w:type="dxa" w:w="90"/>
+              <w:bottom w:type="dxa" w:w="50"/>
+              <w:right w:type="dxa" w:w="90"/>
+            </w:tcMar>
+          </w:tcPr>
+          <w:p>
+            <w:pPr>
+              <w:jc w:val="center"/>
+            </w:pPr>
+            <w:r>
+              <w:rPr>
+                <w:rFonts w:ascii="Cambria" w:cs="Cambria" w:eastAsia="Cambria" w:hAnsi="Cambria"/>
+                <w:b w:val="false"/>
+                <w:bCs w:val="false"/>
+                <w:sz w:val="19"/>
+                <w:szCs w:val="19"/>
+              </w:rPr>
+              <w:t xml:space="preserve">0.792</w:t>
+            </w:r>
+          </w:p>
+        </w:tc>
+        <w:tc>
+          <w:tcPr>
+            <w:tcW w:type="dxa" w:w="2508"/>
+            <w:tcBorders>
+              <w:top w:val="single" w:color="BFC9D3" w:sz="4"/>
+              <w:left w:val="single" w:color="BFC9D3" w:sz="4"/>
+              <w:bottom w:val="single" w:color="BFC9D3" w:sz="4"/>
+              <w:right w:val="single" w:color="BFC9D3" w:sz="4"/>
+            </w:tcBorders>
+            <w:tcMar>
+              <w:top w:type="dxa" w:w="50"/>
+              <w:left w:type="dxa" w:w="90"/>
+              <w:bottom w:type="dxa" w:w="50"/>
+              <w:right w:type="dxa" w:w="90"/>
+            </w:tcMar>
+          </w:tcPr>
+          <w:p>
+            <w:pPr>
+              <w:jc w:val="center"/>
+            </w:pPr>
+            <w:r>
+              <w:rPr>
+                <w:rFonts w:ascii="Cambria" w:cs="Cambria" w:eastAsia="Cambria" w:hAnsi="Cambria"/>
+                <w:b w:val="false"/>
+                <w:bCs w:val="false"/>
+                <w:sz w:val="19"/>
+                <w:szCs w:val="19"/>
+              </w:rPr>
+              <w:t xml:space="preserve">14×</w:t>
             </w:r>
           </w:p>
         </w:tc>
@@ -3469,7 +3813,7 @@
           <w:sz w:val="22"/>
           <w:szCs w:val="22"/>
         </w:rPr>
-        <w:t xml:space="preserve">SIREN beats the ReLU network by 6.6 dB on hidden frames; the ReLU network reaches only 24.5 dB even on its own training frames (SIREN 36.5 dB), the spectral bias described in [1, 2]. Against interpolation the field is 0.36 dB behind on average. Per frame (Figure 2) the field wins frames 5–7, the fastest part of the contraction, where a straight line between two frames misses the motion. The two methods fail in different places, and the fixed blend beats interpolation on 18 of 21 frames (+0.42 dB). With dense frames (every second hidden) there is no gain: interpolation is already near the ceiling.</w:t>
+        <w:t xml:space="preserve">SIREN beats the ReLU network by 6.6 dB on hidden frames; the ReLU network reaches only 24.5 dB even on its own training frames (SIREN 36.5 dB, both exact over all training voxels), the spectral bias described in [1, 2]. Fourier features help the ReLU network a lot (+4.4 dB) but SIREN remains 2.3 dB better with fewer weights. Three seeds differ by only 0.04 dB. The temporal error (×10⁻³) is lowest for interpolation (3.41), then SIREN (3.64), Fourier-ReLU (4.52) and ReLU (5.02). Against interpolation the field is 0.32 dB behind on average. Per frame (Figure 2) the field wins frames 5–7, the fastest part of the contraction, where a straight line between two frames misses the motion. The two methods fail in different places, and the fixed blend beats interpolation on 18 of 21 frames (+0.42 dB). With dense frames (every second hidden) there is no gain: interpolation is already near the ceiling.</w:t>
       </w:r>
     </w:p>
     <w:p>
@@ -3560,39 +3904,7 @@
           <w:sz w:val="23"/>
           <w:szCs w:val="23"/>
         </w:rPr>
-        <w:t xml:space="preserve">5.3 Compression</w:t>
-      </w:r>
-    </w:p>
-    <w:p>
-      <w:pPr>
-        <w:spacing w:after="120" w:before="0" w:line="276"/>
-        <w:jc w:val="both"/>
-      </w:pPr>
-      <w:r>
-        <w:rPr>
-          <w:rFonts w:ascii="Cambria" w:cs="Cambria" w:eastAsia="Cambria" w:hAnsi="Cambria"/>
-          <w:sz w:val="22"/>
-          <w:szCs w:val="22"/>
-        </w:rPr>
-        <w:t xml:space="preserve">The field has 198,913 weights. The heart crop holds 104 × 104 × 10 × 30 = 3.24 million values (16× more; 8× in bytes, since voxels are 16-bit and weights 32-bit), the whole scan 17.2 million (86×; 43× in bytes). Fitting the whole scan with the same weights reaches the 86× midterm target at a cost of 1.4 dB in the heart compared with the crop (27.5 vs 28.9 dB). Interpolation is 29.2 dB but compresses nothing.</w:t>
-      </w:r>
-    </w:p>
-    <w:p>
-      <w:pPr>
-        <w:pStyle w:val="Heading2"/>
-        <w:keepNext/>
-        <w:spacing w:after="80" w:before="180"/>
-      </w:pPr>
-      <w:r>
-        <w:rPr>
-          <w:rFonts w:ascii="Cambria" w:cs="Cambria" w:eastAsia="Cambria" w:hAnsi="Cambria"/>
-          <w:b/>
-          <w:bCs/>
-          <w:color w:val="296693"/>
-          <w:sz w:val="23"/>
-          <w:szCs w:val="23"/>
-        </w:rPr>
-        <w:t xml:space="preserve">5.4 Hidden slices</w:t>
+        <w:t xml:space="preserve">5.3 Fourteen held-out patients</w:t>
       </w:r>
     </w:p>
     <w:p>
@@ -3609,7 +3921,7 @@
           <w:sz w:val="19"/>
           <w:szCs w:val="19"/>
         </w:rPr>
-        <w:t xml:space="preserve">Table 3. Every second slice hidden (20 mm between known slices), ED frame.</w:t>
+        <w:t xml:space="preserve">Table 3. Held-out patients (n = 14), hidden frames with every 4th kept, PSNR in the heart (dB).</w:t>
       </w:r>
     </w:p>
     <w:tbl>
@@ -3628,8 +3940,7 @@
       <w:tblGrid>
         <w:gridCol w:w="4438"/>
         <w:gridCol w:w="1737"/>
-        <w:gridCol w:w="1737"/>
-        <w:gridCol w:w="1736"/>
+        <w:gridCol w:w="3473"/>
       </w:tblGrid>
       <w:tr>
         <w:trPr>
@@ -3665,7 +3976,7 @@
                 <w:sz w:val="19"/>
                 <w:szCs w:val="19"/>
               </w:rPr>
-              <w:t xml:space="preserve">Method</w:t>
+              <w:t xml:space="preserve">Quantity</w:t>
             </w:r>
           </w:p>
         </w:tc>
@@ -3699,13 +4010,13 @@
                 <w:sz w:val="19"/>
                 <w:szCs w:val="19"/>
               </w:rPr>
-              <w:t xml:space="preserve">Heart PSNR</w:t>
-            </w:r>
-          </w:p>
-        </w:tc>
-        <w:tc>
-          <w:tcPr>
-            <w:tcW w:type="dxa" w:w="1737"/>
+              <w:t xml:space="preserve">Mean</w:t>
+            </w:r>
+          </w:p>
+        </w:tc>
+        <w:tc>
+          <w:tcPr>
+            <w:tcW w:type="dxa" w:w="3473"/>
             <w:tcBorders>
               <w:top w:val="single" w:color="BFC9D3" w:sz="4"/>
               <w:left w:val="single" w:color="BFC9D3" w:sz="4"/>
@@ -3733,41 +4044,7 @@
                 <w:sz w:val="19"/>
                 <w:szCs w:val="19"/>
               </w:rPr>
-              <w:t xml:space="preserve">Crop PSNR</w:t>
-            </w:r>
-          </w:p>
-        </w:tc>
-        <w:tc>
-          <w:tcPr>
-            <w:tcW w:type="dxa" w:w="1736"/>
-            <w:tcBorders>
-              <w:top w:val="single" w:color="BFC9D3" w:sz="4"/>
-              <w:left w:val="single" w:color="BFC9D3" w:sz="4"/>
-              <w:bottom w:val="single" w:color="BFC9D3" w:sz="4"/>
-              <w:right w:val="single" w:color="BFC9D3" w:sz="4"/>
-            </w:tcBorders>
-            <w:shd w:fill="183150" w:color="auto" w:val="clear"/>
-            <w:tcMar>
-              <w:top w:type="dxa" w:w="50"/>
-              <w:left w:type="dxa" w:w="90"/>
-              <w:bottom w:type="dxa" w:w="50"/>
-              <w:right w:type="dxa" w:w="90"/>
-            </w:tcMar>
-          </w:tcPr>
-          <w:p>
-            <w:pPr>
-              <w:jc w:val="center"/>
-            </w:pPr>
-            <w:r>
-              <w:rPr>
-                <w:rFonts w:ascii="Cambria" w:cs="Cambria" w:eastAsia="Cambria" w:hAnsi="Cambria"/>
-                <w:b/>
-                <w:bCs/>
-                <w:color w:val="FFFFFF"/>
-                <w:sz w:val="19"/>
-                <w:szCs w:val="19"/>
-              </w:rPr>
-              <w:t xml:space="preserve">SSIM</w:t>
+              <w:t xml:space="preserve">95 % CI over patients</w:t>
             </w:r>
           </w:p>
         </w:tc>
@@ -3804,7 +4081,7 @@
                 <w:sz w:val="19"/>
                 <w:szCs w:val="19"/>
               </w:rPr>
-              <w:t xml:space="preserve">Patient 051 · linear interpolation</w:t>
+              <w:t xml:space="preserve">Linear interpolation</w:t>
             </w:r>
           </w:p>
         </w:tc>
@@ -3836,71 +4113,39 @@
                 <w:sz w:val="19"/>
                 <w:szCs w:val="19"/>
               </w:rPr>
-              <w:t xml:space="preserve">20.01</w:t>
-            </w:r>
-          </w:p>
-        </w:tc>
-        <w:tc>
-          <w:tcPr>
-            <w:tcW w:type="dxa" w:w="1737"/>
-            <w:tcBorders>
-              <w:top w:val="single" w:color="BFC9D3" w:sz="4"/>
-              <w:left w:val="single" w:color="BFC9D3" w:sz="4"/>
-              <w:bottom w:val="single" w:color="BFC9D3" w:sz="4"/>
-              <w:right w:val="single" w:color="BFC9D3" w:sz="4"/>
-            </w:tcBorders>
-            <w:tcMar>
-              <w:top w:type="dxa" w:w="50"/>
-              <w:left w:type="dxa" w:w="90"/>
-              <w:bottom w:type="dxa" w:w="50"/>
-              <w:right w:type="dxa" w:w="90"/>
-            </w:tcMar>
-          </w:tcPr>
-          <w:p>
-            <w:pPr>
-              <w:jc w:val="center"/>
-            </w:pPr>
-            <w:r>
-              <w:rPr>
-                <w:rFonts w:ascii="Cambria" w:cs="Cambria" w:eastAsia="Cambria" w:hAnsi="Cambria"/>
-                <w:b w:val="false"/>
-                <w:bCs w:val="false"/>
-                <w:sz w:val="19"/>
-                <w:szCs w:val="19"/>
-              </w:rPr>
-              <w:t xml:space="preserve">19.55</w:t>
-            </w:r>
-          </w:p>
-        </w:tc>
-        <w:tc>
-          <w:tcPr>
-            <w:tcW w:type="dxa" w:w="1736"/>
-            <w:tcBorders>
-              <w:top w:val="single" w:color="BFC9D3" w:sz="4"/>
-              <w:left w:val="single" w:color="BFC9D3" w:sz="4"/>
-              <w:bottom w:val="single" w:color="BFC9D3" w:sz="4"/>
-              <w:right w:val="single" w:color="BFC9D3" w:sz="4"/>
-            </w:tcBorders>
-            <w:tcMar>
-              <w:top w:type="dxa" w:w="50"/>
-              <w:left w:type="dxa" w:w="90"/>
-              <w:bottom w:type="dxa" w:w="50"/>
-              <w:right w:type="dxa" w:w="90"/>
-            </w:tcMar>
-          </w:tcPr>
-          <w:p>
-            <w:pPr>
-              <w:jc w:val="center"/>
-            </w:pPr>
-            <w:r>
-              <w:rPr>
-                <w:rFonts w:ascii="Cambria" w:cs="Cambria" w:eastAsia="Cambria" w:hAnsi="Cambria"/>
-                <w:b w:val="false"/>
-                <w:bCs w:val="false"/>
-                <w:sz w:val="19"/>
-                <w:szCs w:val="19"/>
-              </w:rPr>
-              <w:t xml:space="preserve">0.354</w:t>
+              <w:t xml:space="preserve">32.12</w:t>
+            </w:r>
+          </w:p>
+        </w:tc>
+        <w:tc>
+          <w:tcPr>
+            <w:tcW w:type="dxa" w:w="3473"/>
+            <w:tcBorders>
+              <w:top w:val="single" w:color="BFC9D3" w:sz="4"/>
+              <w:left w:val="single" w:color="BFC9D3" w:sz="4"/>
+              <w:bottom w:val="single" w:color="BFC9D3" w:sz="4"/>
+              <w:right w:val="single" w:color="BFC9D3" w:sz="4"/>
+            </w:tcBorders>
+            <w:tcMar>
+              <w:top w:type="dxa" w:w="50"/>
+              <w:left w:type="dxa" w:w="90"/>
+              <w:bottom w:type="dxa" w:w="50"/>
+              <w:right w:type="dxa" w:w="90"/>
+            </w:tcMar>
+          </w:tcPr>
+          <w:p>
+            <w:pPr>
+              <w:jc w:val="center"/>
+            </w:pPr>
+            <w:r>
+              <w:rPr>
+                <w:rFonts w:ascii="Cambria" w:cs="Cambria" w:eastAsia="Cambria" w:hAnsi="Cambria"/>
+                <w:b w:val="false"/>
+                <w:bCs w:val="false"/>
+                <w:sz w:val="19"/>
+                <w:szCs w:val="19"/>
+              </w:rPr>
+              <w:t xml:space="preserve">29.70 … 34.55</w:t>
             </w:r>
           </w:p>
         </w:tc>
@@ -3937,7 +4182,7 @@
                 <w:sz w:val="19"/>
                 <w:szCs w:val="19"/>
               </w:rPr>
-              <w:t xml:space="preserve">Patient 051 · SIREN, raw z</w:t>
+              <w:t xml:space="preserve">SIREN</w:t>
             </w:r>
           </w:p>
         </w:tc>
@@ -3969,71 +4214,39 @@
                 <w:sz w:val="19"/>
                 <w:szCs w:val="19"/>
               </w:rPr>
-              <w:t xml:space="preserve">19.95</w:t>
-            </w:r>
-          </w:p>
-        </w:tc>
-        <w:tc>
-          <w:tcPr>
-            <w:tcW w:type="dxa" w:w="1737"/>
-            <w:tcBorders>
-              <w:top w:val="single" w:color="BFC9D3" w:sz="4"/>
-              <w:left w:val="single" w:color="BFC9D3" w:sz="4"/>
-              <w:bottom w:val="single" w:color="BFC9D3" w:sz="4"/>
-              <w:right w:val="single" w:color="BFC9D3" w:sz="4"/>
-            </w:tcBorders>
-            <w:tcMar>
-              <w:top w:type="dxa" w:w="50"/>
-              <w:left w:type="dxa" w:w="90"/>
-              <w:bottom w:type="dxa" w:w="50"/>
-              <w:right w:type="dxa" w:w="90"/>
-            </w:tcMar>
-          </w:tcPr>
-          <w:p>
-            <w:pPr>
-              <w:jc w:val="center"/>
-            </w:pPr>
-            <w:r>
-              <w:rPr>
-                <w:rFonts w:ascii="Cambria" w:cs="Cambria" w:eastAsia="Cambria" w:hAnsi="Cambria"/>
-                <w:b w:val="false"/>
-                <w:bCs w:val="false"/>
-                <w:sz w:val="19"/>
-                <w:szCs w:val="19"/>
-              </w:rPr>
-              <w:t xml:space="preserve">19.72</w:t>
-            </w:r>
-          </w:p>
-        </w:tc>
-        <w:tc>
-          <w:tcPr>
-            <w:tcW w:type="dxa" w:w="1736"/>
-            <w:tcBorders>
-              <w:top w:val="single" w:color="BFC9D3" w:sz="4"/>
-              <w:left w:val="single" w:color="BFC9D3" w:sz="4"/>
-              <w:bottom w:val="single" w:color="BFC9D3" w:sz="4"/>
-              <w:right w:val="single" w:color="BFC9D3" w:sz="4"/>
-            </w:tcBorders>
-            <w:tcMar>
-              <w:top w:type="dxa" w:w="50"/>
-              <w:left w:type="dxa" w:w="90"/>
-              <w:bottom w:type="dxa" w:w="50"/>
-              <w:right w:type="dxa" w:w="90"/>
-            </w:tcMar>
-          </w:tcPr>
-          <w:p>
-            <w:pPr>
-              <w:jc w:val="center"/>
-            </w:pPr>
-            <w:r>
-              <w:rPr>
-                <w:rFonts w:ascii="Cambria" w:cs="Cambria" w:eastAsia="Cambria" w:hAnsi="Cambria"/>
-                <w:b w:val="false"/>
-                <w:bCs w:val="false"/>
-                <w:sz w:val="19"/>
-                <w:szCs w:val="19"/>
-              </w:rPr>
-              <w:t xml:space="preserve">0.340</w:t>
+              <w:t xml:space="preserve">31.55</w:t>
+            </w:r>
+          </w:p>
+        </w:tc>
+        <w:tc>
+          <w:tcPr>
+            <w:tcW w:type="dxa" w:w="3473"/>
+            <w:tcBorders>
+              <w:top w:val="single" w:color="BFC9D3" w:sz="4"/>
+              <w:left w:val="single" w:color="BFC9D3" w:sz="4"/>
+              <w:bottom w:val="single" w:color="BFC9D3" w:sz="4"/>
+              <w:right w:val="single" w:color="BFC9D3" w:sz="4"/>
+            </w:tcBorders>
+            <w:tcMar>
+              <w:top w:type="dxa" w:w="50"/>
+              <w:left w:type="dxa" w:w="90"/>
+              <w:bottom w:type="dxa" w:w="50"/>
+              <w:right w:type="dxa" w:w="90"/>
+            </w:tcMar>
+          </w:tcPr>
+          <w:p>
+            <w:pPr>
+              <w:jc w:val="center"/>
+            </w:pPr>
+            <w:r>
+              <w:rPr>
+                <w:rFonts w:ascii="Cambria" w:cs="Cambria" w:eastAsia="Cambria" w:hAnsi="Cambria"/>
+                <w:b w:val="false"/>
+                <w:bCs w:val="false"/>
+                <w:sz w:val="19"/>
+                <w:szCs w:val="19"/>
+              </w:rPr>
+              <w:t xml:space="preserve">29.15 … 33.94</w:t>
             </w:r>
           </w:p>
         </w:tc>
@@ -4070,7 +4283,7 @@
                 <w:sz w:val="19"/>
                 <w:szCs w:val="19"/>
               </w:rPr>
-              <w:t xml:space="preserve">Patient 051 · SIREN, z × 0.5</w:t>
+              <w:t xml:space="preserve">ReLU, same size</w:t>
             </w:r>
           </w:p>
         </w:tc>
@@ -4102,71 +4315,39 @@
                 <w:sz w:val="19"/>
                 <w:szCs w:val="19"/>
               </w:rPr>
-              <w:t xml:space="preserve">19.87</w:t>
-            </w:r>
-          </w:p>
-        </w:tc>
-        <w:tc>
-          <w:tcPr>
-            <w:tcW w:type="dxa" w:w="1737"/>
-            <w:tcBorders>
-              <w:top w:val="single" w:color="BFC9D3" w:sz="4"/>
-              <w:left w:val="single" w:color="BFC9D3" w:sz="4"/>
-              <w:bottom w:val="single" w:color="BFC9D3" w:sz="4"/>
-              <w:right w:val="single" w:color="BFC9D3" w:sz="4"/>
-            </w:tcBorders>
-            <w:tcMar>
-              <w:top w:type="dxa" w:w="50"/>
-              <w:left w:type="dxa" w:w="90"/>
-              <w:bottom w:type="dxa" w:w="50"/>
-              <w:right w:type="dxa" w:w="90"/>
-            </w:tcMar>
-          </w:tcPr>
-          <w:p>
-            <w:pPr>
-              <w:jc w:val="center"/>
-            </w:pPr>
-            <w:r>
-              <w:rPr>
-                <w:rFonts w:ascii="Cambria" w:cs="Cambria" w:eastAsia="Cambria" w:hAnsi="Cambria"/>
-                <w:b w:val="false"/>
-                <w:bCs w:val="false"/>
-                <w:sz w:val="19"/>
-                <w:szCs w:val="19"/>
-              </w:rPr>
-              <w:t xml:space="preserve">19.85</w:t>
-            </w:r>
-          </w:p>
-        </w:tc>
-        <w:tc>
-          <w:tcPr>
-            <w:tcW w:type="dxa" w:w="1736"/>
-            <w:tcBorders>
-              <w:top w:val="single" w:color="BFC9D3" w:sz="4"/>
-              <w:left w:val="single" w:color="BFC9D3" w:sz="4"/>
-              <w:bottom w:val="single" w:color="BFC9D3" w:sz="4"/>
-              <w:right w:val="single" w:color="BFC9D3" w:sz="4"/>
-            </w:tcBorders>
-            <w:tcMar>
-              <w:top w:type="dxa" w:w="50"/>
-              <w:left w:type="dxa" w:w="90"/>
-              <w:bottom w:type="dxa" w:w="50"/>
-              <w:right w:type="dxa" w:w="90"/>
-            </w:tcMar>
-          </w:tcPr>
-          <w:p>
-            <w:pPr>
-              <w:jc w:val="center"/>
-            </w:pPr>
-            <w:r>
-              <w:rPr>
-                <w:rFonts w:ascii="Cambria" w:cs="Cambria" w:eastAsia="Cambria" w:hAnsi="Cambria"/>
-                <w:b w:val="false"/>
-                <w:bCs w:val="false"/>
-                <w:sz w:val="19"/>
-                <w:szCs w:val="19"/>
-              </w:rPr>
-              <w:t xml:space="preserve">0.378</w:t>
+              <w:t xml:space="preserve">24.12</w:t>
+            </w:r>
+          </w:p>
+        </w:tc>
+        <w:tc>
+          <w:tcPr>
+            <w:tcW w:type="dxa" w:w="3473"/>
+            <w:tcBorders>
+              <w:top w:val="single" w:color="BFC9D3" w:sz="4"/>
+              <w:left w:val="single" w:color="BFC9D3" w:sz="4"/>
+              <w:bottom w:val="single" w:color="BFC9D3" w:sz="4"/>
+              <w:right w:val="single" w:color="BFC9D3" w:sz="4"/>
+            </w:tcBorders>
+            <w:tcMar>
+              <w:top w:type="dxa" w:w="50"/>
+              <w:left w:type="dxa" w:w="90"/>
+              <w:bottom w:type="dxa" w:w="50"/>
+              <w:right w:type="dxa" w:w="90"/>
+            </w:tcMar>
+          </w:tcPr>
+          <w:p>
+            <w:pPr>
+              <w:jc w:val="center"/>
+            </w:pPr>
+            <w:r>
+              <w:rPr>
+                <w:rFonts w:ascii="Cambria" w:cs="Cambria" w:eastAsia="Cambria" w:hAnsi="Cambria"/>
+                <w:b w:val="false"/>
+                <w:bCs w:val="false"/>
+                <w:sz w:val="19"/>
+                <w:szCs w:val="19"/>
+              </w:rPr>
+              <w:t xml:space="preserve">22.10 … 26.14</w:t>
             </w:r>
           </w:p>
         </w:tc>
@@ -4184,7 +4365,6 @@
               <w:bottom w:val="single" w:color="BFC9D3" w:sz="4"/>
               <w:right w:val="single" w:color="BFC9D3" w:sz="4"/>
             </w:tcBorders>
-            <w:shd w:fill="EEF2F6" w:color="auto" w:val="clear"/>
             <w:tcMar>
               <w:top w:type="dxa" w:w="50"/>
               <w:left w:type="dxa" w:w="90"/>
@@ -4199,12 +4379,12 @@
             <w:r>
               <w:rPr>
                 <w:rFonts w:ascii="Cambria" w:cs="Cambria" w:eastAsia="Cambria" w:hAnsi="Cambria"/>
-                <w:b/>
-                <w:bCs/>
-                <w:sz w:val="19"/>
-                <w:szCs w:val="19"/>
-              </w:rPr>
-              <w:t xml:space="preserve">Patient 051 · SIREN, z × 0.25</w:t>
+                <w:b w:val="false"/>
+                <w:bCs w:val="false"/>
+                <w:sz w:val="19"/>
+                <w:szCs w:val="19"/>
+              </w:rPr>
+              <w:t xml:space="preserve">Blend 0.5 SIREN + 0.5 interp.</w:t>
             </w:r>
           </w:p>
         </w:tc>
@@ -4217,93 +4397,58 @@
               <w:bottom w:val="single" w:color="BFC9D3" w:sz="4"/>
               <w:right w:val="single" w:color="BFC9D3" w:sz="4"/>
             </w:tcBorders>
-            <w:shd w:fill="EEF2F6" w:color="auto" w:val="clear"/>
-            <w:tcMar>
-              <w:top w:type="dxa" w:w="50"/>
-              <w:left w:type="dxa" w:w="90"/>
-              <w:bottom w:type="dxa" w:w="50"/>
-              <w:right w:type="dxa" w:w="90"/>
-            </w:tcMar>
-          </w:tcPr>
-          <w:p>
-            <w:pPr>
-              <w:jc w:val="center"/>
-            </w:pPr>
-            <w:r>
-              <w:rPr>
-                <w:rFonts w:ascii="Cambria" w:cs="Cambria" w:eastAsia="Cambria" w:hAnsi="Cambria"/>
-                <w:b/>
-                <w:bCs/>
-                <w:sz w:val="19"/>
-                <w:szCs w:val="19"/>
-              </w:rPr>
-              <w:t xml:space="preserve">20.09</w:t>
-            </w:r>
-          </w:p>
-        </w:tc>
-        <w:tc>
-          <w:tcPr>
-            <w:tcW w:type="dxa" w:w="1737"/>
-            <w:tcBorders>
-              <w:top w:val="single" w:color="BFC9D3" w:sz="4"/>
-              <w:left w:val="single" w:color="BFC9D3" w:sz="4"/>
-              <w:bottom w:val="single" w:color="BFC9D3" w:sz="4"/>
-              <w:right w:val="single" w:color="BFC9D3" w:sz="4"/>
-            </w:tcBorders>
-            <w:shd w:fill="EEF2F6" w:color="auto" w:val="clear"/>
-            <w:tcMar>
-              <w:top w:type="dxa" w:w="50"/>
-              <w:left w:type="dxa" w:w="90"/>
-              <w:bottom w:type="dxa" w:w="50"/>
-              <w:right w:type="dxa" w:w="90"/>
-            </w:tcMar>
-          </w:tcPr>
-          <w:p>
-            <w:pPr>
-              <w:jc w:val="center"/>
-            </w:pPr>
-            <w:r>
-              <w:rPr>
-                <w:rFonts w:ascii="Cambria" w:cs="Cambria" w:eastAsia="Cambria" w:hAnsi="Cambria"/>
-                <w:b/>
-                <w:bCs/>
-                <w:sz w:val="19"/>
-                <w:szCs w:val="19"/>
-              </w:rPr>
-              <w:t xml:space="preserve">19.79</w:t>
-            </w:r>
-          </w:p>
-        </w:tc>
-        <w:tc>
-          <w:tcPr>
-            <w:tcW w:type="dxa" w:w="1736"/>
-            <w:tcBorders>
-              <w:top w:val="single" w:color="BFC9D3" w:sz="4"/>
-              <w:left w:val="single" w:color="BFC9D3" w:sz="4"/>
-              <w:bottom w:val="single" w:color="BFC9D3" w:sz="4"/>
-              <w:right w:val="single" w:color="BFC9D3" w:sz="4"/>
-            </w:tcBorders>
-            <w:shd w:fill="EEF2F6" w:color="auto" w:val="clear"/>
-            <w:tcMar>
-              <w:top w:type="dxa" w:w="50"/>
-              <w:left w:type="dxa" w:w="90"/>
-              <w:bottom w:type="dxa" w:w="50"/>
-              <w:right w:type="dxa" w:w="90"/>
-            </w:tcMar>
-          </w:tcPr>
-          <w:p>
-            <w:pPr>
-              <w:jc w:val="center"/>
-            </w:pPr>
-            <w:r>
-              <w:rPr>
-                <w:rFonts w:ascii="Cambria" w:cs="Cambria" w:eastAsia="Cambria" w:hAnsi="Cambria"/>
-                <w:b/>
-                <w:bCs/>
-                <w:sz w:val="19"/>
-                <w:szCs w:val="19"/>
-              </w:rPr>
-              <w:t xml:space="preserve">0.362</w:t>
+            <w:tcMar>
+              <w:top w:type="dxa" w:w="50"/>
+              <w:left w:type="dxa" w:w="90"/>
+              <w:bottom w:type="dxa" w:w="50"/>
+              <w:right w:type="dxa" w:w="90"/>
+            </w:tcMar>
+          </w:tcPr>
+          <w:p>
+            <w:pPr>
+              <w:jc w:val="center"/>
+            </w:pPr>
+            <w:r>
+              <w:rPr>
+                <w:rFonts w:ascii="Cambria" w:cs="Cambria" w:eastAsia="Cambria" w:hAnsi="Cambria"/>
+                <w:b w:val="false"/>
+                <w:bCs w:val="false"/>
+                <w:sz w:val="19"/>
+                <w:szCs w:val="19"/>
+              </w:rPr>
+              <w:t xml:space="preserve">32.49</w:t>
+            </w:r>
+          </w:p>
+        </w:tc>
+        <w:tc>
+          <w:tcPr>
+            <w:tcW w:type="dxa" w:w="3473"/>
+            <w:tcBorders>
+              <w:top w:val="single" w:color="BFC9D3" w:sz="4"/>
+              <w:left w:val="single" w:color="BFC9D3" w:sz="4"/>
+              <w:bottom w:val="single" w:color="BFC9D3" w:sz="4"/>
+              <w:right w:val="single" w:color="BFC9D3" w:sz="4"/>
+            </w:tcBorders>
+            <w:tcMar>
+              <w:top w:type="dxa" w:w="50"/>
+              <w:left w:type="dxa" w:w="90"/>
+              <w:bottom w:type="dxa" w:w="50"/>
+              <w:right w:type="dxa" w:w="90"/>
+            </w:tcMar>
+          </w:tcPr>
+          <w:p>
+            <w:pPr>
+              <w:jc w:val="center"/>
+            </w:pPr>
+            <w:r>
+              <w:rPr>
+                <w:rFonts w:ascii="Cambria" w:cs="Cambria" w:eastAsia="Cambria" w:hAnsi="Cambria"/>
+                <w:b w:val="false"/>
+                <w:bCs w:val="false"/>
+                <w:sz w:val="19"/>
+                <w:szCs w:val="19"/>
+              </w:rPr>
+              <w:t xml:space="preserve">30.08 … 34.91</w:t>
             </w:r>
           </w:p>
         </w:tc>
@@ -4340,7 +4485,7 @@
                 <w:sz w:val="19"/>
                 <w:szCs w:val="19"/>
               </w:rPr>
-              <w:t xml:space="preserve">Patient 051 · ReLU, same size</w:t>
+              <w:t xml:space="preserve">SIREN − ReLU (paired)</w:t>
             </w:r>
           </w:p>
         </w:tc>
@@ -4372,71 +4517,39 @@
                 <w:sz w:val="19"/>
                 <w:szCs w:val="19"/>
               </w:rPr>
-              <w:t xml:space="preserve">18.83</w:t>
-            </w:r>
-          </w:p>
-        </w:tc>
-        <w:tc>
-          <w:tcPr>
-            <w:tcW w:type="dxa" w:w="1737"/>
-            <w:tcBorders>
-              <w:top w:val="single" w:color="BFC9D3" w:sz="4"/>
-              <w:left w:val="single" w:color="BFC9D3" w:sz="4"/>
-              <w:bottom w:val="single" w:color="BFC9D3" w:sz="4"/>
-              <w:right w:val="single" w:color="BFC9D3" w:sz="4"/>
-            </w:tcBorders>
-            <w:tcMar>
-              <w:top w:type="dxa" w:w="50"/>
-              <w:left w:type="dxa" w:w="90"/>
-              <w:bottom w:type="dxa" w:w="50"/>
-              <w:right w:type="dxa" w:w="90"/>
-            </w:tcMar>
-          </w:tcPr>
-          <w:p>
-            <w:pPr>
-              <w:jc w:val="center"/>
-            </w:pPr>
-            <w:r>
-              <w:rPr>
-                <w:rFonts w:ascii="Cambria" w:cs="Cambria" w:eastAsia="Cambria" w:hAnsi="Cambria"/>
-                <w:b w:val="false"/>
-                <w:bCs w:val="false"/>
-                <w:sz w:val="19"/>
-                <w:szCs w:val="19"/>
-              </w:rPr>
-              <w:t xml:space="preserve">19.67</w:t>
-            </w:r>
-          </w:p>
-        </w:tc>
-        <w:tc>
-          <w:tcPr>
-            <w:tcW w:type="dxa" w:w="1736"/>
-            <w:tcBorders>
-              <w:top w:val="single" w:color="BFC9D3" w:sz="4"/>
-              <w:left w:val="single" w:color="BFC9D3" w:sz="4"/>
-              <w:bottom w:val="single" w:color="BFC9D3" w:sz="4"/>
-              <w:right w:val="single" w:color="BFC9D3" w:sz="4"/>
-            </w:tcBorders>
-            <w:tcMar>
-              <w:top w:type="dxa" w:w="50"/>
-              <w:left w:type="dxa" w:w="90"/>
-              <w:bottom w:type="dxa" w:w="50"/>
-              <w:right w:type="dxa" w:w="90"/>
-            </w:tcMar>
-          </w:tcPr>
-          <w:p>
-            <w:pPr>
-              <w:jc w:val="center"/>
-            </w:pPr>
-            <w:r>
-              <w:rPr>
-                <w:rFonts w:ascii="Cambria" w:cs="Cambria" w:eastAsia="Cambria" w:hAnsi="Cambria"/>
-                <w:b w:val="false"/>
-                <w:bCs w:val="false"/>
-                <w:sz w:val="19"/>
-                <w:szCs w:val="19"/>
-              </w:rPr>
-              <w:t xml:space="preserve">0.373</w:t>
+              <w:t xml:space="preserve">+7.43</w:t>
+            </w:r>
+          </w:p>
+        </w:tc>
+        <w:tc>
+          <w:tcPr>
+            <w:tcW w:type="dxa" w:w="3473"/>
+            <w:tcBorders>
+              <w:top w:val="single" w:color="BFC9D3" w:sz="4"/>
+              <w:left w:val="single" w:color="BFC9D3" w:sz="4"/>
+              <w:bottom w:val="single" w:color="BFC9D3" w:sz="4"/>
+              <w:right w:val="single" w:color="BFC9D3" w:sz="4"/>
+            </w:tcBorders>
+            <w:tcMar>
+              <w:top w:type="dxa" w:w="50"/>
+              <w:left w:type="dxa" w:w="90"/>
+              <w:bottom w:type="dxa" w:w="50"/>
+              <w:right w:type="dxa" w:w="90"/>
+            </w:tcMar>
+          </w:tcPr>
+          <w:p>
+            <w:pPr>
+              <w:jc w:val="center"/>
+            </w:pPr>
+            <w:r>
+              <w:rPr>
+                <w:rFonts w:ascii="Cambria" w:cs="Cambria" w:eastAsia="Cambria" w:hAnsi="Cambria"/>
+                <w:b w:val="false"/>
+                <w:bCs w:val="false"/>
+                <w:sz w:val="19"/>
+                <w:szCs w:val="19"/>
+              </w:rPr>
+              <w:t xml:space="preserve">+6.28 … +8.59</w:t>
             </w:r>
           </w:p>
         </w:tc>
@@ -4473,7 +4586,7 @@
                 <w:sz w:val="19"/>
                 <w:szCs w:val="19"/>
               </w:rPr>
-              <w:t xml:space="preserve">Patient 015 · linear interpolation</w:t>
+              <w:t xml:space="preserve">SIREN − interpolation (paired)</w:t>
             </w:r>
           </w:p>
         </w:tc>
@@ -4505,71 +4618,39 @@
                 <w:sz w:val="19"/>
                 <w:szCs w:val="19"/>
               </w:rPr>
-              <w:t xml:space="preserve">20.68</w:t>
-            </w:r>
-          </w:p>
-        </w:tc>
-        <w:tc>
-          <w:tcPr>
-            <w:tcW w:type="dxa" w:w="1737"/>
-            <w:tcBorders>
-              <w:top w:val="single" w:color="BFC9D3" w:sz="4"/>
-              <w:left w:val="single" w:color="BFC9D3" w:sz="4"/>
-              <w:bottom w:val="single" w:color="BFC9D3" w:sz="4"/>
-              <w:right w:val="single" w:color="BFC9D3" w:sz="4"/>
-            </w:tcBorders>
-            <w:tcMar>
-              <w:top w:type="dxa" w:w="50"/>
-              <w:left w:type="dxa" w:w="90"/>
-              <w:bottom w:type="dxa" w:w="50"/>
-              <w:right w:type="dxa" w:w="90"/>
-            </w:tcMar>
-          </w:tcPr>
-          <w:p>
-            <w:pPr>
-              <w:jc w:val="center"/>
-            </w:pPr>
-            <w:r>
-              <w:rPr>
-                <w:rFonts w:ascii="Cambria" w:cs="Cambria" w:eastAsia="Cambria" w:hAnsi="Cambria"/>
-                <w:b w:val="false"/>
-                <w:bCs w:val="false"/>
-                <w:sz w:val="19"/>
-                <w:szCs w:val="19"/>
-              </w:rPr>
-              <w:t xml:space="preserve">20.06</w:t>
-            </w:r>
-          </w:p>
-        </w:tc>
-        <w:tc>
-          <w:tcPr>
-            <w:tcW w:type="dxa" w:w="1736"/>
-            <w:tcBorders>
-              <w:top w:val="single" w:color="BFC9D3" w:sz="4"/>
-              <w:left w:val="single" w:color="BFC9D3" w:sz="4"/>
-              <w:bottom w:val="single" w:color="BFC9D3" w:sz="4"/>
-              <w:right w:val="single" w:color="BFC9D3" w:sz="4"/>
-            </w:tcBorders>
-            <w:tcMar>
-              <w:top w:type="dxa" w:w="50"/>
-              <w:left w:type="dxa" w:w="90"/>
-              <w:bottom w:type="dxa" w:w="50"/>
-              <w:right w:type="dxa" w:w="90"/>
-            </w:tcMar>
-          </w:tcPr>
-          <w:p>
-            <w:pPr>
-              <w:jc w:val="center"/>
-            </w:pPr>
-            <w:r>
-              <w:rPr>
-                <w:rFonts w:ascii="Cambria" w:cs="Cambria" w:eastAsia="Cambria" w:hAnsi="Cambria"/>
-                <w:b w:val="false"/>
-                <w:bCs w:val="false"/>
-                <w:sz w:val="19"/>
-                <w:szCs w:val="19"/>
-              </w:rPr>
-              <w:t xml:space="preserve">0.403</w:t>
+              <w:t xml:space="preserve">−0.57</w:t>
+            </w:r>
+          </w:p>
+        </w:tc>
+        <w:tc>
+          <w:tcPr>
+            <w:tcW w:type="dxa" w:w="3473"/>
+            <w:tcBorders>
+              <w:top w:val="single" w:color="BFC9D3" w:sz="4"/>
+              <w:left w:val="single" w:color="BFC9D3" w:sz="4"/>
+              <w:bottom w:val="single" w:color="BFC9D3" w:sz="4"/>
+              <w:right w:val="single" w:color="BFC9D3" w:sz="4"/>
+            </w:tcBorders>
+            <w:tcMar>
+              <w:top w:type="dxa" w:w="50"/>
+              <w:left w:type="dxa" w:w="90"/>
+              <w:bottom w:type="dxa" w:w="50"/>
+              <w:right w:type="dxa" w:w="90"/>
+            </w:tcMar>
+          </w:tcPr>
+          <w:p>
+            <w:pPr>
+              <w:jc w:val="center"/>
+            </w:pPr>
+            <w:r>
+              <w:rPr>
+                <w:rFonts w:ascii="Cambria" w:cs="Cambria" w:eastAsia="Cambria" w:hAnsi="Cambria"/>
+                <w:b w:val="false"/>
+                <w:bCs w:val="false"/>
+                <w:sz w:val="19"/>
+                <w:szCs w:val="19"/>
+              </w:rPr>
+              <w:t xml:space="preserve">−0.76 … −0.38</w:t>
             </w:r>
           </w:p>
         </w:tc>
@@ -4587,6 +4668,7 @@
               <w:bottom w:val="single" w:color="BFC9D3" w:sz="4"/>
               <w:right w:val="single" w:color="BFC9D3" w:sz="4"/>
             </w:tcBorders>
+            <w:shd w:fill="EEF2F6" w:color="auto" w:val="clear"/>
             <w:tcMar>
               <w:top w:type="dxa" w:w="50"/>
               <w:left w:type="dxa" w:w="90"/>
@@ -4601,12 +4683,12 @@
             <w:r>
               <w:rPr>
                 <w:rFonts w:ascii="Cambria" w:cs="Cambria" w:eastAsia="Cambria" w:hAnsi="Cambria"/>
-                <w:b w:val="false"/>
-                <w:bCs w:val="false"/>
-                <w:sz w:val="19"/>
-                <w:szCs w:val="19"/>
-              </w:rPr>
-              <w:t xml:space="preserve">Patient 015 · SIREN, z × 0.5</w:t>
+                <w:b/>
+                <w:bCs/>
+                <w:sz w:val="19"/>
+                <w:szCs w:val="19"/>
+              </w:rPr>
+              <w:t xml:space="preserve">Blend − interpolation (paired)</w:t>
             </w:r>
           </w:p>
         </w:tc>
@@ -4619,223 +4701,60 @@
               <w:bottom w:val="single" w:color="BFC9D3" w:sz="4"/>
               <w:right w:val="single" w:color="BFC9D3" w:sz="4"/>
             </w:tcBorders>
-            <w:tcMar>
-              <w:top w:type="dxa" w:w="50"/>
-              <w:left w:type="dxa" w:w="90"/>
-              <w:bottom w:type="dxa" w:w="50"/>
-              <w:right w:type="dxa" w:w="90"/>
-            </w:tcMar>
-          </w:tcPr>
-          <w:p>
-            <w:pPr>
-              <w:jc w:val="center"/>
-            </w:pPr>
-            <w:r>
-              <w:rPr>
-                <w:rFonts w:ascii="Cambria" w:cs="Cambria" w:eastAsia="Cambria" w:hAnsi="Cambria"/>
-                <w:b w:val="false"/>
-                <w:bCs w:val="false"/>
-                <w:sz w:val="19"/>
-                <w:szCs w:val="19"/>
-              </w:rPr>
-              <w:t xml:space="preserve">20.42</w:t>
-            </w:r>
-          </w:p>
-        </w:tc>
-        <w:tc>
-          <w:tcPr>
-            <w:tcW w:type="dxa" w:w="1737"/>
-            <w:tcBorders>
-              <w:top w:val="single" w:color="BFC9D3" w:sz="4"/>
-              <w:left w:val="single" w:color="BFC9D3" w:sz="4"/>
-              <w:bottom w:val="single" w:color="BFC9D3" w:sz="4"/>
-              <w:right w:val="single" w:color="BFC9D3" w:sz="4"/>
-            </w:tcBorders>
-            <w:tcMar>
-              <w:top w:type="dxa" w:w="50"/>
-              <w:left w:type="dxa" w:w="90"/>
-              <w:bottom w:type="dxa" w:w="50"/>
-              <w:right w:type="dxa" w:w="90"/>
-            </w:tcMar>
-          </w:tcPr>
-          <w:p>
-            <w:pPr>
-              <w:jc w:val="center"/>
-            </w:pPr>
-            <w:r>
-              <w:rPr>
-                <w:rFonts w:ascii="Cambria" w:cs="Cambria" w:eastAsia="Cambria" w:hAnsi="Cambria"/>
-                <w:b w:val="false"/>
-                <w:bCs w:val="false"/>
-                <w:sz w:val="19"/>
-                <w:szCs w:val="19"/>
-              </w:rPr>
-              <w:t xml:space="preserve">20.84</w:t>
-            </w:r>
-          </w:p>
-        </w:tc>
-        <w:tc>
-          <w:tcPr>
-            <w:tcW w:type="dxa" w:w="1736"/>
-            <w:tcBorders>
-              <w:top w:val="single" w:color="BFC9D3" w:sz="4"/>
-              <w:left w:val="single" w:color="BFC9D3" w:sz="4"/>
-              <w:bottom w:val="single" w:color="BFC9D3" w:sz="4"/>
-              <w:right w:val="single" w:color="BFC9D3" w:sz="4"/>
-            </w:tcBorders>
-            <w:tcMar>
-              <w:top w:type="dxa" w:w="50"/>
-              <w:left w:type="dxa" w:w="90"/>
-              <w:bottom w:type="dxa" w:w="50"/>
-              <w:right w:type="dxa" w:w="90"/>
-            </w:tcMar>
-          </w:tcPr>
-          <w:p>
-            <w:pPr>
-              <w:jc w:val="center"/>
-            </w:pPr>
-            <w:r>
-              <w:rPr>
-                <w:rFonts w:ascii="Cambria" w:cs="Cambria" w:eastAsia="Cambria" w:hAnsi="Cambria"/>
-                <w:b w:val="false"/>
-                <w:bCs w:val="false"/>
-                <w:sz w:val="19"/>
-                <w:szCs w:val="19"/>
-              </w:rPr>
-              <w:t xml:space="preserve">0.410</w:t>
-            </w:r>
-          </w:p>
-        </w:tc>
-      </w:tr>
-      <w:tr>
-        <w:trPr>
-          <w:cantSplit/>
-        </w:trPr>
-        <w:tc>
-          <w:tcPr>
-            <w:tcW w:type="dxa" w:w="4438"/>
-            <w:tcBorders>
-              <w:top w:val="single" w:color="BFC9D3" w:sz="4"/>
-              <w:left w:val="single" w:color="BFC9D3" w:sz="4"/>
-              <w:bottom w:val="single" w:color="BFC9D3" w:sz="4"/>
-              <w:right w:val="single" w:color="BFC9D3" w:sz="4"/>
-            </w:tcBorders>
-            <w:tcMar>
-              <w:top w:type="dxa" w:w="50"/>
-              <w:left w:type="dxa" w:w="90"/>
-              <w:bottom w:type="dxa" w:w="50"/>
-              <w:right w:type="dxa" w:w="90"/>
-            </w:tcMar>
-          </w:tcPr>
-          <w:p>
-            <w:pPr>
-              <w:jc w:val="left"/>
-            </w:pPr>
-            <w:r>
-              <w:rPr>
-                <w:rFonts w:ascii="Cambria" w:cs="Cambria" w:eastAsia="Cambria" w:hAnsi="Cambria"/>
-                <w:b w:val="false"/>
-                <w:bCs w:val="false"/>
-                <w:sz w:val="19"/>
-                <w:szCs w:val="19"/>
-              </w:rPr>
-              <w:t xml:space="preserve">Patient 015 · SIREN, z × 0.25</w:t>
-            </w:r>
-          </w:p>
-        </w:tc>
-        <w:tc>
-          <w:tcPr>
-            <w:tcW w:type="dxa" w:w="1737"/>
-            <w:tcBorders>
-              <w:top w:val="single" w:color="BFC9D3" w:sz="4"/>
-              <w:left w:val="single" w:color="BFC9D3" w:sz="4"/>
-              <w:bottom w:val="single" w:color="BFC9D3" w:sz="4"/>
-              <w:right w:val="single" w:color="BFC9D3" w:sz="4"/>
-            </w:tcBorders>
-            <w:tcMar>
-              <w:top w:type="dxa" w:w="50"/>
-              <w:left w:type="dxa" w:w="90"/>
-              <w:bottom w:type="dxa" w:w="50"/>
-              <w:right w:type="dxa" w:w="90"/>
-            </w:tcMar>
-          </w:tcPr>
-          <w:p>
-            <w:pPr>
-              <w:jc w:val="center"/>
-            </w:pPr>
-            <w:r>
-              <w:rPr>
-                <w:rFonts w:ascii="Cambria" w:cs="Cambria" w:eastAsia="Cambria" w:hAnsi="Cambria"/>
-                <w:b w:val="false"/>
-                <w:bCs w:val="false"/>
-                <w:sz w:val="19"/>
-                <w:szCs w:val="19"/>
-              </w:rPr>
-              <w:t xml:space="preserve">20.13</w:t>
-            </w:r>
-          </w:p>
-        </w:tc>
-        <w:tc>
-          <w:tcPr>
-            <w:tcW w:type="dxa" w:w="1737"/>
-            <w:tcBorders>
-              <w:top w:val="single" w:color="BFC9D3" w:sz="4"/>
-              <w:left w:val="single" w:color="BFC9D3" w:sz="4"/>
-              <w:bottom w:val="single" w:color="BFC9D3" w:sz="4"/>
-              <w:right w:val="single" w:color="BFC9D3" w:sz="4"/>
-            </w:tcBorders>
-            <w:tcMar>
-              <w:top w:type="dxa" w:w="50"/>
-              <w:left w:type="dxa" w:w="90"/>
-              <w:bottom w:type="dxa" w:w="50"/>
-              <w:right w:type="dxa" w:w="90"/>
-            </w:tcMar>
-          </w:tcPr>
-          <w:p>
-            <w:pPr>
-              <w:jc w:val="center"/>
-            </w:pPr>
-            <w:r>
-              <w:rPr>
-                <w:rFonts w:ascii="Cambria" w:cs="Cambria" w:eastAsia="Cambria" w:hAnsi="Cambria"/>
-                <w:b w:val="false"/>
-                <w:bCs w:val="false"/>
-                <w:sz w:val="19"/>
-                <w:szCs w:val="19"/>
-              </w:rPr>
-              <w:t xml:space="preserve">20.45</w:t>
-            </w:r>
-          </w:p>
-        </w:tc>
-        <w:tc>
-          <w:tcPr>
-            <w:tcW w:type="dxa" w:w="1736"/>
-            <w:tcBorders>
-              <w:top w:val="single" w:color="BFC9D3" w:sz="4"/>
-              <w:left w:val="single" w:color="BFC9D3" w:sz="4"/>
-              <w:bottom w:val="single" w:color="BFC9D3" w:sz="4"/>
-              <w:right w:val="single" w:color="BFC9D3" w:sz="4"/>
-            </w:tcBorders>
-            <w:tcMar>
-              <w:top w:type="dxa" w:w="50"/>
-              <w:left w:type="dxa" w:w="90"/>
-              <w:bottom w:type="dxa" w:w="50"/>
-              <w:right w:type="dxa" w:w="90"/>
-            </w:tcMar>
-          </w:tcPr>
-          <w:p>
-            <w:pPr>
-              <w:jc w:val="center"/>
-            </w:pPr>
-            <w:r>
-              <w:rPr>
-                <w:rFonts w:ascii="Cambria" w:cs="Cambria" w:eastAsia="Cambria" w:hAnsi="Cambria"/>
-                <w:b w:val="false"/>
-                <w:bCs w:val="false"/>
-                <w:sz w:val="19"/>
-                <w:szCs w:val="19"/>
-              </w:rPr>
-              <w:t xml:space="preserve">0.411</w:t>
+            <w:shd w:fill="EEF2F6" w:color="auto" w:val="clear"/>
+            <w:tcMar>
+              <w:top w:type="dxa" w:w="50"/>
+              <w:left w:type="dxa" w:w="90"/>
+              <w:bottom w:type="dxa" w:w="50"/>
+              <w:right w:type="dxa" w:w="90"/>
+            </w:tcMar>
+          </w:tcPr>
+          <w:p>
+            <w:pPr>
+              <w:jc w:val="center"/>
+            </w:pPr>
+            <w:r>
+              <w:rPr>
+                <w:rFonts w:ascii="Cambria" w:cs="Cambria" w:eastAsia="Cambria" w:hAnsi="Cambria"/>
+                <w:b/>
+                <w:bCs/>
+                <w:sz w:val="19"/>
+                <w:szCs w:val="19"/>
+              </w:rPr>
+              <w:t xml:space="preserve">+0.37</w:t>
+            </w:r>
+          </w:p>
+        </w:tc>
+        <w:tc>
+          <w:tcPr>
+            <w:tcW w:type="dxa" w:w="3473"/>
+            <w:tcBorders>
+              <w:top w:val="single" w:color="BFC9D3" w:sz="4"/>
+              <w:left w:val="single" w:color="BFC9D3" w:sz="4"/>
+              <w:bottom w:val="single" w:color="BFC9D3" w:sz="4"/>
+              <w:right w:val="single" w:color="BFC9D3" w:sz="4"/>
+            </w:tcBorders>
+            <w:shd w:fill="EEF2F6" w:color="auto" w:val="clear"/>
+            <w:tcMar>
+              <w:top w:type="dxa" w:w="50"/>
+              <w:left w:type="dxa" w:w="90"/>
+              <w:bottom w:type="dxa" w:w="50"/>
+              <w:right w:type="dxa" w:w="90"/>
+            </w:tcMar>
+          </w:tcPr>
+          <w:p>
+            <w:pPr>
+              <w:jc w:val="center"/>
+            </w:pPr>
+            <w:r>
+              <w:rPr>
+                <w:rFonts w:ascii="Cambria" w:cs="Cambria" w:eastAsia="Cambria" w:hAnsi="Cambria"/>
+                <w:b/>
+                <w:bCs/>
+                <w:sz w:val="19"/>
+                <w:szCs w:val="19"/>
+              </w:rPr>
+              <w:t xml:space="preserve">+0.26 … +0.48</w:t>
             </w:r>
           </w:p>
         </w:tc>
@@ -4845,20 +4764,6 @@
       <w:pPr>
         <w:spacing w:after="120"/>
       </w:pPr>
-    </w:p>
-    <w:p>
-      <w:pPr>
-        <w:spacing w:after="120" w:before="0" w:line="276"/>
-        <w:jc w:val="both"/>
-      </w:pPr>
-      <w:r>
-        <w:rPr>
-          <w:rFonts w:ascii="Cambria" w:cs="Cambria" w:eastAsia="Cambria" w:hAnsi="Cambria"/>
-          <w:sz w:val="22"/>
-          <w:szCs w:val="22"/>
-        </w:rPr>
-        <w:t xml:space="preserve">No method recovers a slice 10 mm away from both neighbours (all near 20 dB): over 20 mm the heart changes shape. With raw z the field memorised the known slices (41 dB) and filled the gap with high-frequency noise (Figure 3); z × 0.25 removes the noise and makes the field level with interpolation on patient 051. On patient 015 the field is better on the crop and slightly worse in the heart.</w:t>
-      </w:r>
     </w:p>
     <w:p>
       <w:pPr>
@@ -4869,7 +4774,7 @@
       <w:r>
         <w:drawing>
           <wp:inline distT="0" distB="0" distL="0" distR="0">
-            <wp:extent cx="5760720" cy="3520440"/>
+            <wp:extent cx="5120640" cy="2987040"/>
             <wp:effectExtent t="0" r="0" b="0" l="0"/>
             <wp:docPr id="1" name="" descr="" title=""/>
             <wp:cNvGraphicFramePr>
@@ -4894,6 +4799,1408 @@
                   <pic:spPr bwMode="auto">
                     <a:xfrm>
                       <a:off x="0" y="0"/>
+                      <a:ext cx="5120640" cy="2987040"/>
+                    </a:xfrm>
+                    <a:prstGeom prst="rect">
+                      <a:avLst/>
+                    </a:prstGeom>
+                  </pic:spPr>
+                </pic:pic>
+              </a:graphicData>
+            </a:graphic>
+          </wp:inline>
+        </w:drawing>
+      </w:r>
+    </w:p>
+    <w:p>
+      <w:pPr>
+        <w:spacing w:after="200"/>
+        <w:jc w:val="both"/>
+      </w:pPr>
+      <w:r>
+        <w:rPr>
+          <w:rFonts w:ascii="Cambria" w:cs="Cambria" w:eastAsia="Cambria" w:hAnsi="Cambria"/>
+          <w:b/>
+          <w:bCs/>
+          <w:color w:val="183150"/>
+          <w:sz w:val="19"/>
+          <w:szCs w:val="19"/>
+        </w:rPr>
+        <w:t xml:space="preserve">Figure 5. </w:t>
+      </w:r>
+      <w:r>
+        <w:rPr>
+          <w:rFonts w:ascii="Cambria" w:cs="Cambria" w:eastAsia="Cambria" w:hAnsi="Cambria"/>
+          <w:color w:val="596B7B"/>
+          <w:sz w:val="19"/>
+          <w:szCs w:val="19"/>
+        </w:rPr>
+        <w:t xml:space="preserve">Each held-out patient: SIREN and the blend relative to linear interpolation.</w:t>
+      </w:r>
+    </w:p>
+    <w:p>
+      <w:pPr>
+        <w:spacing w:after="120" w:before="0" w:line="276"/>
+        <w:jc w:val="both"/>
+      </w:pPr>
+      <w:r>
+        <w:rPr>
+          <w:rFonts w:ascii="Cambria" w:cs="Cambria" w:eastAsia="Cambria" w:hAnsi="Cambria"/>
+          <w:sz w:val="22"/>
+          <w:szCs w:val="22"/>
+        </w:rPr>
+        <w:t xml:space="preserve">With all settings fixed on patient 051, the picture is the same on new hearts of three disease groups. SIREN beats ReLU on 14 of 14 patients (Wilcoxon p = 0.0001); alone it is behind interpolation on 13 of 14 (median −0.58 dB); the blend is better than interpolation on all 14 (median +0.35 dB, p = 0.0001). The absolute PSNR varies between patients (26–41 dB) much more than the differences between methods, which is why paired differences are reported.</w:t>
+      </w:r>
+    </w:p>
+    <w:p>
+      <w:pPr>
+        <w:pStyle w:val="Heading2"/>
+        <w:keepNext/>
+        <w:spacing w:after="80" w:before="180"/>
+      </w:pPr>
+      <w:r>
+        <w:rPr>
+          <w:rFonts w:ascii="Cambria" w:cs="Cambria" w:eastAsia="Cambria" w:hAnsi="Cambria"/>
+          <w:b/>
+          <w:bCs/>
+          <w:color w:val="296693"/>
+          <w:sz w:val="23"/>
+          <w:szCs w:val="23"/>
+        </w:rPr>
+        <w:t xml:space="preserve">5.4 Compression</w:t>
+      </w:r>
+    </w:p>
+    <w:p>
+      <w:pPr>
+        <w:spacing w:after="120" w:before="0" w:line="276"/>
+        <w:jc w:val="both"/>
+      </w:pPr>
+      <w:r>
+        <w:rPr>
+          <w:rFonts w:ascii="Cambria" w:cs="Cambria" w:eastAsia="Cambria" w:hAnsi="Cambria"/>
+          <w:sz w:val="22"/>
+          <w:szCs w:val="22"/>
+        </w:rPr>
+        <w:t xml:space="preserve">The field has 198,913 weights. The heart crop holds 104 × 104 × 10 × 30 = 3.24 million values (16× more; 8× in bytes, since voxels are 16-bit and weights 32-bit), the whole scan 17.2 million (86×; 43× in bytes). Fitting the whole scan with the same weights reaches the 86× midterm target at a cost of 1.4 dB in the heart compared with the crop (27.5 vs 28.9 dB). Interpolation is 29.2 dB but compresses nothing.</w:t>
+      </w:r>
+    </w:p>
+    <w:p>
+      <w:pPr>
+        <w:pStyle w:val="Heading2"/>
+        <w:keepNext/>
+        <w:spacing w:after="80" w:before="180"/>
+      </w:pPr>
+      <w:r>
+        <w:rPr>
+          <w:rFonts w:ascii="Cambria" w:cs="Cambria" w:eastAsia="Cambria" w:hAnsi="Cambria"/>
+          <w:b/>
+          <w:bCs/>
+          <w:color w:val="296693"/>
+          <w:sz w:val="23"/>
+          <w:szCs w:val="23"/>
+        </w:rPr>
+        <w:t xml:space="preserve">5.5 Hidden slices</w:t>
+      </w:r>
+    </w:p>
+    <w:p>
+      <w:pPr>
+        <w:keepNext/>
+        <w:spacing w:after="80" w:before="160"/>
+      </w:pPr>
+      <w:r>
+        <w:rPr>
+          <w:rFonts w:ascii="Cambria" w:cs="Cambria" w:eastAsia="Cambria" w:hAnsi="Cambria"/>
+          <w:b/>
+          <w:bCs/>
+          <w:color w:val="183150"/>
+          <w:sz w:val="19"/>
+          <w:szCs w:val="19"/>
+        </w:rPr>
+        <w:t xml:space="preserve">Table 4. Every second slice hidden (20 mm between known slices), ED frame.</w:t>
+      </w:r>
+    </w:p>
+    <w:tbl>
+      <w:tblPr>
+        <w:tblW w:type="dxa" w:w="9648"/>
+        <w:tblBorders>
+          <w:top w:val="single" w:color="auto" w:sz="4"/>
+          <w:left w:val="single" w:color="auto" w:sz="4"/>
+          <w:bottom w:val="single" w:color="auto" w:sz="4"/>
+          <w:right w:val="single" w:color="auto" w:sz="4"/>
+          <w:insideH w:val="single" w:color="auto" w:sz="4"/>
+          <w:insideV w:val="single" w:color="auto" w:sz="4"/>
+        </w:tblBorders>
+        <w:tblLayout w:type="fixed"/>
+      </w:tblPr>
+      <w:tblGrid>
+        <w:gridCol w:w="4438"/>
+        <w:gridCol w:w="1737"/>
+        <w:gridCol w:w="1737"/>
+        <w:gridCol w:w="1736"/>
+      </w:tblGrid>
+      <w:tr>
+        <w:trPr>
+          <w:cantSplit/>
+        </w:trPr>
+        <w:tc>
+          <w:tcPr>
+            <w:tcW w:type="dxa" w:w="4438"/>
+            <w:tcBorders>
+              <w:top w:val="single" w:color="BFC9D3" w:sz="4"/>
+              <w:left w:val="single" w:color="BFC9D3" w:sz="4"/>
+              <w:bottom w:val="single" w:color="BFC9D3" w:sz="4"/>
+              <w:right w:val="single" w:color="BFC9D3" w:sz="4"/>
+            </w:tcBorders>
+            <w:shd w:fill="183150" w:color="auto" w:val="clear"/>
+            <w:tcMar>
+              <w:top w:type="dxa" w:w="50"/>
+              <w:left w:type="dxa" w:w="90"/>
+              <w:bottom w:type="dxa" w:w="50"/>
+              <w:right w:type="dxa" w:w="90"/>
+            </w:tcMar>
+          </w:tcPr>
+          <w:p>
+            <w:pPr>
+              <w:jc w:val="left"/>
+            </w:pPr>
+            <w:r>
+              <w:rPr>
+                <w:rFonts w:ascii="Cambria" w:cs="Cambria" w:eastAsia="Cambria" w:hAnsi="Cambria"/>
+                <w:b/>
+                <w:bCs/>
+                <w:color w:val="FFFFFF"/>
+                <w:sz w:val="19"/>
+                <w:szCs w:val="19"/>
+              </w:rPr>
+              <w:t xml:space="preserve">Method</w:t>
+            </w:r>
+          </w:p>
+        </w:tc>
+        <w:tc>
+          <w:tcPr>
+            <w:tcW w:type="dxa" w:w="1737"/>
+            <w:tcBorders>
+              <w:top w:val="single" w:color="BFC9D3" w:sz="4"/>
+              <w:left w:val="single" w:color="BFC9D3" w:sz="4"/>
+              <w:bottom w:val="single" w:color="BFC9D3" w:sz="4"/>
+              <w:right w:val="single" w:color="BFC9D3" w:sz="4"/>
+            </w:tcBorders>
+            <w:shd w:fill="183150" w:color="auto" w:val="clear"/>
+            <w:tcMar>
+              <w:top w:type="dxa" w:w="50"/>
+              <w:left w:type="dxa" w:w="90"/>
+              <w:bottom w:type="dxa" w:w="50"/>
+              <w:right w:type="dxa" w:w="90"/>
+            </w:tcMar>
+          </w:tcPr>
+          <w:p>
+            <w:pPr>
+              <w:jc w:val="center"/>
+            </w:pPr>
+            <w:r>
+              <w:rPr>
+                <w:rFonts w:ascii="Cambria" w:cs="Cambria" w:eastAsia="Cambria" w:hAnsi="Cambria"/>
+                <w:b/>
+                <w:bCs/>
+                <w:color w:val="FFFFFF"/>
+                <w:sz w:val="19"/>
+                <w:szCs w:val="19"/>
+              </w:rPr>
+              <w:t xml:space="preserve">Heart PSNR</w:t>
+            </w:r>
+          </w:p>
+        </w:tc>
+        <w:tc>
+          <w:tcPr>
+            <w:tcW w:type="dxa" w:w="1737"/>
+            <w:tcBorders>
+              <w:top w:val="single" w:color="BFC9D3" w:sz="4"/>
+              <w:left w:val="single" w:color="BFC9D3" w:sz="4"/>
+              <w:bottom w:val="single" w:color="BFC9D3" w:sz="4"/>
+              <w:right w:val="single" w:color="BFC9D3" w:sz="4"/>
+            </w:tcBorders>
+            <w:shd w:fill="183150" w:color="auto" w:val="clear"/>
+            <w:tcMar>
+              <w:top w:type="dxa" w:w="50"/>
+              <w:left w:type="dxa" w:w="90"/>
+              <w:bottom w:type="dxa" w:w="50"/>
+              <w:right w:type="dxa" w:w="90"/>
+            </w:tcMar>
+          </w:tcPr>
+          <w:p>
+            <w:pPr>
+              <w:jc w:val="center"/>
+            </w:pPr>
+            <w:r>
+              <w:rPr>
+                <w:rFonts w:ascii="Cambria" w:cs="Cambria" w:eastAsia="Cambria" w:hAnsi="Cambria"/>
+                <w:b/>
+                <w:bCs/>
+                <w:color w:val="FFFFFF"/>
+                <w:sz w:val="19"/>
+                <w:szCs w:val="19"/>
+              </w:rPr>
+              <w:t xml:space="preserve">Crop PSNR</w:t>
+            </w:r>
+          </w:p>
+        </w:tc>
+        <w:tc>
+          <w:tcPr>
+            <w:tcW w:type="dxa" w:w="1736"/>
+            <w:tcBorders>
+              <w:top w:val="single" w:color="BFC9D3" w:sz="4"/>
+              <w:left w:val="single" w:color="BFC9D3" w:sz="4"/>
+              <w:bottom w:val="single" w:color="BFC9D3" w:sz="4"/>
+              <w:right w:val="single" w:color="BFC9D3" w:sz="4"/>
+            </w:tcBorders>
+            <w:shd w:fill="183150" w:color="auto" w:val="clear"/>
+            <w:tcMar>
+              <w:top w:type="dxa" w:w="50"/>
+              <w:left w:type="dxa" w:w="90"/>
+              <w:bottom w:type="dxa" w:w="50"/>
+              <w:right w:type="dxa" w:w="90"/>
+            </w:tcMar>
+          </w:tcPr>
+          <w:p>
+            <w:pPr>
+              <w:jc w:val="center"/>
+            </w:pPr>
+            <w:r>
+              <w:rPr>
+                <w:rFonts w:ascii="Cambria" w:cs="Cambria" w:eastAsia="Cambria" w:hAnsi="Cambria"/>
+                <w:b/>
+                <w:bCs/>
+                <w:color w:val="FFFFFF"/>
+                <w:sz w:val="19"/>
+                <w:szCs w:val="19"/>
+              </w:rPr>
+              <w:t xml:space="preserve">SSIM</w:t>
+            </w:r>
+          </w:p>
+        </w:tc>
+      </w:tr>
+      <w:tr>
+        <w:trPr>
+          <w:cantSplit/>
+        </w:trPr>
+        <w:tc>
+          <w:tcPr>
+            <w:tcW w:type="dxa" w:w="4438"/>
+            <w:tcBorders>
+              <w:top w:val="single" w:color="BFC9D3" w:sz="4"/>
+              <w:left w:val="single" w:color="BFC9D3" w:sz="4"/>
+              <w:bottom w:val="single" w:color="BFC9D3" w:sz="4"/>
+              <w:right w:val="single" w:color="BFC9D3" w:sz="4"/>
+            </w:tcBorders>
+            <w:tcMar>
+              <w:top w:type="dxa" w:w="50"/>
+              <w:left w:type="dxa" w:w="90"/>
+              <w:bottom w:type="dxa" w:w="50"/>
+              <w:right w:type="dxa" w:w="90"/>
+            </w:tcMar>
+          </w:tcPr>
+          <w:p>
+            <w:pPr>
+              <w:jc w:val="left"/>
+            </w:pPr>
+            <w:r>
+              <w:rPr>
+                <w:rFonts w:ascii="Cambria" w:cs="Cambria" w:eastAsia="Cambria" w:hAnsi="Cambria"/>
+                <w:b w:val="false"/>
+                <w:bCs w:val="false"/>
+                <w:sz w:val="19"/>
+                <w:szCs w:val="19"/>
+              </w:rPr>
+              <w:t xml:space="preserve">Patient 051 · linear interpolation</w:t>
+            </w:r>
+          </w:p>
+        </w:tc>
+        <w:tc>
+          <w:tcPr>
+            <w:tcW w:type="dxa" w:w="1737"/>
+            <w:tcBorders>
+              <w:top w:val="single" w:color="BFC9D3" w:sz="4"/>
+              <w:left w:val="single" w:color="BFC9D3" w:sz="4"/>
+              <w:bottom w:val="single" w:color="BFC9D3" w:sz="4"/>
+              <w:right w:val="single" w:color="BFC9D3" w:sz="4"/>
+            </w:tcBorders>
+            <w:tcMar>
+              <w:top w:type="dxa" w:w="50"/>
+              <w:left w:type="dxa" w:w="90"/>
+              <w:bottom w:type="dxa" w:w="50"/>
+              <w:right w:type="dxa" w:w="90"/>
+            </w:tcMar>
+          </w:tcPr>
+          <w:p>
+            <w:pPr>
+              <w:jc w:val="center"/>
+            </w:pPr>
+            <w:r>
+              <w:rPr>
+                <w:rFonts w:ascii="Cambria" w:cs="Cambria" w:eastAsia="Cambria" w:hAnsi="Cambria"/>
+                <w:b w:val="false"/>
+                <w:bCs w:val="false"/>
+                <w:sz w:val="19"/>
+                <w:szCs w:val="19"/>
+              </w:rPr>
+              <w:t xml:space="preserve">20.01</w:t>
+            </w:r>
+          </w:p>
+        </w:tc>
+        <w:tc>
+          <w:tcPr>
+            <w:tcW w:type="dxa" w:w="1737"/>
+            <w:tcBorders>
+              <w:top w:val="single" w:color="BFC9D3" w:sz="4"/>
+              <w:left w:val="single" w:color="BFC9D3" w:sz="4"/>
+              <w:bottom w:val="single" w:color="BFC9D3" w:sz="4"/>
+              <w:right w:val="single" w:color="BFC9D3" w:sz="4"/>
+            </w:tcBorders>
+            <w:tcMar>
+              <w:top w:type="dxa" w:w="50"/>
+              <w:left w:type="dxa" w:w="90"/>
+              <w:bottom w:type="dxa" w:w="50"/>
+              <w:right w:type="dxa" w:w="90"/>
+            </w:tcMar>
+          </w:tcPr>
+          <w:p>
+            <w:pPr>
+              <w:jc w:val="center"/>
+            </w:pPr>
+            <w:r>
+              <w:rPr>
+                <w:rFonts w:ascii="Cambria" w:cs="Cambria" w:eastAsia="Cambria" w:hAnsi="Cambria"/>
+                <w:b w:val="false"/>
+                <w:bCs w:val="false"/>
+                <w:sz w:val="19"/>
+                <w:szCs w:val="19"/>
+              </w:rPr>
+              <w:t xml:space="preserve">19.55</w:t>
+            </w:r>
+          </w:p>
+        </w:tc>
+        <w:tc>
+          <w:tcPr>
+            <w:tcW w:type="dxa" w:w="1736"/>
+            <w:tcBorders>
+              <w:top w:val="single" w:color="BFC9D3" w:sz="4"/>
+              <w:left w:val="single" w:color="BFC9D3" w:sz="4"/>
+              <w:bottom w:val="single" w:color="BFC9D3" w:sz="4"/>
+              <w:right w:val="single" w:color="BFC9D3" w:sz="4"/>
+            </w:tcBorders>
+            <w:tcMar>
+              <w:top w:type="dxa" w:w="50"/>
+              <w:left w:type="dxa" w:w="90"/>
+              <w:bottom w:type="dxa" w:w="50"/>
+              <w:right w:type="dxa" w:w="90"/>
+            </w:tcMar>
+          </w:tcPr>
+          <w:p>
+            <w:pPr>
+              <w:jc w:val="center"/>
+            </w:pPr>
+            <w:r>
+              <w:rPr>
+                <w:rFonts w:ascii="Cambria" w:cs="Cambria" w:eastAsia="Cambria" w:hAnsi="Cambria"/>
+                <w:b w:val="false"/>
+                <w:bCs w:val="false"/>
+                <w:sz w:val="19"/>
+                <w:szCs w:val="19"/>
+              </w:rPr>
+              <w:t xml:space="preserve">0.354</w:t>
+            </w:r>
+          </w:p>
+        </w:tc>
+      </w:tr>
+      <w:tr>
+        <w:trPr>
+          <w:cantSplit/>
+        </w:trPr>
+        <w:tc>
+          <w:tcPr>
+            <w:tcW w:type="dxa" w:w="4438"/>
+            <w:tcBorders>
+              <w:top w:val="single" w:color="BFC9D3" w:sz="4"/>
+              <w:left w:val="single" w:color="BFC9D3" w:sz="4"/>
+              <w:bottom w:val="single" w:color="BFC9D3" w:sz="4"/>
+              <w:right w:val="single" w:color="BFC9D3" w:sz="4"/>
+            </w:tcBorders>
+            <w:tcMar>
+              <w:top w:type="dxa" w:w="50"/>
+              <w:left w:type="dxa" w:w="90"/>
+              <w:bottom w:type="dxa" w:w="50"/>
+              <w:right w:type="dxa" w:w="90"/>
+            </w:tcMar>
+          </w:tcPr>
+          <w:p>
+            <w:pPr>
+              <w:jc w:val="left"/>
+            </w:pPr>
+            <w:r>
+              <w:rPr>
+                <w:rFonts w:ascii="Cambria" w:cs="Cambria" w:eastAsia="Cambria" w:hAnsi="Cambria"/>
+                <w:b w:val="false"/>
+                <w:bCs w:val="false"/>
+                <w:sz w:val="19"/>
+                <w:szCs w:val="19"/>
+              </w:rPr>
+              <w:t xml:space="preserve">Patient 051 · SIREN, raw z</w:t>
+            </w:r>
+          </w:p>
+        </w:tc>
+        <w:tc>
+          <w:tcPr>
+            <w:tcW w:type="dxa" w:w="1737"/>
+            <w:tcBorders>
+              <w:top w:val="single" w:color="BFC9D3" w:sz="4"/>
+              <w:left w:val="single" w:color="BFC9D3" w:sz="4"/>
+              <w:bottom w:val="single" w:color="BFC9D3" w:sz="4"/>
+              <w:right w:val="single" w:color="BFC9D3" w:sz="4"/>
+            </w:tcBorders>
+            <w:tcMar>
+              <w:top w:type="dxa" w:w="50"/>
+              <w:left w:type="dxa" w:w="90"/>
+              <w:bottom w:type="dxa" w:w="50"/>
+              <w:right w:type="dxa" w:w="90"/>
+            </w:tcMar>
+          </w:tcPr>
+          <w:p>
+            <w:pPr>
+              <w:jc w:val="center"/>
+            </w:pPr>
+            <w:r>
+              <w:rPr>
+                <w:rFonts w:ascii="Cambria" w:cs="Cambria" w:eastAsia="Cambria" w:hAnsi="Cambria"/>
+                <w:b w:val="false"/>
+                <w:bCs w:val="false"/>
+                <w:sz w:val="19"/>
+                <w:szCs w:val="19"/>
+              </w:rPr>
+              <w:t xml:space="preserve">19.95</w:t>
+            </w:r>
+          </w:p>
+        </w:tc>
+        <w:tc>
+          <w:tcPr>
+            <w:tcW w:type="dxa" w:w="1737"/>
+            <w:tcBorders>
+              <w:top w:val="single" w:color="BFC9D3" w:sz="4"/>
+              <w:left w:val="single" w:color="BFC9D3" w:sz="4"/>
+              <w:bottom w:val="single" w:color="BFC9D3" w:sz="4"/>
+              <w:right w:val="single" w:color="BFC9D3" w:sz="4"/>
+            </w:tcBorders>
+            <w:tcMar>
+              <w:top w:type="dxa" w:w="50"/>
+              <w:left w:type="dxa" w:w="90"/>
+              <w:bottom w:type="dxa" w:w="50"/>
+              <w:right w:type="dxa" w:w="90"/>
+            </w:tcMar>
+          </w:tcPr>
+          <w:p>
+            <w:pPr>
+              <w:jc w:val="center"/>
+            </w:pPr>
+            <w:r>
+              <w:rPr>
+                <w:rFonts w:ascii="Cambria" w:cs="Cambria" w:eastAsia="Cambria" w:hAnsi="Cambria"/>
+                <w:b w:val="false"/>
+                <w:bCs w:val="false"/>
+                <w:sz w:val="19"/>
+                <w:szCs w:val="19"/>
+              </w:rPr>
+              <w:t xml:space="preserve">19.72</w:t>
+            </w:r>
+          </w:p>
+        </w:tc>
+        <w:tc>
+          <w:tcPr>
+            <w:tcW w:type="dxa" w:w="1736"/>
+            <w:tcBorders>
+              <w:top w:val="single" w:color="BFC9D3" w:sz="4"/>
+              <w:left w:val="single" w:color="BFC9D3" w:sz="4"/>
+              <w:bottom w:val="single" w:color="BFC9D3" w:sz="4"/>
+              <w:right w:val="single" w:color="BFC9D3" w:sz="4"/>
+            </w:tcBorders>
+            <w:tcMar>
+              <w:top w:type="dxa" w:w="50"/>
+              <w:left w:type="dxa" w:w="90"/>
+              <w:bottom w:type="dxa" w:w="50"/>
+              <w:right w:type="dxa" w:w="90"/>
+            </w:tcMar>
+          </w:tcPr>
+          <w:p>
+            <w:pPr>
+              <w:jc w:val="center"/>
+            </w:pPr>
+            <w:r>
+              <w:rPr>
+                <w:rFonts w:ascii="Cambria" w:cs="Cambria" w:eastAsia="Cambria" w:hAnsi="Cambria"/>
+                <w:b w:val="false"/>
+                <w:bCs w:val="false"/>
+                <w:sz w:val="19"/>
+                <w:szCs w:val="19"/>
+              </w:rPr>
+              <w:t xml:space="preserve">0.340</w:t>
+            </w:r>
+          </w:p>
+        </w:tc>
+      </w:tr>
+      <w:tr>
+        <w:trPr>
+          <w:cantSplit/>
+        </w:trPr>
+        <w:tc>
+          <w:tcPr>
+            <w:tcW w:type="dxa" w:w="4438"/>
+            <w:tcBorders>
+              <w:top w:val="single" w:color="BFC9D3" w:sz="4"/>
+              <w:left w:val="single" w:color="BFC9D3" w:sz="4"/>
+              <w:bottom w:val="single" w:color="BFC9D3" w:sz="4"/>
+              <w:right w:val="single" w:color="BFC9D3" w:sz="4"/>
+            </w:tcBorders>
+            <w:tcMar>
+              <w:top w:type="dxa" w:w="50"/>
+              <w:left w:type="dxa" w:w="90"/>
+              <w:bottom w:type="dxa" w:w="50"/>
+              <w:right w:type="dxa" w:w="90"/>
+            </w:tcMar>
+          </w:tcPr>
+          <w:p>
+            <w:pPr>
+              <w:jc w:val="left"/>
+            </w:pPr>
+            <w:r>
+              <w:rPr>
+                <w:rFonts w:ascii="Cambria" w:cs="Cambria" w:eastAsia="Cambria" w:hAnsi="Cambria"/>
+                <w:b w:val="false"/>
+                <w:bCs w:val="false"/>
+                <w:sz w:val="19"/>
+                <w:szCs w:val="19"/>
+              </w:rPr>
+              <w:t xml:space="preserve">Patient 051 · SIREN, z × 0.5</w:t>
+            </w:r>
+          </w:p>
+        </w:tc>
+        <w:tc>
+          <w:tcPr>
+            <w:tcW w:type="dxa" w:w="1737"/>
+            <w:tcBorders>
+              <w:top w:val="single" w:color="BFC9D3" w:sz="4"/>
+              <w:left w:val="single" w:color="BFC9D3" w:sz="4"/>
+              <w:bottom w:val="single" w:color="BFC9D3" w:sz="4"/>
+              <w:right w:val="single" w:color="BFC9D3" w:sz="4"/>
+            </w:tcBorders>
+            <w:tcMar>
+              <w:top w:type="dxa" w:w="50"/>
+              <w:left w:type="dxa" w:w="90"/>
+              <w:bottom w:type="dxa" w:w="50"/>
+              <w:right w:type="dxa" w:w="90"/>
+            </w:tcMar>
+          </w:tcPr>
+          <w:p>
+            <w:pPr>
+              <w:jc w:val="center"/>
+            </w:pPr>
+            <w:r>
+              <w:rPr>
+                <w:rFonts w:ascii="Cambria" w:cs="Cambria" w:eastAsia="Cambria" w:hAnsi="Cambria"/>
+                <w:b w:val="false"/>
+                <w:bCs w:val="false"/>
+                <w:sz w:val="19"/>
+                <w:szCs w:val="19"/>
+              </w:rPr>
+              <w:t xml:space="preserve">19.87</w:t>
+            </w:r>
+          </w:p>
+        </w:tc>
+        <w:tc>
+          <w:tcPr>
+            <w:tcW w:type="dxa" w:w="1737"/>
+            <w:tcBorders>
+              <w:top w:val="single" w:color="BFC9D3" w:sz="4"/>
+              <w:left w:val="single" w:color="BFC9D3" w:sz="4"/>
+              <w:bottom w:val="single" w:color="BFC9D3" w:sz="4"/>
+              <w:right w:val="single" w:color="BFC9D3" w:sz="4"/>
+            </w:tcBorders>
+            <w:tcMar>
+              <w:top w:type="dxa" w:w="50"/>
+              <w:left w:type="dxa" w:w="90"/>
+              <w:bottom w:type="dxa" w:w="50"/>
+              <w:right w:type="dxa" w:w="90"/>
+            </w:tcMar>
+          </w:tcPr>
+          <w:p>
+            <w:pPr>
+              <w:jc w:val="center"/>
+            </w:pPr>
+            <w:r>
+              <w:rPr>
+                <w:rFonts w:ascii="Cambria" w:cs="Cambria" w:eastAsia="Cambria" w:hAnsi="Cambria"/>
+                <w:b w:val="false"/>
+                <w:bCs w:val="false"/>
+                <w:sz w:val="19"/>
+                <w:szCs w:val="19"/>
+              </w:rPr>
+              <w:t xml:space="preserve">19.85</w:t>
+            </w:r>
+          </w:p>
+        </w:tc>
+        <w:tc>
+          <w:tcPr>
+            <w:tcW w:type="dxa" w:w="1736"/>
+            <w:tcBorders>
+              <w:top w:val="single" w:color="BFC9D3" w:sz="4"/>
+              <w:left w:val="single" w:color="BFC9D3" w:sz="4"/>
+              <w:bottom w:val="single" w:color="BFC9D3" w:sz="4"/>
+              <w:right w:val="single" w:color="BFC9D3" w:sz="4"/>
+            </w:tcBorders>
+            <w:tcMar>
+              <w:top w:type="dxa" w:w="50"/>
+              <w:left w:type="dxa" w:w="90"/>
+              <w:bottom w:type="dxa" w:w="50"/>
+              <w:right w:type="dxa" w:w="90"/>
+            </w:tcMar>
+          </w:tcPr>
+          <w:p>
+            <w:pPr>
+              <w:jc w:val="center"/>
+            </w:pPr>
+            <w:r>
+              <w:rPr>
+                <w:rFonts w:ascii="Cambria" w:cs="Cambria" w:eastAsia="Cambria" w:hAnsi="Cambria"/>
+                <w:b w:val="false"/>
+                <w:bCs w:val="false"/>
+                <w:sz w:val="19"/>
+                <w:szCs w:val="19"/>
+              </w:rPr>
+              <w:t xml:space="preserve">0.378</w:t>
+            </w:r>
+          </w:p>
+        </w:tc>
+      </w:tr>
+      <w:tr>
+        <w:trPr>
+          <w:cantSplit/>
+        </w:trPr>
+        <w:tc>
+          <w:tcPr>
+            <w:tcW w:type="dxa" w:w="4438"/>
+            <w:tcBorders>
+              <w:top w:val="single" w:color="BFC9D3" w:sz="4"/>
+              <w:left w:val="single" w:color="BFC9D3" w:sz="4"/>
+              <w:bottom w:val="single" w:color="BFC9D3" w:sz="4"/>
+              <w:right w:val="single" w:color="BFC9D3" w:sz="4"/>
+            </w:tcBorders>
+            <w:shd w:fill="EEF2F6" w:color="auto" w:val="clear"/>
+            <w:tcMar>
+              <w:top w:type="dxa" w:w="50"/>
+              <w:left w:type="dxa" w:w="90"/>
+              <w:bottom w:type="dxa" w:w="50"/>
+              <w:right w:type="dxa" w:w="90"/>
+            </w:tcMar>
+          </w:tcPr>
+          <w:p>
+            <w:pPr>
+              <w:jc w:val="left"/>
+            </w:pPr>
+            <w:r>
+              <w:rPr>
+                <w:rFonts w:ascii="Cambria" w:cs="Cambria" w:eastAsia="Cambria" w:hAnsi="Cambria"/>
+                <w:b/>
+                <w:bCs/>
+                <w:sz w:val="19"/>
+                <w:szCs w:val="19"/>
+              </w:rPr>
+              <w:t xml:space="preserve">Patient 051 · SIREN, z × 0.25</w:t>
+            </w:r>
+          </w:p>
+        </w:tc>
+        <w:tc>
+          <w:tcPr>
+            <w:tcW w:type="dxa" w:w="1737"/>
+            <w:tcBorders>
+              <w:top w:val="single" w:color="BFC9D3" w:sz="4"/>
+              <w:left w:val="single" w:color="BFC9D3" w:sz="4"/>
+              <w:bottom w:val="single" w:color="BFC9D3" w:sz="4"/>
+              <w:right w:val="single" w:color="BFC9D3" w:sz="4"/>
+            </w:tcBorders>
+            <w:shd w:fill="EEF2F6" w:color="auto" w:val="clear"/>
+            <w:tcMar>
+              <w:top w:type="dxa" w:w="50"/>
+              <w:left w:type="dxa" w:w="90"/>
+              <w:bottom w:type="dxa" w:w="50"/>
+              <w:right w:type="dxa" w:w="90"/>
+            </w:tcMar>
+          </w:tcPr>
+          <w:p>
+            <w:pPr>
+              <w:jc w:val="center"/>
+            </w:pPr>
+            <w:r>
+              <w:rPr>
+                <w:rFonts w:ascii="Cambria" w:cs="Cambria" w:eastAsia="Cambria" w:hAnsi="Cambria"/>
+                <w:b/>
+                <w:bCs/>
+                <w:sz w:val="19"/>
+                <w:szCs w:val="19"/>
+              </w:rPr>
+              <w:t xml:space="preserve">20.09</w:t>
+            </w:r>
+          </w:p>
+        </w:tc>
+        <w:tc>
+          <w:tcPr>
+            <w:tcW w:type="dxa" w:w="1737"/>
+            <w:tcBorders>
+              <w:top w:val="single" w:color="BFC9D3" w:sz="4"/>
+              <w:left w:val="single" w:color="BFC9D3" w:sz="4"/>
+              <w:bottom w:val="single" w:color="BFC9D3" w:sz="4"/>
+              <w:right w:val="single" w:color="BFC9D3" w:sz="4"/>
+            </w:tcBorders>
+            <w:shd w:fill="EEF2F6" w:color="auto" w:val="clear"/>
+            <w:tcMar>
+              <w:top w:type="dxa" w:w="50"/>
+              <w:left w:type="dxa" w:w="90"/>
+              <w:bottom w:type="dxa" w:w="50"/>
+              <w:right w:type="dxa" w:w="90"/>
+            </w:tcMar>
+          </w:tcPr>
+          <w:p>
+            <w:pPr>
+              <w:jc w:val="center"/>
+            </w:pPr>
+            <w:r>
+              <w:rPr>
+                <w:rFonts w:ascii="Cambria" w:cs="Cambria" w:eastAsia="Cambria" w:hAnsi="Cambria"/>
+                <w:b/>
+                <w:bCs/>
+                <w:sz w:val="19"/>
+                <w:szCs w:val="19"/>
+              </w:rPr>
+              <w:t xml:space="preserve">19.79</w:t>
+            </w:r>
+          </w:p>
+        </w:tc>
+        <w:tc>
+          <w:tcPr>
+            <w:tcW w:type="dxa" w:w="1736"/>
+            <w:tcBorders>
+              <w:top w:val="single" w:color="BFC9D3" w:sz="4"/>
+              <w:left w:val="single" w:color="BFC9D3" w:sz="4"/>
+              <w:bottom w:val="single" w:color="BFC9D3" w:sz="4"/>
+              <w:right w:val="single" w:color="BFC9D3" w:sz="4"/>
+            </w:tcBorders>
+            <w:shd w:fill="EEF2F6" w:color="auto" w:val="clear"/>
+            <w:tcMar>
+              <w:top w:type="dxa" w:w="50"/>
+              <w:left w:type="dxa" w:w="90"/>
+              <w:bottom w:type="dxa" w:w="50"/>
+              <w:right w:type="dxa" w:w="90"/>
+            </w:tcMar>
+          </w:tcPr>
+          <w:p>
+            <w:pPr>
+              <w:jc w:val="center"/>
+            </w:pPr>
+            <w:r>
+              <w:rPr>
+                <w:rFonts w:ascii="Cambria" w:cs="Cambria" w:eastAsia="Cambria" w:hAnsi="Cambria"/>
+                <w:b/>
+                <w:bCs/>
+                <w:sz w:val="19"/>
+                <w:szCs w:val="19"/>
+              </w:rPr>
+              <w:t xml:space="preserve">0.362</w:t>
+            </w:r>
+          </w:p>
+        </w:tc>
+      </w:tr>
+      <w:tr>
+        <w:trPr>
+          <w:cantSplit/>
+        </w:trPr>
+        <w:tc>
+          <w:tcPr>
+            <w:tcW w:type="dxa" w:w="4438"/>
+            <w:tcBorders>
+              <w:top w:val="single" w:color="BFC9D3" w:sz="4"/>
+              <w:left w:val="single" w:color="BFC9D3" w:sz="4"/>
+              <w:bottom w:val="single" w:color="BFC9D3" w:sz="4"/>
+              <w:right w:val="single" w:color="BFC9D3" w:sz="4"/>
+            </w:tcBorders>
+            <w:tcMar>
+              <w:top w:type="dxa" w:w="50"/>
+              <w:left w:type="dxa" w:w="90"/>
+              <w:bottom w:type="dxa" w:w="50"/>
+              <w:right w:type="dxa" w:w="90"/>
+            </w:tcMar>
+          </w:tcPr>
+          <w:p>
+            <w:pPr>
+              <w:jc w:val="left"/>
+            </w:pPr>
+            <w:r>
+              <w:rPr>
+                <w:rFonts w:ascii="Cambria" w:cs="Cambria" w:eastAsia="Cambria" w:hAnsi="Cambria"/>
+                <w:b w:val="false"/>
+                <w:bCs w:val="false"/>
+                <w:sz w:val="19"/>
+                <w:szCs w:val="19"/>
+              </w:rPr>
+              <w:t xml:space="preserve">Patient 051 · ReLU, same size</w:t>
+            </w:r>
+          </w:p>
+        </w:tc>
+        <w:tc>
+          <w:tcPr>
+            <w:tcW w:type="dxa" w:w="1737"/>
+            <w:tcBorders>
+              <w:top w:val="single" w:color="BFC9D3" w:sz="4"/>
+              <w:left w:val="single" w:color="BFC9D3" w:sz="4"/>
+              <w:bottom w:val="single" w:color="BFC9D3" w:sz="4"/>
+              <w:right w:val="single" w:color="BFC9D3" w:sz="4"/>
+            </w:tcBorders>
+            <w:tcMar>
+              <w:top w:type="dxa" w:w="50"/>
+              <w:left w:type="dxa" w:w="90"/>
+              <w:bottom w:type="dxa" w:w="50"/>
+              <w:right w:type="dxa" w:w="90"/>
+            </w:tcMar>
+          </w:tcPr>
+          <w:p>
+            <w:pPr>
+              <w:jc w:val="center"/>
+            </w:pPr>
+            <w:r>
+              <w:rPr>
+                <w:rFonts w:ascii="Cambria" w:cs="Cambria" w:eastAsia="Cambria" w:hAnsi="Cambria"/>
+                <w:b w:val="false"/>
+                <w:bCs w:val="false"/>
+                <w:sz w:val="19"/>
+                <w:szCs w:val="19"/>
+              </w:rPr>
+              <w:t xml:space="preserve">18.83</w:t>
+            </w:r>
+          </w:p>
+        </w:tc>
+        <w:tc>
+          <w:tcPr>
+            <w:tcW w:type="dxa" w:w="1737"/>
+            <w:tcBorders>
+              <w:top w:val="single" w:color="BFC9D3" w:sz="4"/>
+              <w:left w:val="single" w:color="BFC9D3" w:sz="4"/>
+              <w:bottom w:val="single" w:color="BFC9D3" w:sz="4"/>
+              <w:right w:val="single" w:color="BFC9D3" w:sz="4"/>
+            </w:tcBorders>
+            <w:tcMar>
+              <w:top w:type="dxa" w:w="50"/>
+              <w:left w:type="dxa" w:w="90"/>
+              <w:bottom w:type="dxa" w:w="50"/>
+              <w:right w:type="dxa" w:w="90"/>
+            </w:tcMar>
+          </w:tcPr>
+          <w:p>
+            <w:pPr>
+              <w:jc w:val="center"/>
+            </w:pPr>
+            <w:r>
+              <w:rPr>
+                <w:rFonts w:ascii="Cambria" w:cs="Cambria" w:eastAsia="Cambria" w:hAnsi="Cambria"/>
+                <w:b w:val="false"/>
+                <w:bCs w:val="false"/>
+                <w:sz w:val="19"/>
+                <w:szCs w:val="19"/>
+              </w:rPr>
+              <w:t xml:space="preserve">19.67</w:t>
+            </w:r>
+          </w:p>
+        </w:tc>
+        <w:tc>
+          <w:tcPr>
+            <w:tcW w:type="dxa" w:w="1736"/>
+            <w:tcBorders>
+              <w:top w:val="single" w:color="BFC9D3" w:sz="4"/>
+              <w:left w:val="single" w:color="BFC9D3" w:sz="4"/>
+              <w:bottom w:val="single" w:color="BFC9D3" w:sz="4"/>
+              <w:right w:val="single" w:color="BFC9D3" w:sz="4"/>
+            </w:tcBorders>
+            <w:tcMar>
+              <w:top w:type="dxa" w:w="50"/>
+              <w:left w:type="dxa" w:w="90"/>
+              <w:bottom w:type="dxa" w:w="50"/>
+              <w:right w:type="dxa" w:w="90"/>
+            </w:tcMar>
+          </w:tcPr>
+          <w:p>
+            <w:pPr>
+              <w:jc w:val="center"/>
+            </w:pPr>
+            <w:r>
+              <w:rPr>
+                <w:rFonts w:ascii="Cambria" w:cs="Cambria" w:eastAsia="Cambria" w:hAnsi="Cambria"/>
+                <w:b w:val="false"/>
+                <w:bCs w:val="false"/>
+                <w:sz w:val="19"/>
+                <w:szCs w:val="19"/>
+              </w:rPr>
+              <w:t xml:space="preserve">0.373</w:t>
+            </w:r>
+          </w:p>
+        </w:tc>
+      </w:tr>
+      <w:tr>
+        <w:trPr>
+          <w:cantSplit/>
+        </w:trPr>
+        <w:tc>
+          <w:tcPr>
+            <w:tcW w:type="dxa" w:w="4438"/>
+            <w:tcBorders>
+              <w:top w:val="single" w:color="BFC9D3" w:sz="4"/>
+              <w:left w:val="single" w:color="BFC9D3" w:sz="4"/>
+              <w:bottom w:val="single" w:color="BFC9D3" w:sz="4"/>
+              <w:right w:val="single" w:color="BFC9D3" w:sz="4"/>
+            </w:tcBorders>
+            <w:tcMar>
+              <w:top w:type="dxa" w:w="50"/>
+              <w:left w:type="dxa" w:w="90"/>
+              <w:bottom w:type="dxa" w:w="50"/>
+              <w:right w:type="dxa" w:w="90"/>
+            </w:tcMar>
+          </w:tcPr>
+          <w:p>
+            <w:pPr>
+              <w:jc w:val="left"/>
+            </w:pPr>
+            <w:r>
+              <w:rPr>
+                <w:rFonts w:ascii="Cambria" w:cs="Cambria" w:eastAsia="Cambria" w:hAnsi="Cambria"/>
+                <w:b w:val="false"/>
+                <w:bCs w:val="false"/>
+                <w:sz w:val="19"/>
+                <w:szCs w:val="19"/>
+              </w:rPr>
+              <w:t xml:space="preserve">Patient 015 · linear interpolation</w:t>
+            </w:r>
+          </w:p>
+        </w:tc>
+        <w:tc>
+          <w:tcPr>
+            <w:tcW w:type="dxa" w:w="1737"/>
+            <w:tcBorders>
+              <w:top w:val="single" w:color="BFC9D3" w:sz="4"/>
+              <w:left w:val="single" w:color="BFC9D3" w:sz="4"/>
+              <w:bottom w:val="single" w:color="BFC9D3" w:sz="4"/>
+              <w:right w:val="single" w:color="BFC9D3" w:sz="4"/>
+            </w:tcBorders>
+            <w:tcMar>
+              <w:top w:type="dxa" w:w="50"/>
+              <w:left w:type="dxa" w:w="90"/>
+              <w:bottom w:type="dxa" w:w="50"/>
+              <w:right w:type="dxa" w:w="90"/>
+            </w:tcMar>
+          </w:tcPr>
+          <w:p>
+            <w:pPr>
+              <w:jc w:val="center"/>
+            </w:pPr>
+            <w:r>
+              <w:rPr>
+                <w:rFonts w:ascii="Cambria" w:cs="Cambria" w:eastAsia="Cambria" w:hAnsi="Cambria"/>
+                <w:b w:val="false"/>
+                <w:bCs w:val="false"/>
+                <w:sz w:val="19"/>
+                <w:szCs w:val="19"/>
+              </w:rPr>
+              <w:t xml:space="preserve">20.68</w:t>
+            </w:r>
+          </w:p>
+        </w:tc>
+        <w:tc>
+          <w:tcPr>
+            <w:tcW w:type="dxa" w:w="1737"/>
+            <w:tcBorders>
+              <w:top w:val="single" w:color="BFC9D3" w:sz="4"/>
+              <w:left w:val="single" w:color="BFC9D3" w:sz="4"/>
+              <w:bottom w:val="single" w:color="BFC9D3" w:sz="4"/>
+              <w:right w:val="single" w:color="BFC9D3" w:sz="4"/>
+            </w:tcBorders>
+            <w:tcMar>
+              <w:top w:type="dxa" w:w="50"/>
+              <w:left w:type="dxa" w:w="90"/>
+              <w:bottom w:type="dxa" w:w="50"/>
+              <w:right w:type="dxa" w:w="90"/>
+            </w:tcMar>
+          </w:tcPr>
+          <w:p>
+            <w:pPr>
+              <w:jc w:val="center"/>
+            </w:pPr>
+            <w:r>
+              <w:rPr>
+                <w:rFonts w:ascii="Cambria" w:cs="Cambria" w:eastAsia="Cambria" w:hAnsi="Cambria"/>
+                <w:b w:val="false"/>
+                <w:bCs w:val="false"/>
+                <w:sz w:val="19"/>
+                <w:szCs w:val="19"/>
+              </w:rPr>
+              <w:t xml:space="preserve">20.06</w:t>
+            </w:r>
+          </w:p>
+        </w:tc>
+        <w:tc>
+          <w:tcPr>
+            <w:tcW w:type="dxa" w:w="1736"/>
+            <w:tcBorders>
+              <w:top w:val="single" w:color="BFC9D3" w:sz="4"/>
+              <w:left w:val="single" w:color="BFC9D3" w:sz="4"/>
+              <w:bottom w:val="single" w:color="BFC9D3" w:sz="4"/>
+              <w:right w:val="single" w:color="BFC9D3" w:sz="4"/>
+            </w:tcBorders>
+            <w:tcMar>
+              <w:top w:type="dxa" w:w="50"/>
+              <w:left w:type="dxa" w:w="90"/>
+              <w:bottom w:type="dxa" w:w="50"/>
+              <w:right w:type="dxa" w:w="90"/>
+            </w:tcMar>
+          </w:tcPr>
+          <w:p>
+            <w:pPr>
+              <w:jc w:val="center"/>
+            </w:pPr>
+            <w:r>
+              <w:rPr>
+                <w:rFonts w:ascii="Cambria" w:cs="Cambria" w:eastAsia="Cambria" w:hAnsi="Cambria"/>
+                <w:b w:val="false"/>
+                <w:bCs w:val="false"/>
+                <w:sz w:val="19"/>
+                <w:szCs w:val="19"/>
+              </w:rPr>
+              <w:t xml:space="preserve">0.403</w:t>
+            </w:r>
+          </w:p>
+        </w:tc>
+      </w:tr>
+      <w:tr>
+        <w:trPr>
+          <w:cantSplit/>
+        </w:trPr>
+        <w:tc>
+          <w:tcPr>
+            <w:tcW w:type="dxa" w:w="4438"/>
+            <w:tcBorders>
+              <w:top w:val="single" w:color="BFC9D3" w:sz="4"/>
+              <w:left w:val="single" w:color="BFC9D3" w:sz="4"/>
+              <w:bottom w:val="single" w:color="BFC9D3" w:sz="4"/>
+              <w:right w:val="single" w:color="BFC9D3" w:sz="4"/>
+            </w:tcBorders>
+            <w:tcMar>
+              <w:top w:type="dxa" w:w="50"/>
+              <w:left w:type="dxa" w:w="90"/>
+              <w:bottom w:type="dxa" w:w="50"/>
+              <w:right w:type="dxa" w:w="90"/>
+            </w:tcMar>
+          </w:tcPr>
+          <w:p>
+            <w:pPr>
+              <w:jc w:val="left"/>
+            </w:pPr>
+            <w:r>
+              <w:rPr>
+                <w:rFonts w:ascii="Cambria" w:cs="Cambria" w:eastAsia="Cambria" w:hAnsi="Cambria"/>
+                <w:b w:val="false"/>
+                <w:bCs w:val="false"/>
+                <w:sz w:val="19"/>
+                <w:szCs w:val="19"/>
+              </w:rPr>
+              <w:t xml:space="preserve">Patient 015 · SIREN, z × 0.5</w:t>
+            </w:r>
+          </w:p>
+        </w:tc>
+        <w:tc>
+          <w:tcPr>
+            <w:tcW w:type="dxa" w:w="1737"/>
+            <w:tcBorders>
+              <w:top w:val="single" w:color="BFC9D3" w:sz="4"/>
+              <w:left w:val="single" w:color="BFC9D3" w:sz="4"/>
+              <w:bottom w:val="single" w:color="BFC9D3" w:sz="4"/>
+              <w:right w:val="single" w:color="BFC9D3" w:sz="4"/>
+            </w:tcBorders>
+            <w:tcMar>
+              <w:top w:type="dxa" w:w="50"/>
+              <w:left w:type="dxa" w:w="90"/>
+              <w:bottom w:type="dxa" w:w="50"/>
+              <w:right w:type="dxa" w:w="90"/>
+            </w:tcMar>
+          </w:tcPr>
+          <w:p>
+            <w:pPr>
+              <w:jc w:val="center"/>
+            </w:pPr>
+            <w:r>
+              <w:rPr>
+                <w:rFonts w:ascii="Cambria" w:cs="Cambria" w:eastAsia="Cambria" w:hAnsi="Cambria"/>
+                <w:b w:val="false"/>
+                <w:bCs w:val="false"/>
+                <w:sz w:val="19"/>
+                <w:szCs w:val="19"/>
+              </w:rPr>
+              <w:t xml:space="preserve">20.42</w:t>
+            </w:r>
+          </w:p>
+        </w:tc>
+        <w:tc>
+          <w:tcPr>
+            <w:tcW w:type="dxa" w:w="1737"/>
+            <w:tcBorders>
+              <w:top w:val="single" w:color="BFC9D3" w:sz="4"/>
+              <w:left w:val="single" w:color="BFC9D3" w:sz="4"/>
+              <w:bottom w:val="single" w:color="BFC9D3" w:sz="4"/>
+              <w:right w:val="single" w:color="BFC9D3" w:sz="4"/>
+            </w:tcBorders>
+            <w:tcMar>
+              <w:top w:type="dxa" w:w="50"/>
+              <w:left w:type="dxa" w:w="90"/>
+              <w:bottom w:type="dxa" w:w="50"/>
+              <w:right w:type="dxa" w:w="90"/>
+            </w:tcMar>
+          </w:tcPr>
+          <w:p>
+            <w:pPr>
+              <w:jc w:val="center"/>
+            </w:pPr>
+            <w:r>
+              <w:rPr>
+                <w:rFonts w:ascii="Cambria" w:cs="Cambria" w:eastAsia="Cambria" w:hAnsi="Cambria"/>
+                <w:b w:val="false"/>
+                <w:bCs w:val="false"/>
+                <w:sz w:val="19"/>
+                <w:szCs w:val="19"/>
+              </w:rPr>
+              <w:t xml:space="preserve">20.84</w:t>
+            </w:r>
+          </w:p>
+        </w:tc>
+        <w:tc>
+          <w:tcPr>
+            <w:tcW w:type="dxa" w:w="1736"/>
+            <w:tcBorders>
+              <w:top w:val="single" w:color="BFC9D3" w:sz="4"/>
+              <w:left w:val="single" w:color="BFC9D3" w:sz="4"/>
+              <w:bottom w:val="single" w:color="BFC9D3" w:sz="4"/>
+              <w:right w:val="single" w:color="BFC9D3" w:sz="4"/>
+            </w:tcBorders>
+            <w:tcMar>
+              <w:top w:type="dxa" w:w="50"/>
+              <w:left w:type="dxa" w:w="90"/>
+              <w:bottom w:type="dxa" w:w="50"/>
+              <w:right w:type="dxa" w:w="90"/>
+            </w:tcMar>
+          </w:tcPr>
+          <w:p>
+            <w:pPr>
+              <w:jc w:val="center"/>
+            </w:pPr>
+            <w:r>
+              <w:rPr>
+                <w:rFonts w:ascii="Cambria" w:cs="Cambria" w:eastAsia="Cambria" w:hAnsi="Cambria"/>
+                <w:b w:val="false"/>
+                <w:bCs w:val="false"/>
+                <w:sz w:val="19"/>
+                <w:szCs w:val="19"/>
+              </w:rPr>
+              <w:t xml:space="preserve">0.410</w:t>
+            </w:r>
+          </w:p>
+        </w:tc>
+      </w:tr>
+      <w:tr>
+        <w:trPr>
+          <w:cantSplit/>
+        </w:trPr>
+        <w:tc>
+          <w:tcPr>
+            <w:tcW w:type="dxa" w:w="4438"/>
+            <w:tcBorders>
+              <w:top w:val="single" w:color="BFC9D3" w:sz="4"/>
+              <w:left w:val="single" w:color="BFC9D3" w:sz="4"/>
+              <w:bottom w:val="single" w:color="BFC9D3" w:sz="4"/>
+              <w:right w:val="single" w:color="BFC9D3" w:sz="4"/>
+            </w:tcBorders>
+            <w:tcMar>
+              <w:top w:type="dxa" w:w="50"/>
+              <w:left w:type="dxa" w:w="90"/>
+              <w:bottom w:type="dxa" w:w="50"/>
+              <w:right w:type="dxa" w:w="90"/>
+            </w:tcMar>
+          </w:tcPr>
+          <w:p>
+            <w:pPr>
+              <w:jc w:val="left"/>
+            </w:pPr>
+            <w:r>
+              <w:rPr>
+                <w:rFonts w:ascii="Cambria" w:cs="Cambria" w:eastAsia="Cambria" w:hAnsi="Cambria"/>
+                <w:b w:val="false"/>
+                <w:bCs w:val="false"/>
+                <w:sz w:val="19"/>
+                <w:szCs w:val="19"/>
+              </w:rPr>
+              <w:t xml:space="preserve">Patient 015 · SIREN, z × 0.25</w:t>
+            </w:r>
+          </w:p>
+        </w:tc>
+        <w:tc>
+          <w:tcPr>
+            <w:tcW w:type="dxa" w:w="1737"/>
+            <w:tcBorders>
+              <w:top w:val="single" w:color="BFC9D3" w:sz="4"/>
+              <w:left w:val="single" w:color="BFC9D3" w:sz="4"/>
+              <w:bottom w:val="single" w:color="BFC9D3" w:sz="4"/>
+              <w:right w:val="single" w:color="BFC9D3" w:sz="4"/>
+            </w:tcBorders>
+            <w:tcMar>
+              <w:top w:type="dxa" w:w="50"/>
+              <w:left w:type="dxa" w:w="90"/>
+              <w:bottom w:type="dxa" w:w="50"/>
+              <w:right w:type="dxa" w:w="90"/>
+            </w:tcMar>
+          </w:tcPr>
+          <w:p>
+            <w:pPr>
+              <w:jc w:val="center"/>
+            </w:pPr>
+            <w:r>
+              <w:rPr>
+                <w:rFonts w:ascii="Cambria" w:cs="Cambria" w:eastAsia="Cambria" w:hAnsi="Cambria"/>
+                <w:b w:val="false"/>
+                <w:bCs w:val="false"/>
+                <w:sz w:val="19"/>
+                <w:szCs w:val="19"/>
+              </w:rPr>
+              <w:t xml:space="preserve">20.13</w:t>
+            </w:r>
+          </w:p>
+        </w:tc>
+        <w:tc>
+          <w:tcPr>
+            <w:tcW w:type="dxa" w:w="1737"/>
+            <w:tcBorders>
+              <w:top w:val="single" w:color="BFC9D3" w:sz="4"/>
+              <w:left w:val="single" w:color="BFC9D3" w:sz="4"/>
+              <w:bottom w:val="single" w:color="BFC9D3" w:sz="4"/>
+              <w:right w:val="single" w:color="BFC9D3" w:sz="4"/>
+            </w:tcBorders>
+            <w:tcMar>
+              <w:top w:type="dxa" w:w="50"/>
+              <w:left w:type="dxa" w:w="90"/>
+              <w:bottom w:type="dxa" w:w="50"/>
+              <w:right w:type="dxa" w:w="90"/>
+            </w:tcMar>
+          </w:tcPr>
+          <w:p>
+            <w:pPr>
+              <w:jc w:val="center"/>
+            </w:pPr>
+            <w:r>
+              <w:rPr>
+                <w:rFonts w:ascii="Cambria" w:cs="Cambria" w:eastAsia="Cambria" w:hAnsi="Cambria"/>
+                <w:b w:val="false"/>
+                <w:bCs w:val="false"/>
+                <w:sz w:val="19"/>
+                <w:szCs w:val="19"/>
+              </w:rPr>
+              <w:t xml:space="preserve">20.45</w:t>
+            </w:r>
+          </w:p>
+        </w:tc>
+        <w:tc>
+          <w:tcPr>
+            <w:tcW w:type="dxa" w:w="1736"/>
+            <w:tcBorders>
+              <w:top w:val="single" w:color="BFC9D3" w:sz="4"/>
+              <w:left w:val="single" w:color="BFC9D3" w:sz="4"/>
+              <w:bottom w:val="single" w:color="BFC9D3" w:sz="4"/>
+              <w:right w:val="single" w:color="BFC9D3" w:sz="4"/>
+            </w:tcBorders>
+            <w:tcMar>
+              <w:top w:type="dxa" w:w="50"/>
+              <w:left w:type="dxa" w:w="90"/>
+              <w:bottom w:type="dxa" w:w="50"/>
+              <w:right w:type="dxa" w:w="90"/>
+            </w:tcMar>
+          </w:tcPr>
+          <w:p>
+            <w:pPr>
+              <w:jc w:val="center"/>
+            </w:pPr>
+            <w:r>
+              <w:rPr>
+                <w:rFonts w:ascii="Cambria" w:cs="Cambria" w:eastAsia="Cambria" w:hAnsi="Cambria"/>
+                <w:b w:val="false"/>
+                <w:bCs w:val="false"/>
+                <w:sz w:val="19"/>
+                <w:szCs w:val="19"/>
+              </w:rPr>
+              <w:t xml:space="preserve">0.411</w:t>
+            </w:r>
+          </w:p>
+        </w:tc>
+      </w:tr>
+    </w:tbl>
+    <w:p>
+      <w:pPr>
+        <w:spacing w:after="120"/>
+      </w:pPr>
+    </w:p>
+    <w:p>
+      <w:pPr>
+        <w:spacing w:after="120" w:before="0" w:line="276"/>
+        <w:jc w:val="both"/>
+      </w:pPr>
+      <w:r>
+        <w:rPr>
+          <w:rFonts w:ascii="Cambria" w:cs="Cambria" w:eastAsia="Cambria" w:hAnsi="Cambria"/>
+          <w:sz w:val="22"/>
+          <w:szCs w:val="22"/>
+        </w:rPr>
+        <w:t xml:space="preserve">No method recovers a slice 10 mm away from both neighbours (all near 20 dB): over 20 mm the heart changes shape. With raw z the field memorised the known slices (41 dB) and filled the gap with high-frequency noise (Figure 3); z × 0.25 removes the noise and makes the field level with interpolation on patient 051. On patient 015 the field is better on the crop and slightly worse in the heart.</w:t>
+      </w:r>
+    </w:p>
+    <w:p>
+      <w:pPr>
+        <w:keepNext/>
+        <w:spacing w:after="60" w:before="120"/>
+        <w:jc w:val="center"/>
+      </w:pPr>
+      <w:r>
+        <w:drawing>
+          <wp:inline distT="0" distB="0" distL="0" distR="0">
+            <wp:extent cx="5760720" cy="3520440"/>
+            <wp:effectExtent t="0" r="0" b="0" l="0"/>
+            <wp:docPr id="1" name="" descr="" title=""/>
+            <wp:cNvGraphicFramePr>
+              <a:graphicFrameLocks xmlns:a="http://schemas.openxmlformats.org/drawingml/2006/main" noChangeAspect="1"/>
+            </wp:cNvGraphicFramePr>
+            <a:graphic xmlns:a="http://schemas.openxmlformats.org/drawingml/2006/main">
+              <a:graphicData uri="http://schemas.openxmlformats.org/drawingml/2006/picture">
+                <pic:pic xmlns:pic="http://schemas.openxmlformats.org/drawingml/2006/picture">
+                  <pic:nvPicPr>
+                    <pic:cNvPr id="0" name="" descr=""/>
+                    <pic:cNvPicPr>
+                      <a:picLocks noChangeAspect="1" noChangeArrowheads="1"/>
+                    </pic:cNvPicPr>
+                  </pic:nvPicPr>
+                  <pic:blipFill>
+                    <a:blip r:embed="rId12" cstate="none"/>
+                    <a:srcRect/>
+                    <a:stretch>
+                      <a:fillRect/>
+                    </a:stretch>
+                  </pic:blipFill>
+                  <pic:spPr bwMode="auto">
+                    <a:xfrm>
+                      <a:off x="0" y="0"/>
                       <a:ext cx="5760720" cy="3520440"/>
                     </a:xfrm>
                     <a:prstGeom prst="rect">
@@ -4948,7 +6255,7 @@
           <w:sz w:val="23"/>
           <w:szCs w:val="23"/>
         </w:rPr>
-        <w:t xml:space="preserve">5.5 The 4D heart and its clinical check</w:t>
+        <w:t xml:space="preserve">5.6 The 4D heart and its clinical check</w:t>
       </w:r>
     </w:p>
     <w:p>
@@ -4965,7 +6272,7 @@
           <w:sz w:val="19"/>
           <w:szCs w:val="19"/>
         </w:rPr>
-        <w:t xml:space="preserve">Table 4. Volumes (ml) and ejection fraction, patient 051.</w:t>
+        <w:t xml:space="preserve">Table 5. Volumes (ml) and ejection fraction at the ED and ES frames, patient 051.</w:t>
       </w:r>
     </w:p>
     <w:tbl>
@@ -5265,7 +6572,7 @@
                 <w:sz w:val="19"/>
                 <w:szCs w:val="19"/>
               </w:rPr>
-              <w:t xml:space="preserve">Expert labels (ED, ES)</w:t>
+              <w:t xml:space="preserve">Expert labels</w:t>
             </w:r>
           </w:p>
         </w:tc>
@@ -5361,7 +6668,7 @@
                 <w:sz w:val="19"/>
                 <w:szCs w:val="19"/>
               </w:rPr>
-              <w:t xml:space="preserve">44 %</w:t>
+              <w:t xml:space="preserve">43.6 %</w:t>
             </w:r>
           </w:p>
         </w:tc>
@@ -5457,7 +6764,7 @@
                 <w:sz w:val="19"/>
                 <w:szCs w:val="19"/>
               </w:rPr>
-              <w:t xml:space="preserve">53 %</w:t>
+              <w:t xml:space="preserve">52.9 %</w:t>
             </w:r>
           </w:p>
         </w:tc>
@@ -5494,7 +6801,7 @@
                 <w:sz w:val="19"/>
                 <w:szCs w:val="19"/>
               </w:rPr>
-              <w:t xml:space="preserve">Our method on scanner slices</w:t>
+              <w:t xml:space="preserve">Threshold on scanner slices</w:t>
             </w:r>
           </w:p>
         </w:tc>
@@ -5526,7 +6833,7 @@
                 <w:sz w:val="19"/>
                 <w:szCs w:val="19"/>
               </w:rPr>
-              <w:t xml:space="preserve">176</w:t>
+              <w:t xml:space="preserve">172</w:t>
             </w:r>
           </w:p>
         </w:tc>
@@ -5558,7 +6865,7 @@
                 <w:sz w:val="19"/>
                 <w:szCs w:val="19"/>
               </w:rPr>
-              <w:t xml:space="preserve">93</w:t>
+              <w:t xml:space="preserve">98</w:t>
             </w:r>
           </w:p>
         </w:tc>
@@ -5590,7 +6897,7 @@
                 <w:sz w:val="19"/>
                 <w:szCs w:val="19"/>
               </w:rPr>
-              <w:t xml:space="preserve">47 %</w:t>
+              <w:t xml:space="preserve">43.2 %</w:t>
             </w:r>
           </w:p>
         </w:tc>
@@ -5622,7 +6929,7 @@
                 <w:sz w:val="19"/>
                 <w:szCs w:val="19"/>
               </w:rPr>
-              <w:t xml:space="preserve">129</w:t>
+              <w:t xml:space="preserve">113</w:t>
             </w:r>
           </w:p>
         </w:tc>
@@ -5654,7 +6961,7 @@
                 <w:sz w:val="19"/>
                 <w:szCs w:val="19"/>
               </w:rPr>
-              <w:t xml:space="preserve">61</w:t>
+              <w:t xml:space="preserve">70</w:t>
             </w:r>
           </w:p>
         </w:tc>
@@ -5686,7 +6993,7 @@
                 <w:sz w:val="19"/>
                 <w:szCs w:val="19"/>
               </w:rPr>
-              <w:t xml:space="preserve">53 %</w:t>
+              <w:t xml:space="preserve">37.7 %</w:t>
             </w:r>
           </w:p>
         </w:tc>
@@ -5724,7 +7031,7 @@
                 <w:sz w:val="19"/>
                 <w:szCs w:val="19"/>
               </w:rPr>
-              <w:t xml:space="preserve">Our method on the neural field</w:t>
+              <w:t xml:space="preserve">Threshold on the neural field</w:t>
             </w:r>
           </w:p>
         </w:tc>
@@ -5757,7 +7064,7 @@
                 <w:sz w:val="19"/>
                 <w:szCs w:val="19"/>
               </w:rPr>
-              <w:t xml:space="preserve">179</w:t>
+              <w:t xml:space="preserve">173</w:t>
             </w:r>
           </w:p>
         </w:tc>
@@ -5790,7 +7097,7 @@
                 <w:sz w:val="19"/>
                 <w:szCs w:val="19"/>
               </w:rPr>
-              <w:t xml:space="preserve">92</w:t>
+              <w:t xml:space="preserve">99</w:t>
             </w:r>
           </w:p>
         </w:tc>
@@ -5823,7 +7130,7 @@
                 <w:sz w:val="19"/>
                 <w:szCs w:val="19"/>
               </w:rPr>
-              <w:t xml:space="preserve">49 %</w:t>
+              <w:t xml:space="preserve">42.7 %</w:t>
             </w:r>
           </w:p>
         </w:tc>
@@ -5856,7 +7163,7 @@
                 <w:sz w:val="19"/>
                 <w:szCs w:val="19"/>
               </w:rPr>
-              <w:t xml:space="preserve">125</w:t>
+              <w:t xml:space="preserve">112</w:t>
             </w:r>
           </w:p>
         </w:tc>
@@ -5889,7 +7196,7 @@
                 <w:sz w:val="19"/>
                 <w:szCs w:val="19"/>
               </w:rPr>
-              <w:t xml:space="preserve">62</w:t>
+              <w:t xml:space="preserve">72</w:t>
             </w:r>
           </w:p>
         </w:tc>
@@ -5922,7 +7229,1215 @@
                 <w:sz w:val="19"/>
                 <w:szCs w:val="19"/>
               </w:rPr>
-              <w:t xml:space="preserve">51 %</w:t>
+              <w:t xml:space="preserve">35.7 %</w:t>
+            </w:r>
+          </w:p>
+        </w:tc>
+      </w:tr>
+    </w:tbl>
+    <w:p>
+      <w:pPr>
+        <w:keepNext/>
+        <w:spacing w:after="80" w:before="160"/>
+      </w:pPr>
+      <w:r>
+        <w:rPr>
+          <w:rFonts w:ascii="Cambria" w:cs="Cambria" w:eastAsia="Cambria" w:hAnsi="Cambria"/>
+          <w:b/>
+          <w:bCs/>
+          <w:color w:val="183150"/>
+          <w:sz w:val="19"/>
+          <w:szCs w:val="19"/>
+        </w:rPr>
+        <w:t xml:space="preserve">Table 6. Agreement with the expert outlines on the scanner slices (voxel 1.64 × 1.64 × 10 mm).</w:t>
+      </w:r>
+    </w:p>
+    <w:tbl>
+      <w:tblPr>
+        <w:tblW w:type="dxa" w:w="9648"/>
+        <w:tblBorders>
+          <w:top w:val="single" w:color="auto" w:sz="4"/>
+          <w:left w:val="single" w:color="auto" w:sz="4"/>
+          <w:bottom w:val="single" w:color="auto" w:sz="4"/>
+          <w:right w:val="single" w:color="auto" w:sz="4"/>
+          <w:insideH w:val="single" w:color="auto" w:sz="4"/>
+          <w:insideV w:val="single" w:color="auto" w:sz="4"/>
+        </w:tblBorders>
+        <w:tblLayout w:type="fixed"/>
+      </w:tblPr>
+      <w:tblGrid>
+        <w:gridCol w:w="3859"/>
+        <w:gridCol w:w="1447"/>
+        <w:gridCol w:w="1447"/>
+        <w:gridCol w:w="1447"/>
+        <w:gridCol w:w="1448"/>
+      </w:tblGrid>
+      <w:tr>
+        <w:trPr>
+          <w:cantSplit/>
+        </w:trPr>
+        <w:tc>
+          <w:tcPr>
+            <w:tcW w:type="dxa" w:w="3859"/>
+            <w:tcBorders>
+              <w:top w:val="single" w:color="BFC9D3" w:sz="4"/>
+              <w:left w:val="single" w:color="BFC9D3" w:sz="4"/>
+              <w:bottom w:val="single" w:color="BFC9D3" w:sz="4"/>
+              <w:right w:val="single" w:color="BFC9D3" w:sz="4"/>
+            </w:tcBorders>
+            <w:shd w:fill="183150" w:color="auto" w:val="clear"/>
+            <w:tcMar>
+              <w:top w:type="dxa" w:w="50"/>
+              <w:left w:type="dxa" w:w="90"/>
+              <w:bottom w:type="dxa" w:w="50"/>
+              <w:right w:type="dxa" w:w="90"/>
+            </w:tcMar>
+          </w:tcPr>
+          <w:p>
+            <w:pPr>
+              <w:jc w:val="left"/>
+            </w:pPr>
+            <w:r>
+              <w:rPr>
+                <w:rFonts w:ascii="Cambria" w:cs="Cambria" w:eastAsia="Cambria" w:hAnsi="Cambria"/>
+                <w:b/>
+                <w:bCs/>
+                <w:color w:val="FFFFFF"/>
+                <w:sz w:val="19"/>
+                <w:szCs w:val="19"/>
+              </w:rPr>
+              <w:t xml:space="preserve">Segmentation</w:t>
+            </w:r>
+          </w:p>
+        </w:tc>
+        <w:tc>
+          <w:tcPr>
+            <w:tcW w:type="dxa" w:w="1447"/>
+            <w:tcBorders>
+              <w:top w:val="single" w:color="BFC9D3" w:sz="4"/>
+              <w:left w:val="single" w:color="BFC9D3" w:sz="4"/>
+              <w:bottom w:val="single" w:color="BFC9D3" w:sz="4"/>
+              <w:right w:val="single" w:color="BFC9D3" w:sz="4"/>
+            </w:tcBorders>
+            <w:shd w:fill="183150" w:color="auto" w:val="clear"/>
+            <w:tcMar>
+              <w:top w:type="dxa" w:w="50"/>
+              <w:left w:type="dxa" w:w="90"/>
+              <w:bottom w:type="dxa" w:w="50"/>
+              <w:right w:type="dxa" w:w="90"/>
+            </w:tcMar>
+          </w:tcPr>
+          <w:p>
+            <w:pPr>
+              <w:jc w:val="center"/>
+            </w:pPr>
+            <w:r>
+              <w:rPr>
+                <w:rFonts w:ascii="Cambria" w:cs="Cambria" w:eastAsia="Cambria" w:hAnsi="Cambria"/>
+                <w:b/>
+                <w:bCs/>
+                <w:color w:val="FFFFFF"/>
+                <w:sz w:val="19"/>
+                <w:szCs w:val="19"/>
+              </w:rPr>
+              <w:t xml:space="preserve">Dice</w:t>
+            </w:r>
+          </w:p>
+        </w:tc>
+        <w:tc>
+          <w:tcPr>
+            <w:tcW w:type="dxa" w:w="1447"/>
+            <w:tcBorders>
+              <w:top w:val="single" w:color="BFC9D3" w:sz="4"/>
+              <w:left w:val="single" w:color="BFC9D3" w:sz="4"/>
+              <w:bottom w:val="single" w:color="BFC9D3" w:sz="4"/>
+              <w:right w:val="single" w:color="BFC9D3" w:sz="4"/>
+            </w:tcBorders>
+            <w:shd w:fill="183150" w:color="auto" w:val="clear"/>
+            <w:tcMar>
+              <w:top w:type="dxa" w:w="50"/>
+              <w:left w:type="dxa" w:w="90"/>
+              <w:bottom w:type="dxa" w:w="50"/>
+              <w:right w:type="dxa" w:w="90"/>
+            </w:tcMar>
+          </w:tcPr>
+          <w:p>
+            <w:pPr>
+              <w:jc w:val="center"/>
+            </w:pPr>
+            <w:r>
+              <w:rPr>
+                <w:rFonts w:ascii="Cambria" w:cs="Cambria" w:eastAsia="Cambria" w:hAnsi="Cambria"/>
+                <w:b/>
+                <w:bCs/>
+                <w:color w:val="FFFFFF"/>
+                <w:sz w:val="19"/>
+                <w:szCs w:val="19"/>
+              </w:rPr>
+              <w:t xml:space="preserve">HD95, mm</w:t>
+            </w:r>
+          </w:p>
+        </w:tc>
+        <w:tc>
+          <w:tcPr>
+            <w:tcW w:type="dxa" w:w="1447"/>
+            <w:tcBorders>
+              <w:top w:val="single" w:color="BFC9D3" w:sz="4"/>
+              <w:left w:val="single" w:color="BFC9D3" w:sz="4"/>
+              <w:bottom w:val="single" w:color="BFC9D3" w:sz="4"/>
+              <w:right w:val="single" w:color="BFC9D3" w:sz="4"/>
+            </w:tcBorders>
+            <w:shd w:fill="183150" w:color="auto" w:val="clear"/>
+            <w:tcMar>
+              <w:top w:type="dxa" w:w="50"/>
+              <w:left w:type="dxa" w:w="90"/>
+              <w:bottom w:type="dxa" w:w="50"/>
+              <w:right w:type="dxa" w:w="90"/>
+            </w:tcMar>
+          </w:tcPr>
+          <w:p>
+            <w:pPr>
+              <w:jc w:val="center"/>
+            </w:pPr>
+            <w:r>
+              <w:rPr>
+                <w:rFonts w:ascii="Cambria" w:cs="Cambria" w:eastAsia="Cambria" w:hAnsi="Cambria"/>
+                <w:b/>
+                <w:bCs/>
+                <w:color w:val="FFFFFF"/>
+                <w:sz w:val="19"/>
+                <w:szCs w:val="19"/>
+              </w:rPr>
+              <w:t xml:space="preserve">ASSD, mm</w:t>
+            </w:r>
+          </w:p>
+        </w:tc>
+        <w:tc>
+          <w:tcPr>
+            <w:tcW w:type="dxa" w:w="1448"/>
+            <w:tcBorders>
+              <w:top w:val="single" w:color="BFC9D3" w:sz="4"/>
+              <w:left w:val="single" w:color="BFC9D3" w:sz="4"/>
+              <w:bottom w:val="single" w:color="BFC9D3" w:sz="4"/>
+              <w:right w:val="single" w:color="BFC9D3" w:sz="4"/>
+            </w:tcBorders>
+            <w:shd w:fill="183150" w:color="auto" w:val="clear"/>
+            <w:tcMar>
+              <w:top w:type="dxa" w:w="50"/>
+              <w:left w:type="dxa" w:w="90"/>
+              <w:bottom w:type="dxa" w:w="50"/>
+              <w:right w:type="dxa" w:w="90"/>
+            </w:tcMar>
+          </w:tcPr>
+          <w:p>
+            <w:pPr>
+              <w:jc w:val="center"/>
+            </w:pPr>
+            <w:r>
+              <w:rPr>
+                <w:rFonts w:ascii="Cambria" w:cs="Cambria" w:eastAsia="Cambria" w:hAnsi="Cambria"/>
+                <w:b/>
+                <w:bCs/>
+                <w:color w:val="FFFFFF"/>
+                <w:sz w:val="19"/>
+                <w:szCs w:val="19"/>
+              </w:rPr>
+              <w:t xml:space="preserve">HD, mm</w:t>
+            </w:r>
+          </w:p>
+        </w:tc>
+      </w:tr>
+      <w:tr>
+        <w:trPr>
+          <w:cantSplit/>
+        </w:trPr>
+        <w:tc>
+          <w:tcPr>
+            <w:tcW w:type="dxa" w:w="3859"/>
+            <w:tcBorders>
+              <w:top w:val="single" w:color="BFC9D3" w:sz="4"/>
+              <w:left w:val="single" w:color="BFC9D3" w:sz="4"/>
+              <w:bottom w:val="single" w:color="BFC9D3" w:sz="4"/>
+              <w:right w:val="single" w:color="BFC9D3" w:sz="4"/>
+            </w:tcBorders>
+            <w:tcMar>
+              <w:top w:type="dxa" w:w="50"/>
+              <w:left w:type="dxa" w:w="90"/>
+              <w:bottom w:type="dxa" w:w="50"/>
+              <w:right w:type="dxa" w:w="90"/>
+            </w:tcMar>
+          </w:tcPr>
+          <w:p>
+            <w:pPr>
+              <w:jc w:val="left"/>
+            </w:pPr>
+            <w:r>
+              <w:rPr>
+                <w:rFonts w:ascii="Cambria" w:cs="Cambria" w:eastAsia="Cambria" w:hAnsi="Cambria"/>
+                <w:b w:val="false"/>
+                <w:bCs w:val="false"/>
+                <w:sz w:val="19"/>
+                <w:szCs w:val="19"/>
+              </w:rPr>
+              <w:t xml:space="preserve">Patient 051 · LV, ED · threshold on scanner</w:t>
+            </w:r>
+          </w:p>
+        </w:tc>
+        <w:tc>
+          <w:tcPr>
+            <w:tcW w:type="dxa" w:w="1447"/>
+            <w:tcBorders>
+              <w:top w:val="single" w:color="BFC9D3" w:sz="4"/>
+              <w:left w:val="single" w:color="BFC9D3" w:sz="4"/>
+              <w:bottom w:val="single" w:color="BFC9D3" w:sz="4"/>
+              <w:right w:val="single" w:color="BFC9D3" w:sz="4"/>
+            </w:tcBorders>
+            <w:tcMar>
+              <w:top w:type="dxa" w:w="50"/>
+              <w:left w:type="dxa" w:w="90"/>
+              <w:bottom w:type="dxa" w:w="50"/>
+              <w:right w:type="dxa" w:w="90"/>
+            </w:tcMar>
+          </w:tcPr>
+          <w:p>
+            <w:pPr>
+              <w:jc w:val="center"/>
+            </w:pPr>
+            <w:r>
+              <w:rPr>
+                <w:rFonts w:ascii="Cambria" w:cs="Cambria" w:eastAsia="Cambria" w:hAnsi="Cambria"/>
+                <w:b w:val="false"/>
+                <w:bCs w:val="false"/>
+                <w:sz w:val="19"/>
+                <w:szCs w:val="19"/>
+              </w:rPr>
+              <w:t xml:space="preserve">0.891</w:t>
+            </w:r>
+          </w:p>
+        </w:tc>
+        <w:tc>
+          <w:tcPr>
+            <w:tcW w:type="dxa" w:w="1447"/>
+            <w:tcBorders>
+              <w:top w:val="single" w:color="BFC9D3" w:sz="4"/>
+              <w:left w:val="single" w:color="BFC9D3" w:sz="4"/>
+              <w:bottom w:val="single" w:color="BFC9D3" w:sz="4"/>
+              <w:right w:val="single" w:color="BFC9D3" w:sz="4"/>
+            </w:tcBorders>
+            <w:tcMar>
+              <w:top w:type="dxa" w:w="50"/>
+              <w:left w:type="dxa" w:w="90"/>
+              <w:bottom w:type="dxa" w:w="50"/>
+              <w:right w:type="dxa" w:w="90"/>
+            </w:tcMar>
+          </w:tcPr>
+          <w:p>
+            <w:pPr>
+              <w:jc w:val="center"/>
+            </w:pPr>
+            <w:r>
+              <w:rPr>
+                <w:rFonts w:ascii="Cambria" w:cs="Cambria" w:eastAsia="Cambria" w:hAnsi="Cambria"/>
+                <w:b w:val="false"/>
+                <w:bCs w:val="false"/>
+                <w:sz w:val="19"/>
+                <w:szCs w:val="19"/>
+              </w:rPr>
+              <w:t xml:space="preserve">5.9</w:t>
+            </w:r>
+          </w:p>
+        </w:tc>
+        <w:tc>
+          <w:tcPr>
+            <w:tcW w:type="dxa" w:w="1447"/>
+            <w:tcBorders>
+              <w:top w:val="single" w:color="BFC9D3" w:sz="4"/>
+              <w:left w:val="single" w:color="BFC9D3" w:sz="4"/>
+              <w:bottom w:val="single" w:color="BFC9D3" w:sz="4"/>
+              <w:right w:val="single" w:color="BFC9D3" w:sz="4"/>
+            </w:tcBorders>
+            <w:tcMar>
+              <w:top w:type="dxa" w:w="50"/>
+              <w:left w:type="dxa" w:w="90"/>
+              <w:bottom w:type="dxa" w:w="50"/>
+              <w:right w:type="dxa" w:w="90"/>
+            </w:tcMar>
+          </w:tcPr>
+          <w:p>
+            <w:pPr>
+              <w:jc w:val="center"/>
+            </w:pPr>
+            <w:r>
+              <w:rPr>
+                <w:rFonts w:ascii="Cambria" w:cs="Cambria" w:eastAsia="Cambria" w:hAnsi="Cambria"/>
+                <w:b w:val="false"/>
+                <w:bCs w:val="false"/>
+                <w:sz w:val="19"/>
+                <w:szCs w:val="19"/>
+              </w:rPr>
+              <w:t xml:space="preserve">1.28</w:t>
+            </w:r>
+          </w:p>
+        </w:tc>
+        <w:tc>
+          <w:tcPr>
+            <w:tcW w:type="dxa" w:w="1448"/>
+            <w:tcBorders>
+              <w:top w:val="single" w:color="BFC9D3" w:sz="4"/>
+              <w:left w:val="single" w:color="BFC9D3" w:sz="4"/>
+              <w:bottom w:val="single" w:color="BFC9D3" w:sz="4"/>
+              <w:right w:val="single" w:color="BFC9D3" w:sz="4"/>
+            </w:tcBorders>
+            <w:tcMar>
+              <w:top w:type="dxa" w:w="50"/>
+              <w:left w:type="dxa" w:w="90"/>
+              <w:bottom w:type="dxa" w:w="50"/>
+              <w:right w:type="dxa" w:w="90"/>
+            </w:tcMar>
+          </w:tcPr>
+          <w:p>
+            <w:pPr>
+              <w:jc w:val="center"/>
+            </w:pPr>
+            <w:r>
+              <w:rPr>
+                <w:rFonts w:ascii="Cambria" w:cs="Cambria" w:eastAsia="Cambria" w:hAnsi="Cambria"/>
+                <w:b w:val="false"/>
+                <w:bCs w:val="false"/>
+                <w:sz w:val="19"/>
+                <w:szCs w:val="19"/>
+              </w:rPr>
+              <w:t xml:space="preserve">19.2</w:t>
+            </w:r>
+          </w:p>
+        </w:tc>
+      </w:tr>
+      <w:tr>
+        <w:trPr>
+          <w:cantSplit/>
+        </w:trPr>
+        <w:tc>
+          <w:tcPr>
+            <w:tcW w:type="dxa" w:w="3859"/>
+            <w:tcBorders>
+              <w:top w:val="single" w:color="BFC9D3" w:sz="4"/>
+              <w:left w:val="single" w:color="BFC9D3" w:sz="4"/>
+              <w:bottom w:val="single" w:color="BFC9D3" w:sz="4"/>
+              <w:right w:val="single" w:color="BFC9D3" w:sz="4"/>
+            </w:tcBorders>
+            <w:shd w:fill="EEF2F6" w:color="auto" w:val="clear"/>
+            <w:tcMar>
+              <w:top w:type="dxa" w:w="50"/>
+              <w:left w:type="dxa" w:w="90"/>
+              <w:bottom w:type="dxa" w:w="50"/>
+              <w:right w:type="dxa" w:w="90"/>
+            </w:tcMar>
+          </w:tcPr>
+          <w:p>
+            <w:pPr>
+              <w:jc w:val="left"/>
+            </w:pPr>
+            <w:r>
+              <w:rPr>
+                <w:rFonts w:ascii="Cambria" w:cs="Cambria" w:eastAsia="Cambria" w:hAnsi="Cambria"/>
+                <w:b/>
+                <w:bCs/>
+                <w:sz w:val="19"/>
+                <w:szCs w:val="19"/>
+              </w:rPr>
+              <w:t xml:space="preserve">Patient 051 · LV, ED · threshold on field</w:t>
+            </w:r>
+          </w:p>
+        </w:tc>
+        <w:tc>
+          <w:tcPr>
+            <w:tcW w:type="dxa" w:w="1447"/>
+            <w:tcBorders>
+              <w:top w:val="single" w:color="BFC9D3" w:sz="4"/>
+              <w:left w:val="single" w:color="BFC9D3" w:sz="4"/>
+              <w:bottom w:val="single" w:color="BFC9D3" w:sz="4"/>
+              <w:right w:val="single" w:color="BFC9D3" w:sz="4"/>
+            </w:tcBorders>
+            <w:shd w:fill="EEF2F6" w:color="auto" w:val="clear"/>
+            <w:tcMar>
+              <w:top w:type="dxa" w:w="50"/>
+              <w:left w:type="dxa" w:w="90"/>
+              <w:bottom w:type="dxa" w:w="50"/>
+              <w:right w:type="dxa" w:w="90"/>
+            </w:tcMar>
+          </w:tcPr>
+          <w:p>
+            <w:pPr>
+              <w:jc w:val="center"/>
+            </w:pPr>
+            <w:r>
+              <w:rPr>
+                <w:rFonts w:ascii="Cambria" w:cs="Cambria" w:eastAsia="Cambria" w:hAnsi="Cambria"/>
+                <w:b/>
+                <w:bCs/>
+                <w:sz w:val="19"/>
+                <w:szCs w:val="19"/>
+              </w:rPr>
+              <w:t xml:space="preserve">0.897</w:t>
+            </w:r>
+          </w:p>
+        </w:tc>
+        <w:tc>
+          <w:tcPr>
+            <w:tcW w:type="dxa" w:w="1447"/>
+            <w:tcBorders>
+              <w:top w:val="single" w:color="BFC9D3" w:sz="4"/>
+              <w:left w:val="single" w:color="BFC9D3" w:sz="4"/>
+              <w:bottom w:val="single" w:color="BFC9D3" w:sz="4"/>
+              <w:right w:val="single" w:color="BFC9D3" w:sz="4"/>
+            </w:tcBorders>
+            <w:shd w:fill="EEF2F6" w:color="auto" w:val="clear"/>
+            <w:tcMar>
+              <w:top w:type="dxa" w:w="50"/>
+              <w:left w:type="dxa" w:w="90"/>
+              <w:bottom w:type="dxa" w:w="50"/>
+              <w:right w:type="dxa" w:w="90"/>
+            </w:tcMar>
+          </w:tcPr>
+          <w:p>
+            <w:pPr>
+              <w:jc w:val="center"/>
+            </w:pPr>
+            <w:r>
+              <w:rPr>
+                <w:rFonts w:ascii="Cambria" w:cs="Cambria" w:eastAsia="Cambria" w:hAnsi="Cambria"/>
+                <w:b/>
+                <w:bCs/>
+                <w:sz w:val="19"/>
+                <w:szCs w:val="19"/>
+              </w:rPr>
+              <w:t xml:space="preserve">5.9</w:t>
+            </w:r>
+          </w:p>
+        </w:tc>
+        <w:tc>
+          <w:tcPr>
+            <w:tcW w:type="dxa" w:w="1447"/>
+            <w:tcBorders>
+              <w:top w:val="single" w:color="BFC9D3" w:sz="4"/>
+              <w:left w:val="single" w:color="BFC9D3" w:sz="4"/>
+              <w:bottom w:val="single" w:color="BFC9D3" w:sz="4"/>
+              <w:right w:val="single" w:color="BFC9D3" w:sz="4"/>
+            </w:tcBorders>
+            <w:shd w:fill="EEF2F6" w:color="auto" w:val="clear"/>
+            <w:tcMar>
+              <w:top w:type="dxa" w:w="50"/>
+              <w:left w:type="dxa" w:w="90"/>
+              <w:bottom w:type="dxa" w:w="50"/>
+              <w:right w:type="dxa" w:w="90"/>
+            </w:tcMar>
+          </w:tcPr>
+          <w:p>
+            <w:pPr>
+              <w:jc w:val="center"/>
+            </w:pPr>
+            <w:r>
+              <w:rPr>
+                <w:rFonts w:ascii="Cambria" w:cs="Cambria" w:eastAsia="Cambria" w:hAnsi="Cambria"/>
+                <w:b/>
+                <w:bCs/>
+                <w:sz w:val="19"/>
+                <w:szCs w:val="19"/>
+              </w:rPr>
+              <w:t xml:space="preserve">1.21</w:t>
+            </w:r>
+          </w:p>
+        </w:tc>
+        <w:tc>
+          <w:tcPr>
+            <w:tcW w:type="dxa" w:w="1448"/>
+            <w:tcBorders>
+              <w:top w:val="single" w:color="BFC9D3" w:sz="4"/>
+              <w:left w:val="single" w:color="BFC9D3" w:sz="4"/>
+              <w:bottom w:val="single" w:color="BFC9D3" w:sz="4"/>
+              <w:right w:val="single" w:color="BFC9D3" w:sz="4"/>
+            </w:tcBorders>
+            <w:shd w:fill="EEF2F6" w:color="auto" w:val="clear"/>
+            <w:tcMar>
+              <w:top w:type="dxa" w:w="50"/>
+              <w:left w:type="dxa" w:w="90"/>
+              <w:bottom w:type="dxa" w:w="50"/>
+              <w:right w:type="dxa" w:w="90"/>
+            </w:tcMar>
+          </w:tcPr>
+          <w:p>
+            <w:pPr>
+              <w:jc w:val="center"/>
+            </w:pPr>
+            <w:r>
+              <w:rPr>
+                <w:rFonts w:ascii="Cambria" w:cs="Cambria" w:eastAsia="Cambria" w:hAnsi="Cambria"/>
+                <w:b/>
+                <w:bCs/>
+                <w:sz w:val="19"/>
+                <w:szCs w:val="19"/>
+              </w:rPr>
+              <w:t xml:space="preserve">19.2</w:t>
+            </w:r>
+          </w:p>
+        </w:tc>
+      </w:tr>
+      <w:tr>
+        <w:trPr>
+          <w:cantSplit/>
+        </w:trPr>
+        <w:tc>
+          <w:tcPr>
+            <w:tcW w:type="dxa" w:w="3859"/>
+            <w:tcBorders>
+              <w:top w:val="single" w:color="BFC9D3" w:sz="4"/>
+              <w:left w:val="single" w:color="BFC9D3" w:sz="4"/>
+              <w:bottom w:val="single" w:color="BFC9D3" w:sz="4"/>
+              <w:right w:val="single" w:color="BFC9D3" w:sz="4"/>
+            </w:tcBorders>
+            <w:tcMar>
+              <w:top w:type="dxa" w:w="50"/>
+              <w:left w:type="dxa" w:w="90"/>
+              <w:bottom w:type="dxa" w:w="50"/>
+              <w:right w:type="dxa" w:w="90"/>
+            </w:tcMar>
+          </w:tcPr>
+          <w:p>
+            <w:pPr>
+              <w:jc w:val="left"/>
+            </w:pPr>
+            <w:r>
+              <w:rPr>
+                <w:rFonts w:ascii="Cambria" w:cs="Cambria" w:eastAsia="Cambria" w:hAnsi="Cambria"/>
+                <w:b w:val="false"/>
+                <w:bCs w:val="false"/>
+                <w:sz w:val="19"/>
+                <w:szCs w:val="19"/>
+              </w:rPr>
+              <w:t xml:space="preserve">Patient 051 · LV, ES · threshold on field</w:t>
+            </w:r>
+          </w:p>
+        </w:tc>
+        <w:tc>
+          <w:tcPr>
+            <w:tcW w:type="dxa" w:w="1447"/>
+            <w:tcBorders>
+              <w:top w:val="single" w:color="BFC9D3" w:sz="4"/>
+              <w:left w:val="single" w:color="BFC9D3" w:sz="4"/>
+              <w:bottom w:val="single" w:color="BFC9D3" w:sz="4"/>
+              <w:right w:val="single" w:color="BFC9D3" w:sz="4"/>
+            </w:tcBorders>
+            <w:tcMar>
+              <w:top w:type="dxa" w:w="50"/>
+              <w:left w:type="dxa" w:w="90"/>
+              <w:bottom w:type="dxa" w:w="50"/>
+              <w:right w:type="dxa" w:w="90"/>
+            </w:tcMar>
+          </w:tcPr>
+          <w:p>
+            <w:pPr>
+              <w:jc w:val="center"/>
+            </w:pPr>
+            <w:r>
+              <w:rPr>
+                <w:rFonts w:ascii="Cambria" w:cs="Cambria" w:eastAsia="Cambria" w:hAnsi="Cambria"/>
+                <w:b w:val="false"/>
+                <w:bCs w:val="false"/>
+                <w:sz w:val="19"/>
+                <w:szCs w:val="19"/>
+              </w:rPr>
+              <w:t xml:space="preserve">0.769</w:t>
+            </w:r>
+          </w:p>
+        </w:tc>
+        <w:tc>
+          <w:tcPr>
+            <w:tcW w:type="dxa" w:w="1447"/>
+            <w:tcBorders>
+              <w:top w:val="single" w:color="BFC9D3" w:sz="4"/>
+              <w:left w:val="single" w:color="BFC9D3" w:sz="4"/>
+              <w:bottom w:val="single" w:color="BFC9D3" w:sz="4"/>
+              <w:right w:val="single" w:color="BFC9D3" w:sz="4"/>
+            </w:tcBorders>
+            <w:tcMar>
+              <w:top w:type="dxa" w:w="50"/>
+              <w:left w:type="dxa" w:w="90"/>
+              <w:bottom w:type="dxa" w:w="50"/>
+              <w:right w:type="dxa" w:w="90"/>
+            </w:tcMar>
+          </w:tcPr>
+          <w:p>
+            <w:pPr>
+              <w:jc w:val="center"/>
+            </w:pPr>
+            <w:r>
+              <w:rPr>
+                <w:rFonts w:ascii="Cambria" w:cs="Cambria" w:eastAsia="Cambria" w:hAnsi="Cambria"/>
+                <w:b w:val="false"/>
+                <w:bCs w:val="false"/>
+                <w:sz w:val="19"/>
+                <w:szCs w:val="19"/>
+              </w:rPr>
+              <w:t xml:space="preserve">10.1</w:t>
+            </w:r>
+          </w:p>
+        </w:tc>
+        <w:tc>
+          <w:tcPr>
+            <w:tcW w:type="dxa" w:w="1447"/>
+            <w:tcBorders>
+              <w:top w:val="single" w:color="BFC9D3" w:sz="4"/>
+              <w:left w:val="single" w:color="BFC9D3" w:sz="4"/>
+              <w:bottom w:val="single" w:color="BFC9D3" w:sz="4"/>
+              <w:right w:val="single" w:color="BFC9D3" w:sz="4"/>
+            </w:tcBorders>
+            <w:tcMar>
+              <w:top w:type="dxa" w:w="50"/>
+              <w:left w:type="dxa" w:w="90"/>
+              <w:bottom w:type="dxa" w:w="50"/>
+              <w:right w:type="dxa" w:w="90"/>
+            </w:tcMar>
+          </w:tcPr>
+          <w:p>
+            <w:pPr>
+              <w:jc w:val="center"/>
+            </w:pPr>
+            <w:r>
+              <w:rPr>
+                <w:rFonts w:ascii="Cambria" w:cs="Cambria" w:eastAsia="Cambria" w:hAnsi="Cambria"/>
+                <w:b w:val="false"/>
+                <w:bCs w:val="false"/>
+                <w:sz w:val="19"/>
+                <w:szCs w:val="19"/>
+              </w:rPr>
+              <w:t xml:space="preserve">3.19</w:t>
+            </w:r>
+          </w:p>
+        </w:tc>
+        <w:tc>
+          <w:tcPr>
+            <w:tcW w:type="dxa" w:w="1448"/>
+            <w:tcBorders>
+              <w:top w:val="single" w:color="BFC9D3" w:sz="4"/>
+              <w:left w:val="single" w:color="BFC9D3" w:sz="4"/>
+              <w:bottom w:val="single" w:color="BFC9D3" w:sz="4"/>
+              <w:right w:val="single" w:color="BFC9D3" w:sz="4"/>
+            </w:tcBorders>
+            <w:tcMar>
+              <w:top w:type="dxa" w:w="50"/>
+              <w:left w:type="dxa" w:w="90"/>
+              <w:bottom w:type="dxa" w:w="50"/>
+              <w:right w:type="dxa" w:w="90"/>
+            </w:tcMar>
+          </w:tcPr>
+          <w:p>
+            <w:pPr>
+              <w:jc w:val="center"/>
+            </w:pPr>
+            <w:r>
+              <w:rPr>
+                <w:rFonts w:ascii="Cambria" w:cs="Cambria" w:eastAsia="Cambria" w:hAnsi="Cambria"/>
+                <w:b w:val="false"/>
+                <w:bCs w:val="false"/>
+                <w:sz w:val="19"/>
+                <w:szCs w:val="19"/>
+              </w:rPr>
+              <w:t xml:space="preserve">19.5</w:t>
+            </w:r>
+          </w:p>
+        </w:tc>
+      </w:tr>
+      <w:tr>
+        <w:trPr>
+          <w:cantSplit/>
+        </w:trPr>
+        <w:tc>
+          <w:tcPr>
+            <w:tcW w:type="dxa" w:w="3859"/>
+            <w:tcBorders>
+              <w:top w:val="single" w:color="BFC9D3" w:sz="4"/>
+              <w:left w:val="single" w:color="BFC9D3" w:sz="4"/>
+              <w:bottom w:val="single" w:color="BFC9D3" w:sz="4"/>
+              <w:right w:val="single" w:color="BFC9D3" w:sz="4"/>
+            </w:tcBorders>
+            <w:tcMar>
+              <w:top w:type="dxa" w:w="50"/>
+              <w:left w:type="dxa" w:w="90"/>
+              <w:bottom w:type="dxa" w:w="50"/>
+              <w:right w:type="dxa" w:w="90"/>
+            </w:tcMar>
+          </w:tcPr>
+          <w:p>
+            <w:pPr>
+              <w:jc w:val="left"/>
+            </w:pPr>
+            <w:r>
+              <w:rPr>
+                <w:rFonts w:ascii="Cambria" w:cs="Cambria" w:eastAsia="Cambria" w:hAnsi="Cambria"/>
+                <w:b w:val="false"/>
+                <w:bCs w:val="false"/>
+                <w:sz w:val="19"/>
+                <w:szCs w:val="19"/>
+              </w:rPr>
+              <w:t xml:space="preserve">Patient 051 · RV, ES · threshold on field</w:t>
+            </w:r>
+          </w:p>
+        </w:tc>
+        <w:tc>
+          <w:tcPr>
+            <w:tcW w:type="dxa" w:w="1447"/>
+            <w:tcBorders>
+              <w:top w:val="single" w:color="BFC9D3" w:sz="4"/>
+              <w:left w:val="single" w:color="BFC9D3" w:sz="4"/>
+              <w:bottom w:val="single" w:color="BFC9D3" w:sz="4"/>
+              <w:right w:val="single" w:color="BFC9D3" w:sz="4"/>
+            </w:tcBorders>
+            <w:tcMar>
+              <w:top w:type="dxa" w:w="50"/>
+              <w:left w:type="dxa" w:w="90"/>
+              <w:bottom w:type="dxa" w:w="50"/>
+              <w:right w:type="dxa" w:w="90"/>
+            </w:tcMar>
+          </w:tcPr>
+          <w:p>
+            <w:pPr>
+              <w:jc w:val="center"/>
+            </w:pPr>
+            <w:r>
+              <w:rPr>
+                <w:rFonts w:ascii="Cambria" w:cs="Cambria" w:eastAsia="Cambria" w:hAnsi="Cambria"/>
+                <w:b w:val="false"/>
+                <w:bCs w:val="false"/>
+                <w:sz w:val="19"/>
+                <w:szCs w:val="19"/>
+              </w:rPr>
+              <w:t xml:space="preserve">0.664</w:t>
+            </w:r>
+          </w:p>
+        </w:tc>
+        <w:tc>
+          <w:tcPr>
+            <w:tcW w:type="dxa" w:w="1447"/>
+            <w:tcBorders>
+              <w:top w:val="single" w:color="BFC9D3" w:sz="4"/>
+              <w:left w:val="single" w:color="BFC9D3" w:sz="4"/>
+              <w:bottom w:val="single" w:color="BFC9D3" w:sz="4"/>
+              <w:right w:val="single" w:color="BFC9D3" w:sz="4"/>
+            </w:tcBorders>
+            <w:tcMar>
+              <w:top w:type="dxa" w:w="50"/>
+              <w:left w:type="dxa" w:w="90"/>
+              <w:bottom w:type="dxa" w:w="50"/>
+              <w:right w:type="dxa" w:w="90"/>
+            </w:tcMar>
+          </w:tcPr>
+          <w:p>
+            <w:pPr>
+              <w:jc w:val="center"/>
+            </w:pPr>
+            <w:r>
+              <w:rPr>
+                <w:rFonts w:ascii="Cambria" w:cs="Cambria" w:eastAsia="Cambria" w:hAnsi="Cambria"/>
+                <w:b w:val="false"/>
+                <w:bCs w:val="false"/>
+                <w:sz w:val="19"/>
+                <w:szCs w:val="19"/>
+              </w:rPr>
+              <w:t xml:space="preserve">11.3</w:t>
+            </w:r>
+          </w:p>
+        </w:tc>
+        <w:tc>
+          <w:tcPr>
+            <w:tcW w:type="dxa" w:w="1447"/>
+            <w:tcBorders>
+              <w:top w:val="single" w:color="BFC9D3" w:sz="4"/>
+              <w:left w:val="single" w:color="BFC9D3" w:sz="4"/>
+              <w:bottom w:val="single" w:color="BFC9D3" w:sz="4"/>
+              <w:right w:val="single" w:color="BFC9D3" w:sz="4"/>
+            </w:tcBorders>
+            <w:tcMar>
+              <w:top w:type="dxa" w:w="50"/>
+              <w:left w:type="dxa" w:w="90"/>
+              <w:bottom w:type="dxa" w:w="50"/>
+              <w:right w:type="dxa" w:w="90"/>
+            </w:tcMar>
+          </w:tcPr>
+          <w:p>
+            <w:pPr>
+              <w:jc w:val="center"/>
+            </w:pPr>
+            <w:r>
+              <w:rPr>
+                <w:rFonts w:ascii="Cambria" w:cs="Cambria" w:eastAsia="Cambria" w:hAnsi="Cambria"/>
+                <w:b w:val="false"/>
+                <w:bCs w:val="false"/>
+                <w:sz w:val="19"/>
+                <w:szCs w:val="19"/>
+              </w:rPr>
+              <w:t xml:space="preserve">4.68</w:t>
+            </w:r>
+          </w:p>
+        </w:tc>
+        <w:tc>
+          <w:tcPr>
+            <w:tcW w:type="dxa" w:w="1448"/>
+            <w:tcBorders>
+              <w:top w:val="single" w:color="BFC9D3" w:sz="4"/>
+              <w:left w:val="single" w:color="BFC9D3" w:sz="4"/>
+              <w:bottom w:val="single" w:color="BFC9D3" w:sz="4"/>
+              <w:right w:val="single" w:color="BFC9D3" w:sz="4"/>
+            </w:tcBorders>
+            <w:tcMar>
+              <w:top w:type="dxa" w:w="50"/>
+              <w:left w:type="dxa" w:w="90"/>
+              <w:bottom w:type="dxa" w:w="50"/>
+              <w:right w:type="dxa" w:w="90"/>
+            </w:tcMar>
+          </w:tcPr>
+          <w:p>
+            <w:pPr>
+              <w:jc w:val="center"/>
+            </w:pPr>
+            <w:r>
+              <w:rPr>
+                <w:rFonts w:ascii="Cambria" w:cs="Cambria" w:eastAsia="Cambria" w:hAnsi="Cambria"/>
+                <w:b w:val="false"/>
+                <w:bCs w:val="false"/>
+                <w:sz w:val="19"/>
+                <w:szCs w:val="19"/>
+              </w:rPr>
+              <w:t xml:space="preserve">21.2</w:t>
+            </w:r>
+          </w:p>
+        </w:tc>
+      </w:tr>
+      <w:tr>
+        <w:trPr>
+          <w:cantSplit/>
+        </w:trPr>
+        <w:tc>
+          <w:tcPr>
+            <w:tcW w:type="dxa" w:w="3859"/>
+            <w:tcBorders>
+              <w:top w:val="single" w:color="BFC9D3" w:sz="4"/>
+              <w:left w:val="single" w:color="BFC9D3" w:sz="4"/>
+              <w:bottom w:val="single" w:color="BFC9D3" w:sz="4"/>
+              <w:right w:val="single" w:color="BFC9D3" w:sz="4"/>
+            </w:tcBorders>
+            <w:tcMar>
+              <w:top w:type="dxa" w:w="50"/>
+              <w:left w:type="dxa" w:w="90"/>
+              <w:bottom w:type="dxa" w:w="50"/>
+              <w:right w:type="dxa" w:w="90"/>
+            </w:tcMar>
+          </w:tcPr>
+          <w:p>
+            <w:pPr>
+              <w:jc w:val="left"/>
+            </w:pPr>
+            <w:r>
+              <w:rPr>
+                <w:rFonts w:ascii="Cambria" w:cs="Cambria" w:eastAsia="Cambria" w:hAnsi="Cambria"/>
+                <w:b w:val="false"/>
+                <w:bCs w:val="false"/>
+                <w:sz w:val="19"/>
+                <w:szCs w:val="19"/>
+              </w:rPr>
+              <w:t xml:space="preserve">14 held-out · LV, ED · field (mean)</w:t>
+            </w:r>
+          </w:p>
+        </w:tc>
+        <w:tc>
+          <w:tcPr>
+            <w:tcW w:type="dxa" w:w="1447"/>
+            <w:tcBorders>
+              <w:top w:val="single" w:color="BFC9D3" w:sz="4"/>
+              <w:left w:val="single" w:color="BFC9D3" w:sz="4"/>
+              <w:bottom w:val="single" w:color="BFC9D3" w:sz="4"/>
+              <w:right w:val="single" w:color="BFC9D3" w:sz="4"/>
+            </w:tcBorders>
+            <w:tcMar>
+              <w:top w:type="dxa" w:w="50"/>
+              <w:left w:type="dxa" w:w="90"/>
+              <w:bottom w:type="dxa" w:w="50"/>
+              <w:right w:type="dxa" w:w="90"/>
+            </w:tcMar>
+          </w:tcPr>
+          <w:p>
+            <w:pPr>
+              <w:jc w:val="center"/>
+            </w:pPr>
+            <w:r>
+              <w:rPr>
+                <w:rFonts w:ascii="Cambria" w:cs="Cambria" w:eastAsia="Cambria" w:hAnsi="Cambria"/>
+                <w:b w:val="false"/>
+                <w:bCs w:val="false"/>
+                <w:sz w:val="19"/>
+                <w:szCs w:val="19"/>
+              </w:rPr>
+              <w:t xml:space="preserve">0.872</w:t>
+            </w:r>
+          </w:p>
+        </w:tc>
+        <w:tc>
+          <w:tcPr>
+            <w:tcW w:type="dxa" w:w="1447"/>
+            <w:tcBorders>
+              <w:top w:val="single" w:color="BFC9D3" w:sz="4"/>
+              <w:left w:val="single" w:color="BFC9D3" w:sz="4"/>
+              <w:bottom w:val="single" w:color="BFC9D3" w:sz="4"/>
+              <w:right w:val="single" w:color="BFC9D3" w:sz="4"/>
+            </w:tcBorders>
+            <w:tcMar>
+              <w:top w:type="dxa" w:w="50"/>
+              <w:left w:type="dxa" w:w="90"/>
+              <w:bottom w:type="dxa" w:w="50"/>
+              <w:right w:type="dxa" w:w="90"/>
+            </w:tcMar>
+          </w:tcPr>
+          <w:p>
+            <w:pPr>
+              <w:jc w:val="center"/>
+            </w:pPr>
+            <w:r>
+              <w:rPr>
+                <w:rFonts w:ascii="Cambria" w:cs="Cambria" w:eastAsia="Cambria" w:hAnsi="Cambria"/>
+                <w:b w:val="false"/>
+                <w:bCs w:val="false"/>
+                <w:sz w:val="19"/>
+                <w:szCs w:val="19"/>
+              </w:rPr>
+              <w:t xml:space="preserve">6.9</w:t>
+            </w:r>
+          </w:p>
+        </w:tc>
+        <w:tc>
+          <w:tcPr>
+            <w:tcW w:type="dxa" w:w="1447"/>
+            <w:tcBorders>
+              <w:top w:val="single" w:color="BFC9D3" w:sz="4"/>
+              <w:left w:val="single" w:color="BFC9D3" w:sz="4"/>
+              <w:bottom w:val="single" w:color="BFC9D3" w:sz="4"/>
+              <w:right w:val="single" w:color="BFC9D3" w:sz="4"/>
+            </w:tcBorders>
+            <w:tcMar>
+              <w:top w:type="dxa" w:w="50"/>
+              <w:left w:type="dxa" w:w="90"/>
+              <w:bottom w:type="dxa" w:w="50"/>
+              <w:right w:type="dxa" w:w="90"/>
+            </w:tcMar>
+          </w:tcPr>
+          <w:p>
+            <w:pPr>
+              <w:jc w:val="center"/>
+            </w:pPr>
+            <w:r>
+              <w:rPr>
+                <w:rFonts w:ascii="Cambria" w:cs="Cambria" w:eastAsia="Cambria" w:hAnsi="Cambria"/>
+                <w:b w:val="false"/>
+                <w:bCs w:val="false"/>
+                <w:sz w:val="19"/>
+                <w:szCs w:val="19"/>
+              </w:rPr>
+              <w:t xml:space="preserve">–</w:t>
+            </w:r>
+          </w:p>
+        </w:tc>
+        <w:tc>
+          <w:tcPr>
+            <w:tcW w:type="dxa" w:w="1448"/>
+            <w:tcBorders>
+              <w:top w:val="single" w:color="BFC9D3" w:sz="4"/>
+              <w:left w:val="single" w:color="BFC9D3" w:sz="4"/>
+              <w:bottom w:val="single" w:color="BFC9D3" w:sz="4"/>
+              <w:right w:val="single" w:color="BFC9D3" w:sz="4"/>
+            </w:tcBorders>
+            <w:tcMar>
+              <w:top w:type="dxa" w:w="50"/>
+              <w:left w:type="dxa" w:w="90"/>
+              <w:bottom w:type="dxa" w:w="50"/>
+              <w:right w:type="dxa" w:w="90"/>
+            </w:tcMar>
+          </w:tcPr>
+          <w:p>
+            <w:pPr>
+              <w:jc w:val="center"/>
+            </w:pPr>
+            <w:r>
+              <w:rPr>
+                <w:rFonts w:ascii="Cambria" w:cs="Cambria" w:eastAsia="Cambria" w:hAnsi="Cambria"/>
+                <w:b w:val="false"/>
+                <w:bCs w:val="false"/>
+                <w:sz w:val="19"/>
+                <w:szCs w:val="19"/>
+              </w:rPr>
+              <w:t xml:space="preserve">–</w:t>
+            </w:r>
+          </w:p>
+        </w:tc>
+      </w:tr>
+      <w:tr>
+        <w:trPr>
+          <w:cantSplit/>
+        </w:trPr>
+        <w:tc>
+          <w:tcPr>
+            <w:tcW w:type="dxa" w:w="3859"/>
+            <w:tcBorders>
+              <w:top w:val="single" w:color="BFC9D3" w:sz="4"/>
+              <w:left w:val="single" w:color="BFC9D3" w:sz="4"/>
+              <w:bottom w:val="single" w:color="BFC9D3" w:sz="4"/>
+              <w:right w:val="single" w:color="BFC9D3" w:sz="4"/>
+            </w:tcBorders>
+            <w:tcMar>
+              <w:top w:type="dxa" w:w="50"/>
+              <w:left w:type="dxa" w:w="90"/>
+              <w:bottom w:type="dxa" w:w="50"/>
+              <w:right w:type="dxa" w:w="90"/>
+            </w:tcMar>
+          </w:tcPr>
+          <w:p>
+            <w:pPr>
+              <w:jc w:val="left"/>
+            </w:pPr>
+            <w:r>
+              <w:rPr>
+                <w:rFonts w:ascii="Cambria" w:cs="Cambria" w:eastAsia="Cambria" w:hAnsi="Cambria"/>
+                <w:b w:val="false"/>
+                <w:bCs w:val="false"/>
+                <w:sz w:val="19"/>
+                <w:szCs w:val="19"/>
+              </w:rPr>
+              <w:t xml:space="preserve">14 held-out · LV, ED · scanner (mean)</w:t>
+            </w:r>
+          </w:p>
+        </w:tc>
+        <w:tc>
+          <w:tcPr>
+            <w:tcW w:type="dxa" w:w="1447"/>
+            <w:tcBorders>
+              <w:top w:val="single" w:color="BFC9D3" w:sz="4"/>
+              <w:left w:val="single" w:color="BFC9D3" w:sz="4"/>
+              <w:bottom w:val="single" w:color="BFC9D3" w:sz="4"/>
+              <w:right w:val="single" w:color="BFC9D3" w:sz="4"/>
+            </w:tcBorders>
+            <w:tcMar>
+              <w:top w:type="dxa" w:w="50"/>
+              <w:left w:type="dxa" w:w="90"/>
+              <w:bottom w:type="dxa" w:w="50"/>
+              <w:right w:type="dxa" w:w="90"/>
+            </w:tcMar>
+          </w:tcPr>
+          <w:p>
+            <w:pPr>
+              <w:jc w:val="center"/>
+            </w:pPr>
+            <w:r>
+              <w:rPr>
+                <w:rFonts w:ascii="Cambria" w:cs="Cambria" w:eastAsia="Cambria" w:hAnsi="Cambria"/>
+                <w:b w:val="false"/>
+                <w:bCs w:val="false"/>
+                <w:sz w:val="19"/>
+                <w:szCs w:val="19"/>
+              </w:rPr>
+              <w:t xml:space="preserve">0.870</w:t>
+            </w:r>
+          </w:p>
+        </w:tc>
+        <w:tc>
+          <w:tcPr>
+            <w:tcW w:type="dxa" w:w="1447"/>
+            <w:tcBorders>
+              <w:top w:val="single" w:color="BFC9D3" w:sz="4"/>
+              <w:left w:val="single" w:color="BFC9D3" w:sz="4"/>
+              <w:bottom w:val="single" w:color="BFC9D3" w:sz="4"/>
+              <w:right w:val="single" w:color="BFC9D3" w:sz="4"/>
+            </w:tcBorders>
+            <w:tcMar>
+              <w:top w:type="dxa" w:w="50"/>
+              <w:left w:type="dxa" w:w="90"/>
+              <w:bottom w:type="dxa" w:w="50"/>
+              <w:right w:type="dxa" w:w="90"/>
+            </w:tcMar>
+          </w:tcPr>
+          <w:p>
+            <w:pPr>
+              <w:jc w:val="center"/>
+            </w:pPr>
+            <w:r>
+              <w:rPr>
+                <w:rFonts w:ascii="Cambria" w:cs="Cambria" w:eastAsia="Cambria" w:hAnsi="Cambria"/>
+                <w:b w:val="false"/>
+                <w:bCs w:val="false"/>
+                <w:sz w:val="19"/>
+                <w:szCs w:val="19"/>
+              </w:rPr>
+              <w:t xml:space="preserve">–</w:t>
+            </w:r>
+          </w:p>
+        </w:tc>
+        <w:tc>
+          <w:tcPr>
+            <w:tcW w:type="dxa" w:w="1447"/>
+            <w:tcBorders>
+              <w:top w:val="single" w:color="BFC9D3" w:sz="4"/>
+              <w:left w:val="single" w:color="BFC9D3" w:sz="4"/>
+              <w:bottom w:val="single" w:color="BFC9D3" w:sz="4"/>
+              <w:right w:val="single" w:color="BFC9D3" w:sz="4"/>
+            </w:tcBorders>
+            <w:tcMar>
+              <w:top w:type="dxa" w:w="50"/>
+              <w:left w:type="dxa" w:w="90"/>
+              <w:bottom w:type="dxa" w:w="50"/>
+              <w:right w:type="dxa" w:w="90"/>
+            </w:tcMar>
+          </w:tcPr>
+          <w:p>
+            <w:pPr>
+              <w:jc w:val="center"/>
+            </w:pPr>
+            <w:r>
+              <w:rPr>
+                <w:rFonts w:ascii="Cambria" w:cs="Cambria" w:eastAsia="Cambria" w:hAnsi="Cambria"/>
+                <w:b w:val="false"/>
+                <w:bCs w:val="false"/>
+                <w:sz w:val="19"/>
+                <w:szCs w:val="19"/>
+              </w:rPr>
+              <w:t xml:space="preserve">–</w:t>
+            </w:r>
+          </w:p>
+        </w:tc>
+        <w:tc>
+          <w:tcPr>
+            <w:tcW w:type="dxa" w:w="1448"/>
+            <w:tcBorders>
+              <w:top w:val="single" w:color="BFC9D3" w:sz="4"/>
+              <w:left w:val="single" w:color="BFC9D3" w:sz="4"/>
+              <w:bottom w:val="single" w:color="BFC9D3" w:sz="4"/>
+              <w:right w:val="single" w:color="BFC9D3" w:sz="4"/>
+            </w:tcBorders>
+            <w:tcMar>
+              <w:top w:type="dxa" w:w="50"/>
+              <w:left w:type="dxa" w:w="90"/>
+              <w:bottom w:type="dxa" w:w="50"/>
+              <w:right w:type="dxa" w:w="90"/>
+            </w:tcMar>
+          </w:tcPr>
+          <w:p>
+            <w:pPr>
+              <w:jc w:val="center"/>
+            </w:pPr>
+            <w:r>
+              <w:rPr>
+                <w:rFonts w:ascii="Cambria" w:cs="Cambria" w:eastAsia="Cambria" w:hAnsi="Cambria"/>
+                <w:b w:val="false"/>
+                <w:bCs w:val="false"/>
+                <w:sz w:val="19"/>
+                <w:szCs w:val="19"/>
+              </w:rPr>
+              <w:t xml:space="preserve">–</w:t>
             </w:r>
           </w:p>
         </w:tc>
@@ -5958,7 +8473,7 @@
                     </pic:cNvPicPr>
                   </pic:nvPicPr>
                   <pic:blipFill>
-                    <a:blip r:embed="rId12" cstate="none"/>
+                    <a:blip r:embed="rId13" cstate="none"/>
                     <a:srcRect/>
                     <a:stretch>
                       <a:fillRect/>
@@ -6017,7 +8532,53 @@
           <w:sz w:val="22"/>
           <w:szCs w:val="22"/>
         </w:rPr>
-        <w:t xml:space="preserve">The ejection fractions from the field are within five points of the expert values. Absolute volumes are lower because the intensity threshold leaves the papillary muscles and trabeculae out of the blood pool, while the expert labels include them in the cavity; the ratio is affected much less.</w:t>
+        <w:t xml:space="preserve">For the left ventricle the field reproduces the expert ejection fraction within one point on patient 051 and within 4.6 points on average over the 14 held-out patients (mean absolute error; the threshold tends to overestimate EF). The field does not degrade the shape: its Dice equals that of the same segmentation applied to the scanner data (0.87 over 14 patients). The Hausdorff distance of about 19 mm is one slice too many or too few at the base or apex (slices are 10 mm apart); HD95 and ASSD are a few millimetres. Absolute volumes are lower because the threshold leaves the papillary muscles and trabeculae out of the blood pool, while the expert labels include them. The thin, trabeculated right ventricle at end-systole is not segmented reliably by a threshold (Dice 0.66, EF error up to tens of points): this is a limit of our segmentation, not of the field. An earlier version of this analysis took EF from the extremes of the volume curve (LV 49 %); with the ED and ES frames fixed from the scan metadata, as is standard, the agreement is better for the left ventricle and clearly worse for the right.</w:t>
+      </w:r>
+    </w:p>
+    <w:p>
+      <w:pPr>
+        <w:spacing w:after="120" w:before="0" w:line="276"/>
+        <w:jc w:val="both"/>
+      </w:pPr>
+      <w:r>
+        <w:rPr>
+          <w:rFonts w:ascii="Cambria" w:cs="Cambria" w:eastAsia="Cambria" w:hAnsi="Cambria"/>
+          <w:sz w:val="22"/>
+          <w:szCs w:val="22"/>
+        </w:rPr>
+        <w:t xml:space="preserve">Sensitivity (patient 051): a different threshold rule (mean instead of median midpoint) or ±0.05 changes LV EF between 40.6 and 44.6 %; the grid density does not matter (31, 61 or 122 slices: 172 ml at ED); the region interpolation (signed distance vs union of neighbouring slices) changes nothing; the mesh smoothing used for display changes the enclosed volume by 1.2 % and moves the surface by 0.5 mm on average.</w:t>
+      </w:r>
+    </w:p>
+    <w:p>
+      <w:pPr>
+        <w:pStyle w:val="Heading2"/>
+        <w:keepNext/>
+        <w:spacing w:after="80" w:before="180"/>
+      </w:pPr>
+      <w:r>
+        <w:rPr>
+          <w:rFonts w:ascii="Cambria" w:cs="Cambria" w:eastAsia="Cambria" w:hAnsi="Cambria"/>
+          <w:b/>
+          <w:bCs/>
+          <w:color w:val="296693"/>
+          <w:sz w:val="23"/>
+          <w:szCs w:val="23"/>
+        </w:rPr>
+        <w:t xml:space="preserve">5.7 Beyond linear interpolation (exploratory)</w:t>
+      </w:r>
+    </w:p>
+    <w:p>
+      <w:pPr>
+        <w:spacing w:after="120" w:before="0" w:line="276"/>
+        <w:jc w:val="both"/>
+      </w:pPr>
+      <w:r>
+        <w:rPr>
+          <w:rFonts w:ascii="Cambria" w:cs="Cambria" w:eastAsia="Cambria" w:hAnsi="Cambria"/>
+          <w:sz w:val="22"/>
+          <w:szCs w:val="22"/>
+        </w:rPr>
+        <w:t xml:space="preserve">Why does interpolation remain so strong? Its errors come from edges of the heart wall that move between frames, so the intensity of a voxel changes in jumps rather than smoothly. Consistently, higher-order interpolation in time is worse than linear on patient 051 (every 4th frame kept: cubic spline 28.54, PCHIP 29.17, Akima 29.05 vs linear 29.23 dB), while motion-compensated interpolation with TV-L1 optical flow [11] between the two neighbouring frames is better (29.49 dB; 29.78 dB blended with linear). We therefore tried a motion-based field, a SIREN template warped by a small displacement network plus a small intensity residual, with and without guidance by optical flow between the known frames. Chosen on the validation frames, it did not reach the plain SIREN (22.9 vs 24.0 dB on validation; interpolation 24.5, optical flow 24.8): one template with one in-plane warp cannot describe wall thickening, appearing papillary muscles and through-plane motion. These runs are reported for completeness and are not part of the main results.</w:t>
       </w:r>
     </w:p>
     <w:p>
@@ -6054,7 +8615,7 @@
           <w:sz w:val="22"/>
           <w:szCs w:val="22"/>
         </w:rPr>
-        <w:t xml:space="preserve">Cine-MRI with 30 frames is close to linear between neighbouring frames, so linear interpolation is a strong baseline; the field gains where the motion is fastest and when frames are sparse.</w:t>
+        <w:t xml:space="preserve">Cine-MRI with 30 frames is close to linear between neighbouring frames, so linear interpolation is a strong baseline. The field alone is about 0.6 dB behind it, but the two err in different places and their fixed blend is better on every held-out patient.</w:t>
       </w:r>
     </w:p>
     <w:p>
@@ -6092,7 +8653,7 @@
           <w:sz w:val="22"/>
           <w:szCs w:val="22"/>
         </w:rPr>
-        <w:t xml:space="preserve">Limitations: one main patient and one check patient; a 20 mm slice gap is beyond any method; on average interpolation is still 0.4 dB ahead; the 3D segmentation is a threshold, not a learned model; CPU training takes about 25 minutes per run.</w:t>
+        <w:t xml:space="preserve">Limitations: one network and one seed per held-out patient (seed spread measured only on patient 051); patients from three ACDC groups only; a 20 mm slice gap is beyond any method; the 3D step is label-assisted and a threshold, unreliable for the right ventricle; settings chosen on one development patient.</w:t>
       </w:r>
     </w:p>
     <w:p>
@@ -6111,7 +8672,7 @@
           <w:sz w:val="22"/>
           <w:szCs w:val="22"/>
         </w:rPr>
-        <w:t xml:space="preserve">Next steps: more patients, a temporal smoothness penalty during training, and a shared network across patients so that one heart can help another.</w:t>
+        <w:t xml:space="preserve">Next steps: motion-aware fields (optical flow already beats linear interpolation; a single-template deformation was not enough), and priors learned across many patients, e.g. learned initialisations [10], which would also keep the per-patient storage small.</w:t>
       </w:r>
     </w:p>
     <w:p>
@@ -6143,7 +8704,7 @@
           <w:sz w:val="22"/>
           <w:szCs w:val="22"/>
         </w:rPr>
-        <w:t xml:space="preserve">We built and tested a per-patient neural field of the beating heart. Sine activations are essential (+6.6 dB over ReLU), and so is the way the coordinates enter the network: scaling time and slice position is our own contribution and is what makes the field work between samples. The field is level with linear interpolation, better in fast contraction, and combined with it beats it, while holding the heart with 16× to 86× fewer numbers. From one network we obtain a continuous 4D heart whose ejection fraction agrees with the expert labels within five points. All code, results and data instructions are in the project repository and run with one command.</w:t>
+        <w:t xml:space="preserve">We built and tested a per-patient neural field of the beating heart with a protocol that separates validation from test and repeats the result on 14 unseen patients. Sine activations are essential (+7.4 dB over ReLU on every patient, +2.3 dB over ReLU with Fourier features), and so is the way the coordinates enter the network: scaling time and slice position is our own contribution and is what makes the field work between samples. Alone, the field stays slightly behind linear interpolation; combined with it, it beats interpolation on all 14 patients, while holding the heart with 16× to 86× fewer numbers. From one network we obtain a continuous 4D heart whose left ventricle agrees with the expert labels. All code, results and data instructions are in the project repository and run with one command.</w:t>
       </w:r>
     </w:p>
     <w:p>
@@ -6288,6 +8849,34 @@
           <w:szCs w:val="19"/>
         </w:rPr>
         <w:t xml:space="preserve">[9] G. Taubin, “A signal processing approach to fair surface design,” in Proc. SIGGRAPH, 1995, pp. 351–358.</w:t>
+      </w:r>
+    </w:p>
+    <w:p>
+      <w:pPr>
+        <w:spacing w:after="80" w:before="0" w:line="276"/>
+        <w:jc w:val="left"/>
+      </w:pPr>
+      <w:r>
+        <w:rPr>
+          <w:rFonts w:ascii="Cambria" w:cs="Cambria" w:eastAsia="Cambria" w:hAnsi="Cambria"/>
+          <w:sz w:val="19"/>
+          <w:szCs w:val="19"/>
+        </w:rPr>
+        <w:t xml:space="preserve">[10] M. Tancik et al., “Learned initializations for optimizing coordinate-based neural representations,” in Proc. CVPR, 2021.</w:t>
+      </w:r>
+    </w:p>
+    <w:p>
+      <w:pPr>
+        <w:spacing w:after="80" w:before="0" w:line="276"/>
+        <w:jc w:val="left"/>
+      </w:pPr>
+      <w:r>
+        <w:rPr>
+          <w:rFonts w:ascii="Cambria" w:cs="Cambria" w:eastAsia="Cambria" w:hAnsi="Cambria"/>
+          <w:sz w:val="19"/>
+          <w:szCs w:val="19"/>
+        </w:rPr>
+        <w:t xml:space="preserve">[11] C. Zach, T. Pock, and H. Bischof, “A duality based approach for realtime TV-L1 optical flow,” in Pattern Recognition (DAGM), 2007.</w:t>
       </w:r>
     </w:p>
     <w:sectPr>

</xml_diff>